<commit_message>
Update for the files in github
</commit_message>
<xml_diff>
--- a/SOEN363_Project_Phase1_TeamName.docx
+++ b/SOEN363_Project_Phase1_TeamName.docx
@@ -420,7 +420,6 @@
                               <w:calendar w:val="gregorian"/>
                             </w:date>
                           </w:sdtPr>
-                          <w:sdtEndPr/>
                           <w:sdtContent>
                             <w:p>
                               <w:pPr>
@@ -466,7 +465,6 @@
                               <w:dataBinding w:prefixMappings="xmlns:ns0='http://schemas.openxmlformats.org/officeDocument/2006/extended-properties' " w:xpath="/ns0:Properties[1]/ns0:Company[1]" w:storeItemID="{6668398D-A668-4E3E-A5EB-62B293D839F1}"/>
                               <w:text/>
                             </w:sdtPr>
-                            <w:sdtEndPr/>
                             <w:sdtContent>
                               <w:r>
                                 <w:rPr>
@@ -497,7 +495,6 @@
                               <w:dataBinding w:prefixMappings="xmlns:ns0='http://schemas.microsoft.com/office/2006/coverPageProps' " w:xpath="/ns0:CoverPageProperties[1]/ns0:CompanyAddress[1]" w:storeItemID="{55AF091B-3C7A-41E3-B477-F2FDAA23CFDA}"/>
                               <w:text/>
                             </w:sdtPr>
-                            <w:sdtEndPr/>
                             <w:sdtContent>
                               <w:r>
                                 <w:rPr>
@@ -1548,7 +1545,30 @@
         <w:pStyle w:val="Title"/>
       </w:pPr>
       <w:r>
-        <w:t xml:space="preserve"> SOEN 363 — Project Phase 1 Report</w:t>
+        <w:t xml:space="preserve"> </w:t>
+      </w:r>
+    </w:p>
+    <w:p>
+      <w:pPr>
+        <w:rPr>
+          <w:rFonts w:asciiTheme="majorHAnsi" w:eastAsiaTheme="majorEastAsia" w:hAnsiTheme="majorHAnsi" w:cstheme="majorBidi"/>
+          <w:spacing w:val="-10"/>
+          <w:kern w:val="28"/>
+          <w:sz w:val="56"/>
+          <w:szCs w:val="56"/>
+        </w:rPr>
+      </w:pPr>
+      <w:r>
+        <w:br w:type="page"/>
+      </w:r>
+    </w:p>
+    <w:p>
+      <w:pPr>
+        <w:pStyle w:val="Title"/>
+      </w:pPr>
+      <w:r>
+        <w:lastRenderedPageBreak/>
+        <w:t>SOEN 363 — Project Phase 1 Report</w:t>
       </w:r>
     </w:p>
     <w:p>
@@ -1784,31 +1804,55 @@
     </w:p>
     <w:p>
       <w:r>
-        <w:object w:dxaOrig="1543" w:dyaOrig="1000" w14:anchorId="7166AACA">
-          <v:shapetype id="_x0000_t75" coordsize="21600,21600" o:spt="75" o:preferrelative="t" path="m@4@5l@4@11@9@11@9@5xe" filled="f" stroked="f">
-            <v:stroke joinstyle="miter"/>
-            <v:formulas>
-              <v:f eqn="if lineDrawn pixelLineWidth 0"/>
-              <v:f eqn="sum @0 1 0"/>
-              <v:f eqn="sum 0 0 @1"/>
-              <v:f eqn="prod @2 1 2"/>
-              <v:f eqn="prod @3 21600 pixelWidth"/>
-              <v:f eqn="prod @3 21600 pixelHeight"/>
-              <v:f eqn="sum @0 0 1"/>
-              <v:f eqn="prod @6 1 2"/>
-              <v:f eqn="prod @7 21600 pixelWidth"/>
-              <v:f eqn="sum @8 21600 0"/>
-              <v:f eqn="prod @7 21600 pixelHeight"/>
-              <v:f eqn="sum @10 21600 0"/>
-            </v:formulas>
-            <v:path o:extrusionok="f" gradientshapeok="t" o:connecttype="rect"/>
-            <o:lock v:ext="edit" aspectratio="t"/>
-          </v:shapetype>
-          <v:shape id="_x0000_i1025" type="#_x0000_t75" style="width:77.15pt;height:50pt" o:ole="">
-            <v:imagedata r:id="rId11" o:title=""/>
-          </v:shape>
-          <o:OLEObject Type="Embed" ProgID="Acrobat.Document.DC" ShapeID="_x0000_i1025" DrawAspect="Icon" ObjectID="_1852969455" r:id="rId12"/>
-        </w:object>
+        <w:rPr>
+          <w:noProof/>
+        </w:rPr>
+        <w:drawing>
+          <wp:inline distT="0" distB="0" distL="0" distR="0" wp14:anchorId="0421F33C" wp14:editId="50AD9775">
+            <wp:extent cx="5943600" cy="3494405"/>
+            <wp:effectExtent l="19050" t="19050" r="19050" b="10795"/>
+            <wp:docPr id="1285757909" name="Picture 4"/>
+            <wp:cNvGraphicFramePr>
+              <a:graphicFrameLocks xmlns:a="http://schemas.openxmlformats.org/drawingml/2006/main" noChangeAspect="1"/>
+            </wp:cNvGraphicFramePr>
+            <a:graphic xmlns:a="http://schemas.openxmlformats.org/drawingml/2006/main">
+              <a:graphicData uri="http://schemas.openxmlformats.org/drawingml/2006/picture">
+                <pic:pic xmlns:pic="http://schemas.openxmlformats.org/drawingml/2006/picture">
+                  <pic:nvPicPr>
+                    <pic:cNvPr id="1285757909" name="Picture 1285757909"/>
+                    <pic:cNvPicPr/>
+                  </pic:nvPicPr>
+                  <pic:blipFill>
+                    <a:blip r:embed="rId11" cstate="print">
+                      <a:extLst>
+                        <a:ext uri="{28A0092B-C50C-407E-A947-70E740481C1C}">
+                          <a14:useLocalDpi xmlns:a14="http://schemas.microsoft.com/office/drawing/2010/main" val="0"/>
+                        </a:ext>
+                      </a:extLst>
+                    </a:blip>
+                    <a:stretch>
+                      <a:fillRect/>
+                    </a:stretch>
+                  </pic:blipFill>
+                  <pic:spPr>
+                    <a:xfrm>
+                      <a:off x="0" y="0"/>
+                      <a:ext cx="5943600" cy="3494405"/>
+                    </a:xfrm>
+                    <a:prstGeom prst="rect">
+                      <a:avLst/>
+                    </a:prstGeom>
+                    <a:ln>
+                      <a:solidFill>
+                        <a:schemeClr val="tx1"/>
+                      </a:solidFill>
+                    </a:ln>
+                  </pic:spPr>
+                </pic:pic>
+              </a:graphicData>
+            </a:graphic>
+          </wp:inline>
+        </w:drawing>
       </w:r>
     </w:p>
     <w:p>
@@ -2075,31 +2119,2038 @@
         <w:rPr>
           <w:rFonts w:cstheme="minorBidi"/>
         </w:rPr>
+        <w:lastRenderedPageBreak/>
         <w:t>Relational Schema</w:t>
       </w:r>
       <w:bookmarkEnd w:id="4"/>
     </w:p>
     <w:p>
-      <w:r>
-        <w:t xml:space="preserve">All tables </w:t>
-      </w:r>
-      <w:r>
-        <w:t>satisfy</w:t>
-      </w:r>
-      <w:r>
-        <w:t xml:space="preserve"> third normal form (3NF), </w:t>
-      </w:r>
-      <w:r>
-        <w:t>eliminating</w:t>
-      </w:r>
-      <w:r>
-        <w:t xml:space="preserve"> partial </w:t>
-      </w:r>
-      <w:r>
-        <w:t>and</w:t>
-      </w:r>
-      <w:r>
-        <w:t xml:space="preserve"> transitive dependencies</w:t>
+      <w:pPr>
+        <w:spacing w:after="0" w:line="240" w:lineRule="auto"/>
+        <w:rPr>
+          <w:rFonts w:ascii="Arial" w:eastAsia="Times New Roman" w:hAnsi="Arial" w:cs="Arial"/>
+          <w:kern w:val="0"/>
+          <w14:ligatures w14:val="none"/>
+        </w:rPr>
+      </w:pPr>
+      <w:bookmarkStart w:id="5" w:name="_Toc242304776"/>
+      <w:r>
+        <w:rPr>
+          <w:rFonts w:ascii="Arial" w:eastAsia="Times New Roman" w:hAnsi="Arial" w:cs="Arial"/>
+          <w:kern w:val="0"/>
+          <w14:ligatures w14:val="none"/>
+        </w:rPr>
+        <w:t xml:space="preserve">The database schema has been designed to satisfy </w:t>
+      </w:r>
+      <w:r>
+        <w:rPr>
+          <w:rFonts w:ascii="Arial" w:eastAsia="Times New Roman" w:hAnsi="Arial" w:cs="Arial"/>
+          <w:b/>
+          <w:bCs/>
+          <w:kern w:val="0"/>
+          <w14:ligatures w14:val="none"/>
+        </w:rPr>
+        <w:t>Third Normal Form (3NF)</w:t>
+      </w:r>
+      <w:r>
+        <w:rPr>
+          <w:rFonts w:ascii="Arial" w:eastAsia="Times New Roman" w:hAnsi="Arial" w:cs="Arial"/>
+          <w:kern w:val="0"/>
+          <w14:ligatures w14:val="none"/>
+        </w:rPr>
+        <w:t>. All partial and transitive functional dependencies have been eliminated by isolating distinct operational concepts into independent tables. Primary keys (</w:t>
+      </w:r>
+      <w:r>
+        <w:rPr>
+          <w:rFonts w:ascii="Arial" w:eastAsia="Times New Roman" w:hAnsi="Arial" w:cs="Arial"/>
+          <w:b/>
+          <w:bCs/>
+          <w:kern w:val="0"/>
+          <w14:ligatures w14:val="none"/>
+        </w:rPr>
+        <w:t>PK</w:t>
+      </w:r>
+      <w:r>
+        <w:rPr>
+          <w:rFonts w:ascii="Arial" w:eastAsia="Times New Roman" w:hAnsi="Arial" w:cs="Arial"/>
+          <w:kern w:val="0"/>
+          <w14:ligatures w14:val="none"/>
+        </w:rPr>
+        <w:t>) guarantee entity integrity, while foreign keys (</w:t>
+      </w:r>
+      <w:r>
+        <w:rPr>
+          <w:rFonts w:ascii="Arial" w:eastAsia="Times New Roman" w:hAnsi="Arial" w:cs="Arial"/>
+          <w:b/>
+          <w:bCs/>
+          <w:kern w:val="0"/>
+          <w14:ligatures w14:val="none"/>
+        </w:rPr>
+        <w:t>FK</w:t>
+      </w:r>
+      <w:r>
+        <w:rPr>
+          <w:rFonts w:ascii="Arial" w:eastAsia="Times New Roman" w:hAnsi="Arial" w:cs="Arial"/>
+          <w:kern w:val="0"/>
+          <w14:ligatures w14:val="none"/>
+        </w:rPr>
+        <w:t>) enforce strict referential integrity across the system.</w:t>
+      </w:r>
+    </w:p>
+    <w:p>
+      <w:pPr>
+        <w:spacing w:after="0" w:line="240" w:lineRule="auto"/>
+        <w:rPr>
+          <w:rFonts w:ascii="Arial" w:eastAsia="Times New Roman" w:hAnsi="Arial" w:cs="Arial"/>
+          <w:kern w:val="0"/>
+          <w14:ligatures w14:val="none"/>
+        </w:rPr>
+      </w:pPr>
+    </w:p>
+    <w:p>
+      <w:pPr>
+        <w:spacing w:after="0" w:line="240" w:lineRule="auto"/>
+        <w:rPr>
+          <w:rFonts w:ascii="Arial" w:eastAsia="Times New Roman" w:hAnsi="Arial" w:cs="Arial"/>
+          <w:kern w:val="0"/>
+          <w14:ligatures w14:val="none"/>
+        </w:rPr>
+      </w:pPr>
+      <w:r>
+        <w:rPr>
+          <w:rFonts w:ascii="Arial" w:eastAsia="Times New Roman" w:hAnsi="Arial" w:cs="Arial"/>
+          <w:kern w:val="0"/>
+          <w14:ligatures w14:val="none"/>
+        </w:rPr>
+        <w:t>Below is the formal relational schema mapping for the 14 operational tables:</w:t>
+      </w:r>
+    </w:p>
+    <w:p>
+      <w:pPr>
+        <w:numPr>
+          <w:ilvl w:val="0"/>
+          <w:numId w:val="17"/>
+        </w:numPr>
+        <w:spacing w:after="0" w:line="240" w:lineRule="auto"/>
+        <w:rPr>
+          <w:rFonts w:ascii="Arial" w:eastAsia="Times New Roman" w:hAnsi="Arial" w:cs="Arial"/>
+          <w:kern w:val="0"/>
+          <w14:ligatures w14:val="none"/>
+        </w:rPr>
+      </w:pPr>
+      <w:r>
+        <w:rPr>
+          <w:rFonts w:ascii="Arial" w:eastAsia="Times New Roman" w:hAnsi="Arial" w:cs="Arial"/>
+          <w:b/>
+          <w:bCs/>
+          <w:kern w:val="0"/>
+          <w14:ligatures w14:val="none"/>
+        </w:rPr>
+        <w:t>icd9_dict</w:t>
+      </w:r>
+      <w:r>
+        <w:rPr>
+          <w:rFonts w:ascii="Arial" w:eastAsia="Times New Roman" w:hAnsi="Arial" w:cs="Arial"/>
+          <w:kern w:val="0"/>
+          <w14:ligatures w14:val="none"/>
+        </w:rPr>
+        <w:t xml:space="preserve"> (</w:t>
+      </w:r>
+      <w:r>
+        <w:rPr>
+          <w:rFonts w:ascii="Arial" w:eastAsia="Times New Roman" w:hAnsi="Arial" w:cs="Arial"/>
+          <w:b/>
+          <w:bCs/>
+          <w:kern w:val="0"/>
+          <w14:ligatures w14:val="none"/>
+        </w:rPr>
+        <w:t>icd9_code</w:t>
+      </w:r>
+      <w:r>
+        <w:rPr>
+          <w:rFonts w:ascii="Arial" w:eastAsia="Times New Roman" w:hAnsi="Arial" w:cs="Arial"/>
+          <w:kern w:val="0"/>
+          <w14:ligatures w14:val="none"/>
+        </w:rPr>
+        <w:t>, disease_category, description, official_diag_title)</w:t>
+      </w:r>
+    </w:p>
+    <w:p>
+      <w:pPr>
+        <w:numPr>
+          <w:ilvl w:val="0"/>
+          <w:numId w:val="17"/>
+        </w:numPr>
+        <w:spacing w:after="0" w:line="240" w:lineRule="auto"/>
+        <w:rPr>
+          <w:rFonts w:ascii="Arial" w:eastAsia="Times New Roman" w:hAnsi="Arial" w:cs="Arial"/>
+          <w:kern w:val="0"/>
+          <w14:ligatures w14:val="none"/>
+        </w:rPr>
+      </w:pPr>
+      <w:r>
+        <w:rPr>
+          <w:rFonts w:ascii="Arial" w:eastAsia="Times New Roman" w:hAnsi="Arial" w:cs="Arial"/>
+          <w:b/>
+          <w:bCs/>
+          <w:kern w:val="0"/>
+          <w14:ligatures w14:val="none"/>
+        </w:rPr>
+        <w:t>physician</w:t>
+      </w:r>
+      <w:r>
+        <w:rPr>
+          <w:rFonts w:ascii="Arial" w:eastAsia="Times New Roman" w:hAnsi="Arial" w:cs="Arial"/>
+          <w:kern w:val="0"/>
+          <w14:ligatures w14:val="none"/>
+        </w:rPr>
+        <w:t xml:space="preserve"> (</w:t>
+      </w:r>
+      <w:r>
+        <w:rPr>
+          <w:rFonts w:ascii="Arial" w:eastAsia="Times New Roman" w:hAnsi="Arial" w:cs="Arial"/>
+          <w:b/>
+          <w:bCs/>
+          <w:kern w:val="0"/>
+          <w14:ligatures w14:val="none"/>
+        </w:rPr>
+        <w:t>physician_id</w:t>
+      </w:r>
+      <w:r>
+        <w:rPr>
+          <w:rFonts w:ascii="Arial" w:eastAsia="Times New Roman" w:hAnsi="Arial" w:cs="Arial"/>
+          <w:kern w:val="0"/>
+          <w14:ligatures w14:val="none"/>
+        </w:rPr>
+        <w:t>, name, specialization)</w:t>
+      </w:r>
+    </w:p>
+    <w:p>
+      <w:pPr>
+        <w:numPr>
+          <w:ilvl w:val="0"/>
+          <w:numId w:val="17"/>
+        </w:numPr>
+        <w:spacing w:after="0" w:line="240" w:lineRule="auto"/>
+        <w:rPr>
+          <w:rFonts w:ascii="Arial" w:eastAsia="Times New Roman" w:hAnsi="Arial" w:cs="Arial"/>
+          <w:kern w:val="0"/>
+          <w14:ligatures w14:val="none"/>
+        </w:rPr>
+      </w:pPr>
+      <w:r>
+        <w:rPr>
+          <w:rFonts w:ascii="Arial" w:eastAsia="Times New Roman" w:hAnsi="Arial" w:cs="Arial"/>
+          <w:b/>
+          <w:bCs/>
+          <w:kern w:val="0"/>
+          <w14:ligatures w14:val="none"/>
+        </w:rPr>
+        <w:t>nurse</w:t>
+      </w:r>
+      <w:r>
+        <w:rPr>
+          <w:rFonts w:ascii="Arial" w:eastAsia="Times New Roman" w:hAnsi="Arial" w:cs="Arial"/>
+          <w:kern w:val="0"/>
+          <w14:ligatures w14:val="none"/>
+        </w:rPr>
+        <w:t xml:space="preserve"> (</w:t>
+      </w:r>
+      <w:r>
+        <w:rPr>
+          <w:rFonts w:ascii="Arial" w:eastAsia="Times New Roman" w:hAnsi="Arial" w:cs="Arial"/>
+          <w:b/>
+          <w:bCs/>
+          <w:kern w:val="0"/>
+          <w14:ligatures w14:val="none"/>
+        </w:rPr>
+        <w:t>nurse_id</w:t>
+      </w:r>
+      <w:r>
+        <w:rPr>
+          <w:rFonts w:ascii="Arial" w:eastAsia="Times New Roman" w:hAnsi="Arial" w:cs="Arial"/>
+          <w:kern w:val="0"/>
+          <w14:ligatures w14:val="none"/>
+        </w:rPr>
+        <w:t>, name)</w:t>
+      </w:r>
+    </w:p>
+    <w:p>
+      <w:pPr>
+        <w:numPr>
+          <w:ilvl w:val="0"/>
+          <w:numId w:val="17"/>
+        </w:numPr>
+        <w:spacing w:after="0" w:line="240" w:lineRule="auto"/>
+        <w:rPr>
+          <w:rFonts w:ascii="Arial" w:eastAsia="Times New Roman" w:hAnsi="Arial" w:cs="Arial"/>
+          <w:kern w:val="0"/>
+          <w14:ligatures w14:val="none"/>
+        </w:rPr>
+      </w:pPr>
+      <w:r>
+        <w:rPr>
+          <w:rFonts w:ascii="Arial" w:eastAsia="Times New Roman" w:hAnsi="Arial" w:cs="Arial"/>
+          <w:b/>
+          <w:bCs/>
+          <w:kern w:val="0"/>
+          <w14:ligatures w14:val="none"/>
+        </w:rPr>
+        <w:t>patient</w:t>
+      </w:r>
+      <w:r>
+        <w:rPr>
+          <w:rFonts w:ascii="Arial" w:eastAsia="Times New Roman" w:hAnsi="Arial" w:cs="Arial"/>
+          <w:kern w:val="0"/>
+          <w14:ligatures w14:val="none"/>
+        </w:rPr>
+        <w:t xml:space="preserve"> (</w:t>
+      </w:r>
+      <w:r>
+        <w:rPr>
+          <w:rFonts w:ascii="Arial" w:eastAsia="Times New Roman" w:hAnsi="Arial" w:cs="Arial"/>
+          <w:b/>
+          <w:bCs/>
+          <w:kern w:val="0"/>
+          <w14:ligatures w14:val="none"/>
+        </w:rPr>
+        <w:t>patient_id</w:t>
+      </w:r>
+      <w:r>
+        <w:rPr>
+          <w:rFonts w:ascii="Arial" w:eastAsia="Times New Roman" w:hAnsi="Arial" w:cs="Arial"/>
+          <w:kern w:val="0"/>
+          <w14:ligatures w14:val="none"/>
+        </w:rPr>
+        <w:t>, name, date_birth, gender, address, telephone_num</w:t>
+      </w:r>
+      <w:r>
+        <w:rPr>
+          <w:rFonts w:ascii="Arial" w:eastAsia="Times New Roman" w:hAnsi="Arial" w:cs="Arial"/>
+          <w:kern w:val="0"/>
+          <w14:ligatures w14:val="none"/>
+        </w:rPr>
+        <w:t>ber</w:t>
+      </w:r>
+      <w:r>
+        <w:rPr>
+          <w:rFonts w:ascii="Arial" w:eastAsia="Times New Roman" w:hAnsi="Arial" w:cs="Arial"/>
+          <w:kern w:val="0"/>
+          <w14:ligatures w14:val="none"/>
+        </w:rPr>
+        <w:t>, emergency_contact, life_status)</w:t>
+      </w:r>
+    </w:p>
+    <w:p>
+      <w:pPr>
+        <w:numPr>
+          <w:ilvl w:val="0"/>
+          <w:numId w:val="17"/>
+        </w:numPr>
+        <w:spacing w:after="0" w:line="240" w:lineRule="auto"/>
+        <w:rPr>
+          <w:rFonts w:ascii="Arial" w:eastAsia="Times New Roman" w:hAnsi="Arial" w:cs="Arial"/>
+          <w:kern w:val="0"/>
+          <w14:ligatures w14:val="none"/>
+        </w:rPr>
+      </w:pPr>
+      <w:r>
+        <w:rPr>
+          <w:rFonts w:ascii="Arial" w:eastAsia="Times New Roman" w:hAnsi="Arial" w:cs="Arial"/>
+          <w:b/>
+          <w:bCs/>
+          <w:kern w:val="0"/>
+          <w14:ligatures w14:val="none"/>
+        </w:rPr>
+        <w:t>admission</w:t>
+      </w:r>
+      <w:r>
+        <w:rPr>
+          <w:rFonts w:ascii="Arial" w:eastAsia="Times New Roman" w:hAnsi="Arial" w:cs="Arial"/>
+          <w:kern w:val="0"/>
+          <w14:ligatures w14:val="none"/>
+        </w:rPr>
+        <w:t xml:space="preserve"> (</w:t>
+      </w:r>
+      <w:r>
+        <w:rPr>
+          <w:rFonts w:ascii="Arial" w:eastAsia="Times New Roman" w:hAnsi="Arial" w:cs="Arial"/>
+          <w:b/>
+          <w:bCs/>
+          <w:kern w:val="0"/>
+          <w14:ligatures w14:val="none"/>
+        </w:rPr>
+        <w:t>admission_id</w:t>
+      </w:r>
+      <w:r>
+        <w:rPr>
+          <w:rFonts w:ascii="Arial" w:eastAsia="Times New Roman" w:hAnsi="Arial" w:cs="Arial"/>
+          <w:kern w:val="0"/>
+          <w14:ligatures w14:val="none"/>
+        </w:rPr>
+        <w:t xml:space="preserve">, </w:t>
+      </w:r>
+      <w:r>
+        <w:rPr>
+          <w:rFonts w:ascii="Arial" w:eastAsia="Times New Roman" w:hAnsi="Arial" w:cs="Arial"/>
+          <w:i/>
+          <w:iCs/>
+          <w:kern w:val="0"/>
+          <w14:ligatures w14:val="none"/>
+        </w:rPr>
+        <w:t>patient_id</w:t>
+      </w:r>
+      <w:r>
+        <w:rPr>
+          <w:rFonts w:ascii="Arial" w:eastAsia="Times New Roman" w:hAnsi="Arial" w:cs="Arial"/>
+          <w:kern w:val="0"/>
+          <w14:ligatures w14:val="none"/>
+        </w:rPr>
+        <w:t xml:space="preserve">, admission_date_time, admission_type, reason_admission, admission_source, insurance_info, current_condition, </w:t>
+      </w:r>
+      <w:r>
+        <w:rPr>
+          <w:rFonts w:ascii="Arial" w:eastAsia="Times New Roman" w:hAnsi="Arial" w:cs="Arial"/>
+          <w:i/>
+          <w:iCs/>
+          <w:kern w:val="0"/>
+          <w14:ligatures w14:val="none"/>
+        </w:rPr>
+        <w:t>admitting_prof_id</w:t>
+      </w:r>
+      <w:r>
+        <w:rPr>
+          <w:rFonts w:ascii="Arial" w:eastAsia="Times New Roman" w:hAnsi="Arial" w:cs="Arial"/>
+          <w:kern w:val="0"/>
+          <w14:ligatures w14:val="none"/>
+        </w:rPr>
+        <w:t>)</w:t>
+      </w:r>
+    </w:p>
+    <w:p>
+      <w:pPr>
+        <w:numPr>
+          <w:ilvl w:val="1"/>
+          <w:numId w:val="17"/>
+        </w:numPr>
+        <w:spacing w:after="0" w:line="240" w:lineRule="auto"/>
+        <w:rPr>
+          <w:rFonts w:ascii="Arial" w:eastAsia="Times New Roman" w:hAnsi="Arial" w:cs="Arial"/>
+          <w:kern w:val="0"/>
+          <w14:ligatures w14:val="none"/>
+        </w:rPr>
+      </w:pPr>
+      <w:r>
+        <w:rPr>
+          <w:rFonts w:ascii="Arial" w:eastAsia="Times New Roman" w:hAnsi="Arial" w:cs="Arial"/>
+          <w:i/>
+          <w:iCs/>
+          <w:kern w:val="0"/>
+          <w14:ligatures w14:val="none"/>
+        </w:rPr>
+        <w:t>Foreign Keys:</w:t>
+      </w:r>
+      <w:r>
+        <w:rPr>
+          <w:rFonts w:ascii="Arial" w:eastAsia="Times New Roman" w:hAnsi="Arial" w:cs="Arial"/>
+          <w:kern w:val="0"/>
+          <w14:ligatures w14:val="none"/>
+        </w:rPr>
+        <w:t xml:space="preserve"> </w:t>
+      </w:r>
+      <w:r>
+        <w:rPr>
+          <w:rFonts w:ascii="Courier New" w:eastAsia="Times New Roman" w:hAnsi="Courier New" w:cs="Courier New"/>
+          <w:kern w:val="0"/>
+          <w:sz w:val="21"/>
+          <w:szCs w:val="21"/>
+          <w14:ligatures w14:val="none"/>
+        </w:rPr>
+        <w:t>patient_id</w:t>
+      </w:r>
+      <w:r>
+        <w:rPr>
+          <w:rFonts w:ascii="Arial" w:eastAsia="Times New Roman" w:hAnsi="Arial" w:cs="Arial"/>
+          <w:kern w:val="0"/>
+          <w14:ligatures w14:val="none"/>
+        </w:rPr>
+        <w:t xml:space="preserve"> references </w:t>
+      </w:r>
+      <w:r>
+        <w:rPr>
+          <w:rFonts w:ascii="Courier New" w:eastAsia="Times New Roman" w:hAnsi="Courier New" w:cs="Courier New"/>
+          <w:kern w:val="0"/>
+          <w:sz w:val="21"/>
+          <w:szCs w:val="21"/>
+          <w14:ligatures w14:val="none"/>
+        </w:rPr>
+        <w:t>patient(patient_id)</w:t>
+      </w:r>
+      <w:r>
+        <w:rPr>
+          <w:rFonts w:ascii="Arial" w:eastAsia="Times New Roman" w:hAnsi="Arial" w:cs="Arial"/>
+          <w:kern w:val="0"/>
+          <w14:ligatures w14:val="none"/>
+        </w:rPr>
+        <w:t xml:space="preserve">, </w:t>
+      </w:r>
+      <w:r>
+        <w:rPr>
+          <w:rFonts w:ascii="Courier New" w:eastAsia="Times New Roman" w:hAnsi="Courier New" w:cs="Courier New"/>
+          <w:kern w:val="0"/>
+          <w:sz w:val="21"/>
+          <w:szCs w:val="21"/>
+          <w14:ligatures w14:val="none"/>
+        </w:rPr>
+        <w:t>admitting_prof_id</w:t>
+      </w:r>
+      <w:r>
+        <w:rPr>
+          <w:rFonts w:ascii="Arial" w:eastAsia="Times New Roman" w:hAnsi="Arial" w:cs="Arial"/>
+          <w:kern w:val="0"/>
+          <w14:ligatures w14:val="none"/>
+        </w:rPr>
+        <w:t xml:space="preserve"> references </w:t>
+      </w:r>
+      <w:r>
+        <w:rPr>
+          <w:rFonts w:ascii="Courier New" w:eastAsia="Times New Roman" w:hAnsi="Courier New" w:cs="Courier New"/>
+          <w:kern w:val="0"/>
+          <w:sz w:val="21"/>
+          <w:szCs w:val="21"/>
+          <w14:ligatures w14:val="none"/>
+        </w:rPr>
+        <w:t>physician(physician_id)</w:t>
+      </w:r>
+    </w:p>
+    <w:p>
+      <w:pPr>
+        <w:numPr>
+          <w:ilvl w:val="0"/>
+          <w:numId w:val="17"/>
+        </w:numPr>
+        <w:spacing w:after="0" w:line="240" w:lineRule="auto"/>
+        <w:rPr>
+          <w:rFonts w:ascii="Arial" w:eastAsia="Times New Roman" w:hAnsi="Arial" w:cs="Arial"/>
+          <w:kern w:val="0"/>
+          <w14:ligatures w14:val="none"/>
+        </w:rPr>
+      </w:pPr>
+      <w:r>
+        <w:rPr>
+          <w:rFonts w:ascii="Arial" w:eastAsia="Times New Roman" w:hAnsi="Arial" w:cs="Arial"/>
+          <w:b/>
+          <w:bCs/>
+          <w:kern w:val="0"/>
+          <w14:ligatures w14:val="none"/>
+        </w:rPr>
+        <w:t>triage_assessment</w:t>
+      </w:r>
+      <w:r>
+        <w:rPr>
+          <w:rFonts w:ascii="Arial" w:eastAsia="Times New Roman" w:hAnsi="Arial" w:cs="Arial"/>
+          <w:kern w:val="0"/>
+          <w14:ligatures w14:val="none"/>
+        </w:rPr>
+        <w:t xml:space="preserve"> (</w:t>
+      </w:r>
+      <w:r>
+        <w:rPr>
+          <w:rFonts w:ascii="Arial" w:eastAsia="Times New Roman" w:hAnsi="Arial" w:cs="Arial"/>
+          <w:b/>
+          <w:bCs/>
+          <w:kern w:val="0"/>
+          <w14:ligatures w14:val="none"/>
+        </w:rPr>
+        <w:t>triage_id</w:t>
+      </w:r>
+      <w:r>
+        <w:rPr>
+          <w:rFonts w:ascii="Arial" w:eastAsia="Times New Roman" w:hAnsi="Arial" w:cs="Arial"/>
+          <w:kern w:val="0"/>
+          <w14:ligatures w14:val="none"/>
+        </w:rPr>
+        <w:t xml:space="preserve">, </w:t>
+      </w:r>
+      <w:r>
+        <w:rPr>
+          <w:rFonts w:ascii="Arial" w:eastAsia="Times New Roman" w:hAnsi="Arial" w:cs="Arial"/>
+          <w:i/>
+          <w:iCs/>
+          <w:kern w:val="0"/>
+          <w14:ligatures w14:val="none"/>
+        </w:rPr>
+        <w:t>admission_id</w:t>
+      </w:r>
+      <w:r>
+        <w:rPr>
+          <w:rFonts w:ascii="Arial" w:eastAsia="Times New Roman" w:hAnsi="Arial" w:cs="Arial"/>
+          <w:kern w:val="0"/>
+          <w14:ligatures w14:val="none"/>
+        </w:rPr>
+        <w:t xml:space="preserve">, </w:t>
+      </w:r>
+      <w:r>
+        <w:rPr>
+          <w:rFonts w:ascii="Arial" w:eastAsia="Times New Roman" w:hAnsi="Arial" w:cs="Arial"/>
+          <w:i/>
+          <w:iCs/>
+          <w:kern w:val="0"/>
+          <w14:ligatures w14:val="none"/>
+        </w:rPr>
+        <w:t>nurse_id</w:t>
+      </w:r>
+      <w:r>
+        <w:rPr>
+          <w:rFonts w:ascii="Arial" w:eastAsia="Times New Roman" w:hAnsi="Arial" w:cs="Arial"/>
+          <w:kern w:val="0"/>
+          <w14:ligatures w14:val="none"/>
+        </w:rPr>
+        <w:t>, blood_pressure, heart_rate, respiratory_rate, body_temp, oxygen_sat, pain_level, priority_level, reported_symptoms, known_allergies, current_meds)</w:t>
+      </w:r>
+    </w:p>
+    <w:p>
+      <w:pPr>
+        <w:numPr>
+          <w:ilvl w:val="1"/>
+          <w:numId w:val="17"/>
+        </w:numPr>
+        <w:spacing w:after="0" w:line="240" w:lineRule="auto"/>
+        <w:rPr>
+          <w:rFonts w:ascii="Arial" w:eastAsia="Times New Roman" w:hAnsi="Arial" w:cs="Arial"/>
+          <w:kern w:val="0"/>
+          <w14:ligatures w14:val="none"/>
+        </w:rPr>
+      </w:pPr>
+      <w:r>
+        <w:rPr>
+          <w:rFonts w:ascii="Arial" w:eastAsia="Times New Roman" w:hAnsi="Arial" w:cs="Arial"/>
+          <w:i/>
+          <w:iCs/>
+          <w:kern w:val="0"/>
+          <w14:ligatures w14:val="none"/>
+        </w:rPr>
+        <w:t>Foreign Key:</w:t>
+      </w:r>
+      <w:r>
+        <w:rPr>
+          <w:rFonts w:ascii="Arial" w:eastAsia="Times New Roman" w:hAnsi="Arial" w:cs="Arial"/>
+          <w:kern w:val="0"/>
+          <w14:ligatures w14:val="none"/>
+        </w:rPr>
+        <w:t xml:space="preserve"> </w:t>
+      </w:r>
+      <w:r>
+        <w:rPr>
+          <w:rFonts w:ascii="Courier New" w:eastAsia="Times New Roman" w:hAnsi="Courier New" w:cs="Courier New"/>
+          <w:kern w:val="0"/>
+          <w:sz w:val="21"/>
+          <w:szCs w:val="21"/>
+          <w14:ligatures w14:val="none"/>
+        </w:rPr>
+        <w:t>admission_id</w:t>
+      </w:r>
+      <w:r>
+        <w:rPr>
+          <w:rFonts w:ascii="Arial" w:eastAsia="Times New Roman" w:hAnsi="Arial" w:cs="Arial"/>
+          <w:kern w:val="0"/>
+          <w14:ligatures w14:val="none"/>
+        </w:rPr>
+        <w:t xml:space="preserve"> references </w:t>
+      </w:r>
+      <w:r>
+        <w:rPr>
+          <w:rFonts w:ascii="Courier New" w:eastAsia="Times New Roman" w:hAnsi="Courier New" w:cs="Courier New"/>
+          <w:kern w:val="0"/>
+          <w:sz w:val="21"/>
+          <w:szCs w:val="21"/>
+          <w14:ligatures w14:val="none"/>
+        </w:rPr>
+        <w:t>admission(admission_id)</w:t>
+      </w:r>
+      <w:r>
+        <w:rPr>
+          <w:rFonts w:ascii="Arial" w:eastAsia="Times New Roman" w:hAnsi="Arial" w:cs="Arial"/>
+          <w:kern w:val="0"/>
+          <w14:ligatures w14:val="none"/>
+        </w:rPr>
+        <w:t xml:space="preserve">, </w:t>
+      </w:r>
+      <w:r>
+        <w:rPr>
+          <w:rFonts w:ascii="Courier New" w:eastAsia="Times New Roman" w:hAnsi="Courier New" w:cs="Courier New"/>
+          <w:kern w:val="0"/>
+          <w:sz w:val="21"/>
+          <w:szCs w:val="21"/>
+          <w14:ligatures w14:val="none"/>
+        </w:rPr>
+        <w:t>nurse_id</w:t>
+      </w:r>
+      <w:r>
+        <w:rPr>
+          <w:rFonts w:ascii="Arial" w:eastAsia="Times New Roman" w:hAnsi="Arial" w:cs="Arial"/>
+          <w:kern w:val="0"/>
+          <w14:ligatures w14:val="none"/>
+        </w:rPr>
+        <w:t xml:space="preserve"> references </w:t>
+      </w:r>
+      <w:r>
+        <w:rPr>
+          <w:rFonts w:ascii="Courier New" w:eastAsia="Times New Roman" w:hAnsi="Courier New" w:cs="Courier New"/>
+          <w:kern w:val="0"/>
+          <w:sz w:val="21"/>
+          <w:szCs w:val="21"/>
+          <w14:ligatures w14:val="none"/>
+        </w:rPr>
+        <w:t>nurse(nurse_id)</w:t>
+      </w:r>
+    </w:p>
+    <w:p>
+      <w:pPr>
+        <w:numPr>
+          <w:ilvl w:val="0"/>
+          <w:numId w:val="17"/>
+        </w:numPr>
+        <w:spacing w:after="0" w:line="240" w:lineRule="auto"/>
+        <w:rPr>
+          <w:rFonts w:ascii="Arial" w:eastAsia="Times New Roman" w:hAnsi="Arial" w:cs="Arial"/>
+          <w:kern w:val="0"/>
+          <w14:ligatures w14:val="none"/>
+        </w:rPr>
+      </w:pPr>
+      <w:r>
+        <w:rPr>
+          <w:rFonts w:ascii="Arial" w:eastAsia="Times New Roman" w:hAnsi="Arial" w:cs="Arial"/>
+          <w:b/>
+          <w:bCs/>
+          <w:kern w:val="0"/>
+          <w14:ligatures w14:val="none"/>
+        </w:rPr>
+        <w:t>diagnosis</w:t>
+      </w:r>
+      <w:r>
+        <w:rPr>
+          <w:rFonts w:ascii="Arial" w:eastAsia="Times New Roman" w:hAnsi="Arial" w:cs="Arial"/>
+          <w:kern w:val="0"/>
+          <w14:ligatures w14:val="none"/>
+        </w:rPr>
+        <w:t xml:space="preserve"> (</w:t>
+      </w:r>
+      <w:r>
+        <w:rPr>
+          <w:rFonts w:ascii="Arial" w:eastAsia="Times New Roman" w:hAnsi="Arial" w:cs="Arial"/>
+          <w:b/>
+          <w:bCs/>
+          <w:kern w:val="0"/>
+          <w14:ligatures w14:val="none"/>
+        </w:rPr>
+        <w:t>diagnosis_id</w:t>
+      </w:r>
+      <w:r>
+        <w:rPr>
+          <w:rFonts w:ascii="Arial" w:eastAsia="Times New Roman" w:hAnsi="Arial" w:cs="Arial"/>
+          <w:kern w:val="0"/>
+          <w14:ligatures w14:val="none"/>
+        </w:rPr>
+        <w:t xml:space="preserve">, </w:t>
+      </w:r>
+      <w:r>
+        <w:rPr>
+          <w:rFonts w:ascii="Arial" w:eastAsia="Times New Roman" w:hAnsi="Arial" w:cs="Arial"/>
+          <w:i/>
+          <w:iCs/>
+          <w:kern w:val="0"/>
+          <w14:ligatures w14:val="none"/>
+        </w:rPr>
+        <w:t>admission_id</w:t>
+      </w:r>
+      <w:r>
+        <w:rPr>
+          <w:rFonts w:ascii="Arial" w:eastAsia="Times New Roman" w:hAnsi="Arial" w:cs="Arial"/>
+          <w:kern w:val="0"/>
+          <w14:ligatures w14:val="none"/>
+        </w:rPr>
+        <w:t xml:space="preserve">, </w:t>
+      </w:r>
+      <w:r>
+        <w:rPr>
+          <w:rFonts w:ascii="Arial" w:eastAsia="Times New Roman" w:hAnsi="Arial" w:cs="Arial"/>
+          <w:i/>
+          <w:iCs/>
+          <w:kern w:val="0"/>
+          <w14:ligatures w14:val="none"/>
+        </w:rPr>
+        <w:t>icd9_code</w:t>
+      </w:r>
+      <w:r>
+        <w:rPr>
+          <w:rFonts w:ascii="Arial" w:eastAsia="Times New Roman" w:hAnsi="Arial" w:cs="Arial"/>
+          <w:kern w:val="0"/>
+          <w14:ligatures w14:val="none"/>
+        </w:rPr>
+        <w:t xml:space="preserve">, </w:t>
+      </w:r>
+      <w:r>
+        <w:rPr>
+          <w:rFonts w:ascii="Arial" w:eastAsia="Times New Roman" w:hAnsi="Arial" w:cs="Arial"/>
+          <w:i/>
+          <w:iCs/>
+          <w:kern w:val="0"/>
+          <w14:ligatures w14:val="none"/>
+        </w:rPr>
+        <w:t>diagnosing_phys_id</w:t>
+      </w:r>
+      <w:r>
+        <w:rPr>
+          <w:rFonts w:ascii="Arial" w:eastAsia="Times New Roman" w:hAnsi="Arial" w:cs="Arial"/>
+          <w:kern w:val="0"/>
+          <w14:ligatures w14:val="none"/>
+        </w:rPr>
+        <w:t>, diagnosis_date_time, primary_diag, secondary_diag)</w:t>
+      </w:r>
+    </w:p>
+    <w:p>
+      <w:pPr>
+        <w:numPr>
+          <w:ilvl w:val="1"/>
+          <w:numId w:val="17"/>
+        </w:numPr>
+        <w:spacing w:after="0" w:line="240" w:lineRule="auto"/>
+        <w:rPr>
+          <w:rFonts w:ascii="Arial" w:eastAsia="Times New Roman" w:hAnsi="Arial" w:cs="Arial"/>
+          <w:kern w:val="0"/>
+          <w14:ligatures w14:val="none"/>
+        </w:rPr>
+      </w:pPr>
+      <w:r>
+        <w:rPr>
+          <w:rFonts w:ascii="Arial" w:eastAsia="Times New Roman" w:hAnsi="Arial" w:cs="Arial"/>
+          <w:i/>
+          <w:iCs/>
+          <w:kern w:val="0"/>
+          <w14:ligatures w14:val="none"/>
+        </w:rPr>
+        <w:t>Foreign Keys:</w:t>
+      </w:r>
+      <w:r>
+        <w:rPr>
+          <w:rFonts w:ascii="Arial" w:eastAsia="Times New Roman" w:hAnsi="Arial" w:cs="Arial"/>
+          <w:kern w:val="0"/>
+          <w14:ligatures w14:val="none"/>
+        </w:rPr>
+        <w:t xml:space="preserve"> </w:t>
+      </w:r>
+      <w:r>
+        <w:rPr>
+          <w:rFonts w:ascii="Courier New" w:eastAsia="Times New Roman" w:hAnsi="Courier New" w:cs="Courier New"/>
+          <w:kern w:val="0"/>
+          <w:sz w:val="21"/>
+          <w:szCs w:val="21"/>
+          <w14:ligatures w14:val="none"/>
+        </w:rPr>
+        <w:t>admission_id</w:t>
+      </w:r>
+      <w:r>
+        <w:rPr>
+          <w:rFonts w:ascii="Arial" w:eastAsia="Times New Roman" w:hAnsi="Arial" w:cs="Arial"/>
+          <w:kern w:val="0"/>
+          <w14:ligatures w14:val="none"/>
+        </w:rPr>
+        <w:t xml:space="preserve"> references </w:t>
+      </w:r>
+      <w:r>
+        <w:rPr>
+          <w:rFonts w:ascii="Courier New" w:eastAsia="Times New Roman" w:hAnsi="Courier New" w:cs="Courier New"/>
+          <w:kern w:val="0"/>
+          <w:sz w:val="21"/>
+          <w:szCs w:val="21"/>
+          <w14:ligatures w14:val="none"/>
+        </w:rPr>
+        <w:t>admission(admission_id)</w:t>
+      </w:r>
+      <w:r>
+        <w:rPr>
+          <w:rFonts w:ascii="Arial" w:eastAsia="Times New Roman" w:hAnsi="Arial" w:cs="Arial"/>
+          <w:kern w:val="0"/>
+          <w14:ligatures w14:val="none"/>
+        </w:rPr>
+        <w:t xml:space="preserve">, </w:t>
+      </w:r>
+      <w:r>
+        <w:rPr>
+          <w:rFonts w:ascii="Courier New" w:eastAsia="Times New Roman" w:hAnsi="Courier New" w:cs="Courier New"/>
+          <w:kern w:val="0"/>
+          <w:sz w:val="21"/>
+          <w:szCs w:val="21"/>
+          <w14:ligatures w14:val="none"/>
+        </w:rPr>
+        <w:t>icd9_code</w:t>
+      </w:r>
+      <w:r>
+        <w:rPr>
+          <w:rFonts w:ascii="Arial" w:eastAsia="Times New Roman" w:hAnsi="Arial" w:cs="Arial"/>
+          <w:kern w:val="0"/>
+          <w14:ligatures w14:val="none"/>
+        </w:rPr>
+        <w:t xml:space="preserve"> references </w:t>
+      </w:r>
+      <w:r>
+        <w:rPr>
+          <w:rFonts w:ascii="Courier New" w:eastAsia="Times New Roman" w:hAnsi="Courier New" w:cs="Courier New"/>
+          <w:kern w:val="0"/>
+          <w:sz w:val="21"/>
+          <w:szCs w:val="21"/>
+          <w14:ligatures w14:val="none"/>
+        </w:rPr>
+        <w:t>icd9_dict(icd9_code)</w:t>
+      </w:r>
+      <w:r>
+        <w:rPr>
+          <w:rFonts w:ascii="Arial" w:eastAsia="Times New Roman" w:hAnsi="Arial" w:cs="Arial"/>
+          <w:kern w:val="0"/>
+          <w14:ligatures w14:val="none"/>
+        </w:rPr>
+        <w:t xml:space="preserve">, </w:t>
+      </w:r>
+      <w:r>
+        <w:rPr>
+          <w:rFonts w:ascii="Courier New" w:eastAsia="Times New Roman" w:hAnsi="Courier New" w:cs="Courier New"/>
+          <w:kern w:val="0"/>
+          <w:sz w:val="21"/>
+          <w:szCs w:val="21"/>
+          <w14:ligatures w14:val="none"/>
+        </w:rPr>
+        <w:t>diagnosing_phys_id</w:t>
+      </w:r>
+      <w:r>
+        <w:rPr>
+          <w:rFonts w:ascii="Arial" w:eastAsia="Times New Roman" w:hAnsi="Arial" w:cs="Arial"/>
+          <w:kern w:val="0"/>
+          <w14:ligatures w14:val="none"/>
+        </w:rPr>
+        <w:t xml:space="preserve"> references </w:t>
+      </w:r>
+      <w:r>
+        <w:rPr>
+          <w:rFonts w:ascii="Courier New" w:eastAsia="Times New Roman" w:hAnsi="Courier New" w:cs="Courier New"/>
+          <w:kern w:val="0"/>
+          <w:sz w:val="21"/>
+          <w:szCs w:val="21"/>
+          <w14:ligatures w14:val="none"/>
+        </w:rPr>
+        <w:t>physician(physician_id)</w:t>
+      </w:r>
+    </w:p>
+    <w:p>
+      <w:pPr>
+        <w:numPr>
+          <w:ilvl w:val="0"/>
+          <w:numId w:val="17"/>
+        </w:numPr>
+        <w:spacing w:after="0" w:line="240" w:lineRule="auto"/>
+        <w:rPr>
+          <w:rFonts w:ascii="Arial" w:eastAsia="Times New Roman" w:hAnsi="Arial" w:cs="Arial"/>
+          <w:kern w:val="0"/>
+          <w14:ligatures w14:val="none"/>
+        </w:rPr>
+      </w:pPr>
+      <w:r>
+        <w:rPr>
+          <w:rFonts w:ascii="Arial" w:eastAsia="Times New Roman" w:hAnsi="Arial" w:cs="Arial"/>
+          <w:b/>
+          <w:bCs/>
+          <w:kern w:val="0"/>
+          <w14:ligatures w14:val="none"/>
+        </w:rPr>
+        <w:t>icu_stay</w:t>
+      </w:r>
+      <w:r>
+        <w:rPr>
+          <w:rFonts w:ascii="Arial" w:eastAsia="Times New Roman" w:hAnsi="Arial" w:cs="Arial"/>
+          <w:kern w:val="0"/>
+          <w14:ligatures w14:val="none"/>
+        </w:rPr>
+        <w:t xml:space="preserve"> (</w:t>
+      </w:r>
+      <w:r>
+        <w:rPr>
+          <w:rFonts w:ascii="Arial" w:eastAsia="Times New Roman" w:hAnsi="Arial" w:cs="Arial"/>
+          <w:b/>
+          <w:bCs/>
+          <w:kern w:val="0"/>
+          <w14:ligatures w14:val="none"/>
+        </w:rPr>
+        <w:t>unit_stay_number</w:t>
+      </w:r>
+      <w:r>
+        <w:rPr>
+          <w:rFonts w:ascii="Arial" w:eastAsia="Times New Roman" w:hAnsi="Arial" w:cs="Arial"/>
+          <w:kern w:val="0"/>
+          <w14:ligatures w14:val="none"/>
+        </w:rPr>
+        <w:t xml:space="preserve">, </w:t>
+      </w:r>
+      <w:r>
+        <w:rPr>
+          <w:rFonts w:ascii="Arial" w:eastAsia="Times New Roman" w:hAnsi="Arial" w:cs="Arial"/>
+          <w:i/>
+          <w:iCs/>
+          <w:kern w:val="0"/>
+          <w14:ligatures w14:val="none"/>
+        </w:rPr>
+        <w:t>admission_id</w:t>
+      </w:r>
+      <w:r>
+        <w:rPr>
+          <w:rFonts w:ascii="Arial" w:eastAsia="Times New Roman" w:hAnsi="Arial" w:cs="Arial"/>
+          <w:kern w:val="0"/>
+          <w14:ligatures w14:val="none"/>
+        </w:rPr>
+        <w:t xml:space="preserve">, unit_type, room_number, bed_number, entry_date_time, exit_date_time, </w:t>
+      </w:r>
+      <w:r>
+        <w:rPr>
+          <w:rFonts w:ascii="Arial" w:eastAsia="Times New Roman" w:hAnsi="Arial" w:cs="Arial"/>
+          <w:i/>
+          <w:iCs/>
+          <w:kern w:val="0"/>
+          <w14:ligatures w14:val="none"/>
+        </w:rPr>
+        <w:t>physician_id</w:t>
+      </w:r>
+      <w:r>
+        <w:rPr>
+          <w:rFonts w:ascii="Arial" w:eastAsia="Times New Roman" w:hAnsi="Arial" w:cs="Arial"/>
+          <w:kern w:val="0"/>
+          <w14:ligatures w14:val="none"/>
+        </w:rPr>
+        <w:t>, reason_transfer)</w:t>
+      </w:r>
+    </w:p>
+    <w:p>
+      <w:pPr>
+        <w:numPr>
+          <w:ilvl w:val="1"/>
+          <w:numId w:val="17"/>
+        </w:numPr>
+        <w:spacing w:after="0" w:line="240" w:lineRule="auto"/>
+        <w:rPr>
+          <w:rFonts w:ascii="Arial" w:eastAsia="Times New Roman" w:hAnsi="Arial" w:cs="Arial"/>
+          <w:kern w:val="0"/>
+          <w14:ligatures w14:val="none"/>
+        </w:rPr>
+      </w:pPr>
+      <w:r>
+        <w:rPr>
+          <w:rFonts w:ascii="Arial" w:eastAsia="Times New Roman" w:hAnsi="Arial" w:cs="Arial"/>
+          <w:i/>
+          <w:iCs/>
+          <w:kern w:val="0"/>
+          <w14:ligatures w14:val="none"/>
+        </w:rPr>
+        <w:t>Foreign Keys:</w:t>
+      </w:r>
+      <w:r>
+        <w:rPr>
+          <w:rFonts w:ascii="Arial" w:eastAsia="Times New Roman" w:hAnsi="Arial" w:cs="Arial"/>
+          <w:kern w:val="0"/>
+          <w14:ligatures w14:val="none"/>
+        </w:rPr>
+        <w:t xml:space="preserve"> </w:t>
+      </w:r>
+      <w:r>
+        <w:rPr>
+          <w:rFonts w:ascii="Courier New" w:eastAsia="Times New Roman" w:hAnsi="Courier New" w:cs="Courier New"/>
+          <w:kern w:val="0"/>
+          <w:sz w:val="21"/>
+          <w:szCs w:val="21"/>
+          <w14:ligatures w14:val="none"/>
+        </w:rPr>
+        <w:t>admission_id</w:t>
+      </w:r>
+      <w:r>
+        <w:rPr>
+          <w:rFonts w:ascii="Arial" w:eastAsia="Times New Roman" w:hAnsi="Arial" w:cs="Arial"/>
+          <w:kern w:val="0"/>
+          <w14:ligatures w14:val="none"/>
+        </w:rPr>
+        <w:t xml:space="preserve"> references </w:t>
+      </w:r>
+      <w:r>
+        <w:rPr>
+          <w:rFonts w:ascii="Courier New" w:eastAsia="Times New Roman" w:hAnsi="Courier New" w:cs="Courier New"/>
+          <w:kern w:val="0"/>
+          <w:sz w:val="21"/>
+          <w:szCs w:val="21"/>
+          <w14:ligatures w14:val="none"/>
+        </w:rPr>
+        <w:t>admission(admission_id)</w:t>
+      </w:r>
+      <w:r>
+        <w:rPr>
+          <w:rFonts w:ascii="Arial" w:eastAsia="Times New Roman" w:hAnsi="Arial" w:cs="Arial"/>
+          <w:kern w:val="0"/>
+          <w14:ligatures w14:val="none"/>
+        </w:rPr>
+        <w:t xml:space="preserve">, </w:t>
+      </w:r>
+      <w:r>
+        <w:rPr>
+          <w:rFonts w:ascii="Courier New" w:eastAsia="Times New Roman" w:hAnsi="Courier New" w:cs="Courier New"/>
+          <w:kern w:val="0"/>
+          <w:sz w:val="21"/>
+          <w:szCs w:val="21"/>
+          <w14:ligatures w14:val="none"/>
+        </w:rPr>
+        <w:t>physician_id</w:t>
+      </w:r>
+      <w:r>
+        <w:rPr>
+          <w:rFonts w:ascii="Arial" w:eastAsia="Times New Roman" w:hAnsi="Arial" w:cs="Arial"/>
+          <w:kern w:val="0"/>
+          <w14:ligatures w14:val="none"/>
+        </w:rPr>
+        <w:t xml:space="preserve"> references </w:t>
+      </w:r>
+      <w:r>
+        <w:rPr>
+          <w:rFonts w:ascii="Courier New" w:eastAsia="Times New Roman" w:hAnsi="Courier New" w:cs="Courier New"/>
+          <w:kern w:val="0"/>
+          <w:sz w:val="21"/>
+          <w:szCs w:val="21"/>
+          <w14:ligatures w14:val="none"/>
+        </w:rPr>
+        <w:t>physician(physician_id)</w:t>
+      </w:r>
+    </w:p>
+    <w:p>
+      <w:pPr>
+        <w:numPr>
+          <w:ilvl w:val="0"/>
+          <w:numId w:val="17"/>
+        </w:numPr>
+        <w:spacing w:after="0" w:line="240" w:lineRule="auto"/>
+        <w:rPr>
+          <w:rFonts w:ascii="Arial" w:eastAsia="Times New Roman" w:hAnsi="Arial" w:cs="Arial"/>
+          <w:kern w:val="0"/>
+          <w14:ligatures w14:val="none"/>
+        </w:rPr>
+      </w:pPr>
+      <w:r>
+        <w:rPr>
+          <w:rFonts w:ascii="Arial" w:eastAsia="Times New Roman" w:hAnsi="Arial" w:cs="Arial"/>
+          <w:b/>
+          <w:bCs/>
+          <w:kern w:val="0"/>
+          <w14:ligatures w14:val="none"/>
+        </w:rPr>
+        <w:t>clinical_note</w:t>
+      </w:r>
+      <w:r>
+        <w:rPr>
+          <w:rFonts w:ascii="Arial" w:eastAsia="Times New Roman" w:hAnsi="Arial" w:cs="Arial"/>
+          <w:kern w:val="0"/>
+          <w14:ligatures w14:val="none"/>
+        </w:rPr>
+        <w:t xml:space="preserve"> (</w:t>
+      </w:r>
+      <w:r>
+        <w:rPr>
+          <w:rFonts w:ascii="Arial" w:eastAsia="Times New Roman" w:hAnsi="Arial" w:cs="Arial"/>
+          <w:b/>
+          <w:bCs/>
+          <w:kern w:val="0"/>
+          <w14:ligatures w14:val="none"/>
+        </w:rPr>
+        <w:t>note_id</w:t>
+      </w:r>
+      <w:r>
+        <w:rPr>
+          <w:rFonts w:ascii="Arial" w:eastAsia="Times New Roman" w:hAnsi="Arial" w:cs="Arial"/>
+          <w:kern w:val="0"/>
+          <w14:ligatures w14:val="none"/>
+        </w:rPr>
+        <w:t xml:space="preserve">, </w:t>
+      </w:r>
+      <w:r>
+        <w:rPr>
+          <w:rFonts w:ascii="Arial" w:eastAsia="Times New Roman" w:hAnsi="Arial" w:cs="Arial"/>
+          <w:i/>
+          <w:iCs/>
+          <w:kern w:val="0"/>
+          <w14:ligatures w14:val="none"/>
+        </w:rPr>
+        <w:t>admission_id</w:t>
+      </w:r>
+      <w:r>
+        <w:rPr>
+          <w:rFonts w:ascii="Arial" w:eastAsia="Times New Roman" w:hAnsi="Arial" w:cs="Arial"/>
+          <w:kern w:val="0"/>
+          <w14:ligatures w14:val="none"/>
+        </w:rPr>
+        <w:t xml:space="preserve">, </w:t>
+      </w:r>
+      <w:r>
+        <w:rPr>
+          <w:rFonts w:ascii="Arial" w:eastAsia="Times New Roman" w:hAnsi="Arial" w:cs="Arial"/>
+          <w:i/>
+          <w:iCs/>
+          <w:kern w:val="0"/>
+          <w14:ligatures w14:val="none"/>
+        </w:rPr>
+        <w:t>author_prof_id</w:t>
+      </w:r>
+      <w:r>
+        <w:rPr>
+          <w:rFonts w:ascii="Arial" w:eastAsia="Times New Roman" w:hAnsi="Arial" w:cs="Arial"/>
+          <w:kern w:val="0"/>
+          <w14:ligatures w14:val="none"/>
+        </w:rPr>
+        <w:t>, note_date_time, note_text, note_category)</w:t>
+      </w:r>
+    </w:p>
+    <w:p>
+      <w:pPr>
+        <w:numPr>
+          <w:ilvl w:val="1"/>
+          <w:numId w:val="17"/>
+        </w:numPr>
+        <w:spacing w:after="0" w:line="240" w:lineRule="auto"/>
+        <w:rPr>
+          <w:rFonts w:ascii="Arial" w:eastAsia="Times New Roman" w:hAnsi="Arial" w:cs="Arial"/>
+          <w:kern w:val="0"/>
+          <w14:ligatures w14:val="none"/>
+        </w:rPr>
+      </w:pPr>
+      <w:r>
+        <w:rPr>
+          <w:rFonts w:ascii="Arial" w:eastAsia="Times New Roman" w:hAnsi="Arial" w:cs="Arial"/>
+          <w:i/>
+          <w:iCs/>
+          <w:kern w:val="0"/>
+          <w14:ligatures w14:val="none"/>
+        </w:rPr>
+        <w:t>Foreign Keys:</w:t>
+      </w:r>
+      <w:r>
+        <w:rPr>
+          <w:rFonts w:ascii="Arial" w:eastAsia="Times New Roman" w:hAnsi="Arial" w:cs="Arial"/>
+          <w:kern w:val="0"/>
+          <w14:ligatures w14:val="none"/>
+        </w:rPr>
+        <w:t xml:space="preserve"> </w:t>
+      </w:r>
+      <w:r>
+        <w:rPr>
+          <w:rFonts w:ascii="Courier New" w:eastAsia="Times New Roman" w:hAnsi="Courier New" w:cs="Courier New"/>
+          <w:kern w:val="0"/>
+          <w:sz w:val="21"/>
+          <w:szCs w:val="21"/>
+          <w14:ligatures w14:val="none"/>
+        </w:rPr>
+        <w:t>admission_id</w:t>
+      </w:r>
+      <w:r>
+        <w:rPr>
+          <w:rFonts w:ascii="Arial" w:eastAsia="Times New Roman" w:hAnsi="Arial" w:cs="Arial"/>
+          <w:kern w:val="0"/>
+          <w14:ligatures w14:val="none"/>
+        </w:rPr>
+        <w:t xml:space="preserve"> references </w:t>
+      </w:r>
+      <w:r>
+        <w:rPr>
+          <w:rFonts w:ascii="Courier New" w:eastAsia="Times New Roman" w:hAnsi="Courier New" w:cs="Courier New"/>
+          <w:kern w:val="0"/>
+          <w:sz w:val="21"/>
+          <w:szCs w:val="21"/>
+          <w14:ligatures w14:val="none"/>
+        </w:rPr>
+        <w:t>admission(admission_id)</w:t>
+      </w:r>
+    </w:p>
+    <w:p>
+      <w:pPr>
+        <w:numPr>
+          <w:ilvl w:val="0"/>
+          <w:numId w:val="17"/>
+        </w:numPr>
+        <w:spacing w:after="0" w:line="240" w:lineRule="auto"/>
+        <w:rPr>
+          <w:rFonts w:ascii="Arial" w:eastAsia="Times New Roman" w:hAnsi="Arial" w:cs="Arial"/>
+          <w:kern w:val="0"/>
+          <w14:ligatures w14:val="none"/>
+        </w:rPr>
+      </w:pPr>
+      <w:r>
+        <w:rPr>
+          <w:rFonts w:ascii="Arial" w:eastAsia="Times New Roman" w:hAnsi="Arial" w:cs="Arial"/>
+          <w:b/>
+          <w:bCs/>
+          <w:kern w:val="0"/>
+          <w14:ligatures w14:val="none"/>
+        </w:rPr>
+        <w:t>diagnostic_order</w:t>
+      </w:r>
+      <w:r>
+        <w:rPr>
+          <w:rFonts w:ascii="Arial" w:eastAsia="Times New Roman" w:hAnsi="Arial" w:cs="Arial"/>
+          <w:kern w:val="0"/>
+          <w14:ligatures w14:val="none"/>
+        </w:rPr>
+        <w:t xml:space="preserve"> (</w:t>
+      </w:r>
+      <w:r>
+        <w:rPr>
+          <w:rFonts w:ascii="Arial" w:eastAsia="Times New Roman" w:hAnsi="Arial" w:cs="Arial"/>
+          <w:b/>
+          <w:bCs/>
+          <w:kern w:val="0"/>
+          <w14:ligatures w14:val="none"/>
+        </w:rPr>
+        <w:t>order_id</w:t>
+      </w:r>
+      <w:r>
+        <w:rPr>
+          <w:rFonts w:ascii="Arial" w:eastAsia="Times New Roman" w:hAnsi="Arial" w:cs="Arial"/>
+          <w:kern w:val="0"/>
+          <w14:ligatures w14:val="none"/>
+        </w:rPr>
+        <w:t xml:space="preserve">, </w:t>
+      </w:r>
+      <w:r>
+        <w:rPr>
+          <w:rFonts w:ascii="Arial" w:eastAsia="Times New Roman" w:hAnsi="Arial" w:cs="Arial"/>
+          <w:i/>
+          <w:iCs/>
+          <w:kern w:val="0"/>
+          <w14:ligatures w14:val="none"/>
+        </w:rPr>
+        <w:t>admission_id</w:t>
+      </w:r>
+      <w:r>
+        <w:rPr>
+          <w:rFonts w:ascii="Arial" w:eastAsia="Times New Roman" w:hAnsi="Arial" w:cs="Arial"/>
+          <w:kern w:val="0"/>
+          <w14:ligatures w14:val="none"/>
+        </w:rPr>
+        <w:t xml:space="preserve">, </w:t>
+      </w:r>
+      <w:r>
+        <w:rPr>
+          <w:rFonts w:ascii="Arial" w:eastAsia="Times New Roman" w:hAnsi="Arial" w:cs="Arial"/>
+          <w:i/>
+          <w:iCs/>
+          <w:kern w:val="0"/>
+          <w14:ligatures w14:val="none"/>
+        </w:rPr>
+        <w:t>ordering_phys_id</w:t>
+      </w:r>
+      <w:r>
+        <w:rPr>
+          <w:rFonts w:ascii="Arial" w:eastAsia="Times New Roman" w:hAnsi="Arial" w:cs="Arial"/>
+          <w:kern w:val="0"/>
+          <w14:ligatures w14:val="none"/>
+        </w:rPr>
+        <w:t>, order_date_time, order_type, order_status)</w:t>
+      </w:r>
+    </w:p>
+    <w:p>
+      <w:pPr>
+        <w:numPr>
+          <w:ilvl w:val="1"/>
+          <w:numId w:val="17"/>
+        </w:numPr>
+        <w:spacing w:after="0" w:line="240" w:lineRule="auto"/>
+        <w:rPr>
+          <w:rFonts w:ascii="Arial" w:eastAsia="Times New Roman" w:hAnsi="Arial" w:cs="Arial"/>
+          <w:kern w:val="0"/>
+          <w14:ligatures w14:val="none"/>
+        </w:rPr>
+      </w:pPr>
+      <w:r>
+        <w:rPr>
+          <w:rFonts w:ascii="Arial" w:eastAsia="Times New Roman" w:hAnsi="Arial" w:cs="Arial"/>
+          <w:i/>
+          <w:iCs/>
+          <w:kern w:val="0"/>
+          <w14:ligatures w14:val="none"/>
+        </w:rPr>
+        <w:t>Foreign Keys:</w:t>
+      </w:r>
+      <w:r>
+        <w:rPr>
+          <w:rFonts w:ascii="Arial" w:eastAsia="Times New Roman" w:hAnsi="Arial" w:cs="Arial"/>
+          <w:kern w:val="0"/>
+          <w14:ligatures w14:val="none"/>
+        </w:rPr>
+        <w:t xml:space="preserve"> </w:t>
+      </w:r>
+      <w:r>
+        <w:rPr>
+          <w:rFonts w:ascii="Courier New" w:eastAsia="Times New Roman" w:hAnsi="Courier New" w:cs="Courier New"/>
+          <w:kern w:val="0"/>
+          <w:sz w:val="21"/>
+          <w:szCs w:val="21"/>
+          <w14:ligatures w14:val="none"/>
+        </w:rPr>
+        <w:t>admission_id</w:t>
+      </w:r>
+      <w:r>
+        <w:rPr>
+          <w:rFonts w:ascii="Arial" w:eastAsia="Times New Roman" w:hAnsi="Arial" w:cs="Arial"/>
+          <w:kern w:val="0"/>
+          <w14:ligatures w14:val="none"/>
+        </w:rPr>
+        <w:t xml:space="preserve"> references </w:t>
+      </w:r>
+      <w:r>
+        <w:rPr>
+          <w:rFonts w:ascii="Courier New" w:eastAsia="Times New Roman" w:hAnsi="Courier New" w:cs="Courier New"/>
+          <w:kern w:val="0"/>
+          <w:sz w:val="21"/>
+          <w:szCs w:val="21"/>
+          <w14:ligatures w14:val="none"/>
+        </w:rPr>
+        <w:t>admission(admission_id)</w:t>
+      </w:r>
+      <w:r>
+        <w:rPr>
+          <w:rFonts w:ascii="Arial" w:eastAsia="Times New Roman" w:hAnsi="Arial" w:cs="Arial"/>
+          <w:kern w:val="0"/>
+          <w14:ligatures w14:val="none"/>
+        </w:rPr>
+        <w:t xml:space="preserve">, </w:t>
+      </w:r>
+      <w:r>
+        <w:rPr>
+          <w:rFonts w:ascii="Courier New" w:eastAsia="Times New Roman" w:hAnsi="Courier New" w:cs="Courier New"/>
+          <w:kern w:val="0"/>
+          <w:sz w:val="21"/>
+          <w:szCs w:val="21"/>
+          <w14:ligatures w14:val="none"/>
+        </w:rPr>
+        <w:t>ordering_phys_id</w:t>
+      </w:r>
+      <w:r>
+        <w:rPr>
+          <w:rFonts w:ascii="Arial" w:eastAsia="Times New Roman" w:hAnsi="Arial" w:cs="Arial"/>
+          <w:kern w:val="0"/>
+          <w14:ligatures w14:val="none"/>
+        </w:rPr>
+        <w:t xml:space="preserve"> references </w:t>
+      </w:r>
+      <w:r>
+        <w:rPr>
+          <w:rFonts w:ascii="Courier New" w:eastAsia="Times New Roman" w:hAnsi="Courier New" w:cs="Courier New"/>
+          <w:kern w:val="0"/>
+          <w:sz w:val="21"/>
+          <w:szCs w:val="21"/>
+          <w14:ligatures w14:val="none"/>
+        </w:rPr>
+        <w:t>physician(physician_id)</w:t>
+      </w:r>
+    </w:p>
+    <w:p>
+      <w:pPr>
+        <w:numPr>
+          <w:ilvl w:val="0"/>
+          <w:numId w:val="17"/>
+        </w:numPr>
+        <w:spacing w:after="0" w:line="240" w:lineRule="auto"/>
+        <w:rPr>
+          <w:rFonts w:ascii="Arial" w:eastAsia="Times New Roman" w:hAnsi="Arial" w:cs="Arial"/>
+          <w:kern w:val="0"/>
+          <w14:ligatures w14:val="none"/>
+        </w:rPr>
+      </w:pPr>
+      <w:r>
+        <w:rPr>
+          <w:rFonts w:ascii="Arial" w:eastAsia="Times New Roman" w:hAnsi="Arial" w:cs="Arial"/>
+          <w:b/>
+          <w:bCs/>
+          <w:kern w:val="0"/>
+          <w14:ligatures w14:val="none"/>
+        </w:rPr>
+        <w:t>radiology_examination</w:t>
+      </w:r>
+      <w:r>
+        <w:rPr>
+          <w:rFonts w:ascii="Arial" w:eastAsia="Times New Roman" w:hAnsi="Arial" w:cs="Arial"/>
+          <w:kern w:val="0"/>
+          <w14:ligatures w14:val="none"/>
+        </w:rPr>
+        <w:t xml:space="preserve"> (</w:t>
+      </w:r>
+      <w:r>
+        <w:rPr>
+          <w:rFonts w:ascii="Arial" w:eastAsia="Times New Roman" w:hAnsi="Arial" w:cs="Arial"/>
+          <w:b/>
+          <w:bCs/>
+          <w:kern w:val="0"/>
+          <w14:ligatures w14:val="none"/>
+        </w:rPr>
+        <w:t>examination_id</w:t>
+      </w:r>
+      <w:r>
+        <w:rPr>
+          <w:rFonts w:ascii="Arial" w:eastAsia="Times New Roman" w:hAnsi="Arial" w:cs="Arial"/>
+          <w:kern w:val="0"/>
+          <w14:ligatures w14:val="none"/>
+        </w:rPr>
+        <w:t xml:space="preserve">, </w:t>
+      </w:r>
+      <w:r>
+        <w:rPr>
+          <w:rFonts w:ascii="Arial" w:eastAsia="Times New Roman" w:hAnsi="Arial" w:cs="Arial"/>
+          <w:i/>
+          <w:iCs/>
+          <w:kern w:val="0"/>
+          <w14:ligatures w14:val="none"/>
+        </w:rPr>
+        <w:t>order_id</w:t>
+      </w:r>
+      <w:r>
+        <w:rPr>
+          <w:rFonts w:ascii="Arial" w:eastAsia="Times New Roman" w:hAnsi="Arial" w:cs="Arial"/>
+          <w:kern w:val="0"/>
+          <w14:ligatures w14:val="none"/>
+        </w:rPr>
+        <w:t xml:space="preserve">, exam_date_time, modality, technician_id, </w:t>
+      </w:r>
+      <w:r>
+        <w:rPr>
+          <w:rFonts w:ascii="Arial" w:eastAsia="Times New Roman" w:hAnsi="Arial" w:cs="Arial"/>
+          <w:i/>
+          <w:iCs/>
+          <w:kern w:val="0"/>
+          <w14:ligatures w14:val="none"/>
+        </w:rPr>
+        <w:t>radiologist_id</w:t>
+      </w:r>
+      <w:r>
+        <w:rPr>
+          <w:rFonts w:ascii="Arial" w:eastAsia="Times New Roman" w:hAnsi="Arial" w:cs="Arial"/>
+          <w:kern w:val="0"/>
+          <w14:ligatures w14:val="none"/>
+        </w:rPr>
+        <w:t>)</w:t>
+      </w:r>
+    </w:p>
+    <w:p>
+      <w:pPr>
+        <w:numPr>
+          <w:ilvl w:val="1"/>
+          <w:numId w:val="17"/>
+        </w:numPr>
+        <w:spacing w:after="0" w:line="240" w:lineRule="auto"/>
+        <w:rPr>
+          <w:rFonts w:ascii="Arial" w:eastAsia="Times New Roman" w:hAnsi="Arial" w:cs="Arial"/>
+          <w:kern w:val="0"/>
+          <w14:ligatures w14:val="none"/>
+        </w:rPr>
+      </w:pPr>
+      <w:r>
+        <w:rPr>
+          <w:rFonts w:ascii="Arial" w:eastAsia="Times New Roman" w:hAnsi="Arial" w:cs="Arial"/>
+          <w:i/>
+          <w:iCs/>
+          <w:kern w:val="0"/>
+          <w14:ligatures w14:val="none"/>
+        </w:rPr>
+        <w:t>Foreign Keys:</w:t>
+      </w:r>
+      <w:r>
+        <w:rPr>
+          <w:rFonts w:ascii="Arial" w:eastAsia="Times New Roman" w:hAnsi="Arial" w:cs="Arial"/>
+          <w:kern w:val="0"/>
+          <w14:ligatures w14:val="none"/>
+        </w:rPr>
+        <w:t xml:space="preserve"> </w:t>
+      </w:r>
+      <w:r>
+        <w:rPr>
+          <w:rFonts w:ascii="Courier New" w:eastAsia="Times New Roman" w:hAnsi="Courier New" w:cs="Courier New"/>
+          <w:kern w:val="0"/>
+          <w:sz w:val="21"/>
+          <w:szCs w:val="21"/>
+          <w14:ligatures w14:val="none"/>
+        </w:rPr>
+        <w:t>order_id</w:t>
+      </w:r>
+      <w:r>
+        <w:rPr>
+          <w:rFonts w:ascii="Arial" w:eastAsia="Times New Roman" w:hAnsi="Arial" w:cs="Arial"/>
+          <w:kern w:val="0"/>
+          <w14:ligatures w14:val="none"/>
+        </w:rPr>
+        <w:t xml:space="preserve"> references </w:t>
+      </w:r>
+      <w:r>
+        <w:rPr>
+          <w:rFonts w:ascii="Courier New" w:eastAsia="Times New Roman" w:hAnsi="Courier New" w:cs="Courier New"/>
+          <w:kern w:val="0"/>
+          <w:sz w:val="21"/>
+          <w:szCs w:val="21"/>
+          <w14:ligatures w14:val="none"/>
+        </w:rPr>
+        <w:t>diagnostic_order(order_id)</w:t>
+      </w:r>
+      <w:r>
+        <w:rPr>
+          <w:rFonts w:ascii="Arial" w:eastAsia="Times New Roman" w:hAnsi="Arial" w:cs="Arial"/>
+          <w:kern w:val="0"/>
+          <w14:ligatures w14:val="none"/>
+        </w:rPr>
+        <w:t xml:space="preserve">, </w:t>
+      </w:r>
+      <w:r>
+        <w:rPr>
+          <w:rFonts w:ascii="Courier New" w:eastAsia="Times New Roman" w:hAnsi="Courier New" w:cs="Courier New"/>
+          <w:kern w:val="0"/>
+          <w:sz w:val="21"/>
+          <w:szCs w:val="21"/>
+          <w14:ligatures w14:val="none"/>
+        </w:rPr>
+        <w:t>radiologist_id</w:t>
+      </w:r>
+      <w:r>
+        <w:rPr>
+          <w:rFonts w:ascii="Arial" w:eastAsia="Times New Roman" w:hAnsi="Arial" w:cs="Arial"/>
+          <w:kern w:val="0"/>
+          <w14:ligatures w14:val="none"/>
+        </w:rPr>
+        <w:t xml:space="preserve"> references </w:t>
+      </w:r>
+      <w:r>
+        <w:rPr>
+          <w:rFonts w:ascii="Courier New" w:eastAsia="Times New Roman" w:hAnsi="Courier New" w:cs="Courier New"/>
+          <w:kern w:val="0"/>
+          <w:sz w:val="21"/>
+          <w:szCs w:val="21"/>
+          <w14:ligatures w14:val="none"/>
+        </w:rPr>
+        <w:t>physician(physician_id)</w:t>
+      </w:r>
+    </w:p>
+    <w:p>
+      <w:pPr>
+        <w:rPr>
+          <w:rFonts w:ascii="Arial" w:eastAsia="Times New Roman" w:hAnsi="Arial" w:cs="Arial"/>
+          <w:b/>
+          <w:bCs/>
+          <w:kern w:val="0"/>
+          <w14:ligatures w14:val="none"/>
+        </w:rPr>
+      </w:pPr>
+      <w:r>
+        <w:rPr>
+          <w:rFonts w:ascii="Arial" w:eastAsia="Times New Roman" w:hAnsi="Arial" w:cs="Arial"/>
+          <w:b/>
+          <w:bCs/>
+          <w:kern w:val="0"/>
+          <w14:ligatures w14:val="none"/>
+        </w:rPr>
+        <w:br w:type="page"/>
+      </w:r>
+    </w:p>
+    <w:p>
+      <w:pPr>
+        <w:numPr>
+          <w:ilvl w:val="0"/>
+          <w:numId w:val="17"/>
+        </w:numPr>
+        <w:spacing w:after="0" w:line="240" w:lineRule="auto"/>
+        <w:rPr>
+          <w:rFonts w:ascii="Arial" w:eastAsia="Times New Roman" w:hAnsi="Arial" w:cs="Arial"/>
+          <w:kern w:val="0"/>
+          <w14:ligatures w14:val="none"/>
+        </w:rPr>
+      </w:pPr>
+      <w:r>
+        <w:rPr>
+          <w:rFonts w:ascii="Arial" w:eastAsia="Times New Roman" w:hAnsi="Arial" w:cs="Arial"/>
+          <w:b/>
+          <w:bCs/>
+          <w:kern w:val="0"/>
+          <w14:ligatures w14:val="none"/>
+        </w:rPr>
+        <w:lastRenderedPageBreak/>
+        <w:t>surgical_procedure</w:t>
+      </w:r>
+      <w:r>
+        <w:rPr>
+          <w:rFonts w:ascii="Arial" w:eastAsia="Times New Roman" w:hAnsi="Arial" w:cs="Arial"/>
+          <w:kern w:val="0"/>
+          <w14:ligatures w14:val="none"/>
+        </w:rPr>
+        <w:t xml:space="preserve"> (</w:t>
+      </w:r>
+      <w:r>
+        <w:rPr>
+          <w:rFonts w:ascii="Arial" w:eastAsia="Times New Roman" w:hAnsi="Arial" w:cs="Arial"/>
+          <w:b/>
+          <w:bCs/>
+          <w:kern w:val="0"/>
+          <w14:ligatures w14:val="none"/>
+        </w:rPr>
+        <w:t>procedure_id</w:t>
+      </w:r>
+      <w:r>
+        <w:rPr>
+          <w:rFonts w:ascii="Arial" w:eastAsia="Times New Roman" w:hAnsi="Arial" w:cs="Arial"/>
+          <w:kern w:val="0"/>
+          <w14:ligatures w14:val="none"/>
+        </w:rPr>
+        <w:t xml:space="preserve">, </w:t>
+      </w:r>
+      <w:r>
+        <w:rPr>
+          <w:rFonts w:ascii="Arial" w:eastAsia="Times New Roman" w:hAnsi="Arial" w:cs="Arial"/>
+          <w:i/>
+          <w:iCs/>
+          <w:kern w:val="0"/>
+          <w14:ligatures w14:val="none"/>
+        </w:rPr>
+        <w:t>admission_id</w:t>
+      </w:r>
+      <w:r>
+        <w:rPr>
+          <w:rFonts w:ascii="Arial" w:eastAsia="Times New Roman" w:hAnsi="Arial" w:cs="Arial"/>
+          <w:kern w:val="0"/>
+          <w14:ligatures w14:val="none"/>
+        </w:rPr>
+        <w:t xml:space="preserve">, </w:t>
+      </w:r>
+      <w:r>
+        <w:rPr>
+          <w:rFonts w:ascii="Arial" w:eastAsia="Times New Roman" w:hAnsi="Arial" w:cs="Arial"/>
+          <w:i/>
+          <w:iCs/>
+          <w:kern w:val="0"/>
+          <w14:ligatures w14:val="none"/>
+        </w:rPr>
+        <w:t>surgeon_id</w:t>
+      </w:r>
+      <w:r>
+        <w:rPr>
+          <w:rFonts w:ascii="Arial" w:eastAsia="Times New Roman" w:hAnsi="Arial" w:cs="Arial"/>
+          <w:kern w:val="0"/>
+          <w14:ligatures w14:val="none"/>
+        </w:rPr>
+        <w:t xml:space="preserve">, </w:t>
+      </w:r>
+      <w:r>
+        <w:rPr>
+          <w:rFonts w:ascii="Arial" w:eastAsia="Times New Roman" w:hAnsi="Arial" w:cs="Arial"/>
+          <w:i/>
+          <w:iCs/>
+          <w:kern w:val="0"/>
+          <w14:ligatures w14:val="none"/>
+        </w:rPr>
+        <w:t>icd9_proc_code</w:t>
+      </w:r>
+      <w:r>
+        <w:rPr>
+          <w:rFonts w:ascii="Arial" w:eastAsia="Times New Roman" w:hAnsi="Arial" w:cs="Arial"/>
+          <w:kern w:val="0"/>
+          <w14:ligatures w14:val="none"/>
+        </w:rPr>
+        <w:t xml:space="preserve">, procedure_date_time, </w:t>
+      </w:r>
+      <w:r>
+        <w:rPr>
+          <w:rFonts w:ascii="Arial" w:eastAsia="Times New Roman" w:hAnsi="Arial" w:cs="Arial"/>
+          <w:kern w:val="0"/>
+          <w14:ligatures w14:val="none"/>
+        </w:rPr>
+        <w:t>phone</w:t>
+      </w:r>
+      <w:r>
+        <w:rPr>
+          <w:rFonts w:ascii="Arial" w:eastAsia="Times New Roman" w:hAnsi="Arial" w:cs="Arial"/>
+          <w:kern w:val="0"/>
+          <w14:ligatures w14:val="none"/>
+        </w:rPr>
+        <w:t>_number)</w:t>
+      </w:r>
+    </w:p>
+    <w:p>
+      <w:pPr>
+        <w:numPr>
+          <w:ilvl w:val="1"/>
+          <w:numId w:val="17"/>
+        </w:numPr>
+        <w:spacing w:after="0" w:line="240" w:lineRule="auto"/>
+        <w:rPr>
+          <w:rFonts w:ascii="Arial" w:eastAsia="Times New Roman" w:hAnsi="Arial" w:cs="Arial"/>
+          <w:kern w:val="0"/>
+          <w14:ligatures w14:val="none"/>
+        </w:rPr>
+      </w:pPr>
+      <w:r>
+        <w:rPr>
+          <w:rFonts w:ascii="Arial" w:eastAsia="Times New Roman" w:hAnsi="Arial" w:cs="Arial"/>
+          <w:i/>
+          <w:iCs/>
+          <w:kern w:val="0"/>
+          <w14:ligatures w14:val="none"/>
+        </w:rPr>
+        <w:t>Foreign Keys:</w:t>
+      </w:r>
+      <w:r>
+        <w:rPr>
+          <w:rFonts w:ascii="Arial" w:eastAsia="Times New Roman" w:hAnsi="Arial" w:cs="Arial"/>
+          <w:kern w:val="0"/>
+          <w14:ligatures w14:val="none"/>
+        </w:rPr>
+        <w:t xml:space="preserve"> </w:t>
+      </w:r>
+      <w:r>
+        <w:rPr>
+          <w:rFonts w:ascii="Courier New" w:eastAsia="Times New Roman" w:hAnsi="Courier New" w:cs="Courier New"/>
+          <w:kern w:val="0"/>
+          <w:sz w:val="21"/>
+          <w:szCs w:val="21"/>
+          <w14:ligatures w14:val="none"/>
+        </w:rPr>
+        <w:t>admission_id</w:t>
+      </w:r>
+      <w:r>
+        <w:rPr>
+          <w:rFonts w:ascii="Arial" w:eastAsia="Times New Roman" w:hAnsi="Arial" w:cs="Arial"/>
+          <w:kern w:val="0"/>
+          <w14:ligatures w14:val="none"/>
+        </w:rPr>
+        <w:t xml:space="preserve"> references </w:t>
+      </w:r>
+      <w:r>
+        <w:rPr>
+          <w:rFonts w:ascii="Courier New" w:eastAsia="Times New Roman" w:hAnsi="Courier New" w:cs="Courier New"/>
+          <w:kern w:val="0"/>
+          <w:sz w:val="21"/>
+          <w:szCs w:val="21"/>
+          <w14:ligatures w14:val="none"/>
+        </w:rPr>
+        <w:t>admission(admission_id)</w:t>
+      </w:r>
+      <w:r>
+        <w:rPr>
+          <w:rFonts w:ascii="Arial" w:eastAsia="Times New Roman" w:hAnsi="Arial" w:cs="Arial"/>
+          <w:kern w:val="0"/>
+          <w14:ligatures w14:val="none"/>
+        </w:rPr>
+        <w:t xml:space="preserve">, </w:t>
+      </w:r>
+      <w:r>
+        <w:rPr>
+          <w:rFonts w:ascii="Courier New" w:eastAsia="Times New Roman" w:hAnsi="Courier New" w:cs="Courier New"/>
+          <w:kern w:val="0"/>
+          <w:sz w:val="21"/>
+          <w:szCs w:val="21"/>
+          <w14:ligatures w14:val="none"/>
+        </w:rPr>
+        <w:t>surgeon_id</w:t>
+      </w:r>
+      <w:r>
+        <w:rPr>
+          <w:rFonts w:ascii="Arial" w:eastAsia="Times New Roman" w:hAnsi="Arial" w:cs="Arial"/>
+          <w:kern w:val="0"/>
+          <w14:ligatures w14:val="none"/>
+        </w:rPr>
+        <w:t xml:space="preserve"> references </w:t>
+      </w:r>
+      <w:r>
+        <w:rPr>
+          <w:rFonts w:ascii="Courier New" w:eastAsia="Times New Roman" w:hAnsi="Courier New" w:cs="Courier New"/>
+          <w:kern w:val="0"/>
+          <w:sz w:val="21"/>
+          <w:szCs w:val="21"/>
+          <w14:ligatures w14:val="none"/>
+        </w:rPr>
+        <w:t>physician(physician_id)</w:t>
+      </w:r>
+    </w:p>
+    <w:p>
+      <w:pPr>
+        <w:numPr>
+          <w:ilvl w:val="0"/>
+          <w:numId w:val="17"/>
+        </w:numPr>
+        <w:spacing w:after="0" w:line="240" w:lineRule="auto"/>
+        <w:rPr>
+          <w:rFonts w:ascii="Arial" w:eastAsia="Times New Roman" w:hAnsi="Arial" w:cs="Arial"/>
+          <w:kern w:val="0"/>
+          <w14:ligatures w14:val="none"/>
+        </w:rPr>
+      </w:pPr>
+      <w:r>
+        <w:rPr>
+          <w:rFonts w:ascii="Arial" w:eastAsia="Times New Roman" w:hAnsi="Arial" w:cs="Arial"/>
+          <w:b/>
+          <w:bCs/>
+          <w:kern w:val="0"/>
+          <w14:ligatures w14:val="none"/>
+        </w:rPr>
+        <w:t>discharge_record</w:t>
+      </w:r>
+      <w:r>
+        <w:rPr>
+          <w:rFonts w:ascii="Arial" w:eastAsia="Times New Roman" w:hAnsi="Arial" w:cs="Arial"/>
+          <w:kern w:val="0"/>
+          <w14:ligatures w14:val="none"/>
+        </w:rPr>
+        <w:t xml:space="preserve"> (</w:t>
+      </w:r>
+      <w:r>
+        <w:rPr>
+          <w:rFonts w:ascii="Arial" w:eastAsia="Times New Roman" w:hAnsi="Arial" w:cs="Arial"/>
+          <w:b/>
+          <w:bCs/>
+          <w:kern w:val="0"/>
+          <w14:ligatures w14:val="none"/>
+        </w:rPr>
+        <w:t>discharge_id</w:t>
+      </w:r>
+      <w:r>
+        <w:rPr>
+          <w:rFonts w:ascii="Arial" w:eastAsia="Times New Roman" w:hAnsi="Arial" w:cs="Arial"/>
+          <w:kern w:val="0"/>
+          <w14:ligatures w14:val="none"/>
+        </w:rPr>
+        <w:t xml:space="preserve">, </w:t>
+      </w:r>
+      <w:r>
+        <w:rPr>
+          <w:rFonts w:ascii="Arial" w:eastAsia="Times New Roman" w:hAnsi="Arial" w:cs="Arial"/>
+          <w:i/>
+          <w:iCs/>
+          <w:kern w:val="0"/>
+          <w14:ligatures w14:val="none"/>
+        </w:rPr>
+        <w:t>admission_id</w:t>
+      </w:r>
+      <w:r>
+        <w:rPr>
+          <w:rFonts w:ascii="Arial" w:eastAsia="Times New Roman" w:hAnsi="Arial" w:cs="Arial"/>
+          <w:kern w:val="0"/>
+          <w14:ligatures w14:val="none"/>
+        </w:rPr>
+        <w:t xml:space="preserve">, discharge_date_time, discharge_dest, condition_discharge, discharge_status, followup_instructions, </w:t>
+      </w:r>
+      <w:r>
+        <w:rPr>
+          <w:rFonts w:ascii="Arial" w:eastAsia="Times New Roman" w:hAnsi="Arial" w:cs="Arial"/>
+          <w:i/>
+          <w:iCs/>
+          <w:kern w:val="0"/>
+          <w14:ligatures w14:val="none"/>
+        </w:rPr>
+        <w:t>responsible_phys</w:t>
+      </w:r>
+      <w:r>
+        <w:rPr>
+          <w:rFonts w:ascii="Arial" w:eastAsia="Times New Roman" w:hAnsi="Arial" w:cs="Arial"/>
+          <w:kern w:val="0"/>
+          <w14:ligatures w14:val="none"/>
+        </w:rPr>
+        <w:t>)</w:t>
+      </w:r>
+    </w:p>
+    <w:p>
+      <w:pPr>
+        <w:numPr>
+          <w:ilvl w:val="1"/>
+          <w:numId w:val="17"/>
+        </w:numPr>
+        <w:spacing w:after="0" w:line="240" w:lineRule="auto"/>
+        <w:rPr>
+          <w:rFonts w:ascii="Arial" w:eastAsia="Times New Roman" w:hAnsi="Arial" w:cs="Arial"/>
+          <w:kern w:val="0"/>
+          <w14:ligatures w14:val="none"/>
+        </w:rPr>
+      </w:pPr>
+      <w:r>
+        <w:rPr>
+          <w:rFonts w:ascii="Arial" w:eastAsia="Times New Roman" w:hAnsi="Arial" w:cs="Arial"/>
+          <w:i/>
+          <w:iCs/>
+          <w:kern w:val="0"/>
+          <w14:ligatures w14:val="none"/>
+        </w:rPr>
+        <w:t>Foreign Keys:</w:t>
+      </w:r>
+      <w:r>
+        <w:rPr>
+          <w:rFonts w:ascii="Arial" w:eastAsia="Times New Roman" w:hAnsi="Arial" w:cs="Arial"/>
+          <w:kern w:val="0"/>
+          <w14:ligatures w14:val="none"/>
+        </w:rPr>
+        <w:t xml:space="preserve"> </w:t>
+      </w:r>
+      <w:r>
+        <w:rPr>
+          <w:rFonts w:ascii="Courier New" w:eastAsia="Times New Roman" w:hAnsi="Courier New" w:cs="Courier New"/>
+          <w:kern w:val="0"/>
+          <w:sz w:val="21"/>
+          <w:szCs w:val="21"/>
+          <w14:ligatures w14:val="none"/>
+        </w:rPr>
+        <w:t>admission_id</w:t>
+      </w:r>
+      <w:r>
+        <w:rPr>
+          <w:rFonts w:ascii="Arial" w:eastAsia="Times New Roman" w:hAnsi="Arial" w:cs="Arial"/>
+          <w:kern w:val="0"/>
+          <w14:ligatures w14:val="none"/>
+        </w:rPr>
+        <w:t xml:space="preserve"> references </w:t>
+      </w:r>
+      <w:r>
+        <w:rPr>
+          <w:rFonts w:ascii="Courier New" w:eastAsia="Times New Roman" w:hAnsi="Courier New" w:cs="Courier New"/>
+          <w:kern w:val="0"/>
+          <w:sz w:val="21"/>
+          <w:szCs w:val="21"/>
+          <w14:ligatures w14:val="none"/>
+        </w:rPr>
+        <w:t>admission(admission_id)</w:t>
+      </w:r>
+      <w:r>
+        <w:rPr>
+          <w:rFonts w:ascii="Arial" w:eastAsia="Times New Roman" w:hAnsi="Arial" w:cs="Arial"/>
+          <w:kern w:val="0"/>
+          <w14:ligatures w14:val="none"/>
+        </w:rPr>
+        <w:t xml:space="preserve">, </w:t>
+      </w:r>
+      <w:r>
+        <w:rPr>
+          <w:rFonts w:ascii="Courier New" w:eastAsia="Times New Roman" w:hAnsi="Courier New" w:cs="Courier New"/>
+          <w:kern w:val="0"/>
+          <w:sz w:val="21"/>
+          <w:szCs w:val="21"/>
+          <w14:ligatures w14:val="none"/>
+        </w:rPr>
+        <w:t>responsible_phys</w:t>
+      </w:r>
+      <w:r>
+        <w:rPr>
+          <w:rFonts w:ascii="Arial" w:eastAsia="Times New Roman" w:hAnsi="Arial" w:cs="Arial"/>
+          <w:kern w:val="0"/>
+          <w14:ligatures w14:val="none"/>
+        </w:rPr>
+        <w:t xml:space="preserve"> references </w:t>
+      </w:r>
+      <w:r>
+        <w:rPr>
+          <w:rFonts w:ascii="Courier New" w:eastAsia="Times New Roman" w:hAnsi="Courier New" w:cs="Courier New"/>
+          <w:kern w:val="0"/>
+          <w:sz w:val="21"/>
+          <w:szCs w:val="21"/>
+          <w14:ligatures w14:val="none"/>
+        </w:rPr>
+        <w:t>physician(physician_id)</w:t>
       </w:r>
     </w:p>
     <w:p>
@@ -2111,7 +4162,6 @@
           <w:szCs w:val="40"/>
         </w:rPr>
       </w:pPr>
-      <w:bookmarkStart w:id="5" w:name="_Toc242304776"/>
       <w:r>
         <w:br w:type="page"/>
       </w:r>
@@ -2169,7 +4219,13 @@
         </w:numPr>
       </w:pPr>
       <w:r>
-        <w:t>4 ICD-9 codes, 15 physicians, 10 nurses, and 40 patients.</w:t>
+        <w:t>4 ICD-9 codes, 15 physicians, 10 nurses, and 4</w:t>
+      </w:r>
+      <w:r>
+        <w:t>5</w:t>
+      </w:r>
+      <w:r>
+        <w:t xml:space="preserve"> patients.</w:t>
       </w:r>
     </w:p>
     <w:p>
@@ -2181,19 +4237,37 @@
         </w:numPr>
       </w:pPr>
       <w:r>
-        <w:t xml:space="preserve">50 admissions, 50 triage assessments, </w:t>
+        <w:t>5</w:t>
+      </w:r>
+      <w:r>
+        <w:t>1</w:t>
+      </w:r>
+      <w:r>
+        <w:t xml:space="preserve"> admissions, 50 triage assessments, </w:t>
       </w:r>
       <w:r>
         <w:t>about</w:t>
       </w:r>
       <w:r>
-        <w:t xml:space="preserve"> 75 diagnoses, </w:t>
+        <w:t xml:space="preserve"> </w:t>
+      </w:r>
+      <w:r>
+        <w:t>68</w:t>
+      </w:r>
+      <w:r>
+        <w:t xml:space="preserve"> diagnoses, </w:t>
       </w:r>
       <w:r>
         <w:t>about</w:t>
       </w:r>
       <w:r>
-        <w:t xml:space="preserve"> 25 ICU stays, and 50 clinical notes.</w:t>
+        <w:t xml:space="preserve"> </w:t>
+      </w:r>
+      <w:r>
+        <w:t>15</w:t>
+      </w:r>
+      <w:r>
+        <w:t xml:space="preserve"> ICU stays, and 50 clinical notes.</w:t>
       </w:r>
     </w:p>
     <w:p>
@@ -2205,7 +4279,19 @@
         </w:numPr>
       </w:pPr>
       <w:r>
-        <w:t>About 25 diagnostic orders, radiology examinations, and radiology reports.</w:t>
+        <w:t>About 2</w:t>
+      </w:r>
+      <w:r>
+        <w:t>2</w:t>
+      </w:r>
+      <w:r>
+        <w:t xml:space="preserve"> diagnostic orders, </w:t>
+      </w:r>
+      <w:r>
+        <w:t xml:space="preserve">23 </w:t>
+      </w:r>
+      <w:r>
+        <w:t>radiology examinations, and radiology reports.</w:t>
       </w:r>
     </w:p>
     <w:p>
@@ -2223,7 +4309,13 @@
         <w:t>about</w:t>
       </w:r>
       <w:r>
-        <w:t xml:space="preserve"> 15–20 surgical procedures.</w:t>
+        <w:t xml:space="preserve"> </w:t>
+      </w:r>
+      <w:r>
+        <w:t>18</w:t>
+      </w:r>
+      <w:r>
+        <w:t xml:space="preserve"> surgical procedures.</w:t>
       </w:r>
     </w:p>
     <w:p>
@@ -2306,13 +4398,19 @@
         <w:rPr>
           <w:i/>
         </w:rPr>
-        <w:t>random. seed</w:t>
+        <w:t xml:space="preserve">random. </w:t>
       </w:r>
       <w:r>
         <w:rPr>
           <w:i/>
         </w:rPr>
-        <w:t>(42</w:t>
+        <w:t>seed (</w:t>
+      </w:r>
+      <w:r>
+        <w:rPr>
+          <w:i/>
+        </w:rPr>
+        <w:t>42</w:t>
       </w:r>
       <w:r>
         <w:rPr>
@@ -2323,6 +4421,50 @@
       </w:r>
       <w:r>
         <w:t xml:space="preserve"> produces the same dataset on every run.</w:t>
+      </w:r>
+    </w:p>
+    <w:p>
+      <w:r>
+        <w:drawing>
+          <wp:inline distT="0" distB="0" distL="0" distR="0" wp14:anchorId="2B08CAA2" wp14:editId="243D712C">
+            <wp:extent cx="5943600" cy="2395220"/>
+            <wp:effectExtent l="19050" t="19050" r="19050" b="24130"/>
+            <wp:docPr id="620509146" name="Picture 1"/>
+            <wp:cNvGraphicFramePr>
+              <a:graphicFrameLocks xmlns:a="http://schemas.openxmlformats.org/drawingml/2006/main" noChangeAspect="1"/>
+            </wp:cNvGraphicFramePr>
+            <a:graphic xmlns:a="http://schemas.openxmlformats.org/drawingml/2006/main">
+              <a:graphicData uri="http://schemas.openxmlformats.org/drawingml/2006/picture">
+                <pic:pic xmlns:pic="http://schemas.openxmlformats.org/drawingml/2006/picture">
+                  <pic:nvPicPr>
+                    <pic:cNvPr id="620509146" name=""/>
+                    <pic:cNvPicPr/>
+                  </pic:nvPicPr>
+                  <pic:blipFill>
+                    <a:blip r:embed="rId12"/>
+                    <a:stretch>
+                      <a:fillRect/>
+                    </a:stretch>
+                  </pic:blipFill>
+                  <pic:spPr>
+                    <a:xfrm>
+                      <a:off x="0" y="0"/>
+                      <a:ext cx="5943600" cy="2395220"/>
+                    </a:xfrm>
+                    <a:prstGeom prst="rect">
+                      <a:avLst/>
+                    </a:prstGeom>
+                    <a:ln>
+                      <a:solidFill>
+                        <a:schemeClr val="tx1"/>
+                      </a:solidFill>
+                    </a:ln>
+                  </pic:spPr>
+                </pic:pic>
+              </a:graphicData>
+            </a:graphic>
+          </wp:inline>
+        </w:drawing>
       </w:r>
     </w:p>
     <w:p>
@@ -2542,6 +4684,68 @@
       </w:r>
     </w:p>
     <w:p>
+      <w:r>
+        <w:t xml:space="preserve">See </w:t>
+      </w:r>
+      <w:r>
+        <w:rPr>
+          <w:color w:val="196B24" w:themeColor="accent3"/>
+        </w:rPr>
+        <w:fldChar w:fldCharType="begin"/>
+      </w:r>
+      <w:r>
+        <w:rPr>
+          <w:color w:val="196B24" w:themeColor="accent3"/>
+        </w:rPr>
+        <w:instrText xml:space="preserve"> REF _Ref242697564 \h </w:instrText>
+      </w:r>
+      <w:r>
+        <w:rPr>
+          <w:color w:val="196B24" w:themeColor="accent3"/>
+        </w:rPr>
+      </w:r>
+      <w:r>
+        <w:rPr>
+          <w:color w:val="196B24" w:themeColor="accent3"/>
+        </w:rPr>
+        <w:fldChar w:fldCharType="separate"/>
+      </w:r>
+      <w:r>
+        <w:rPr>
+          <w:color w:val="196B24" w:themeColor="accent3"/>
+        </w:rPr>
+        <w:t>Appen</w:t>
+      </w:r>
+      <w:r>
+        <w:rPr>
+          <w:color w:val="196B24" w:themeColor="accent3"/>
+        </w:rPr>
+        <w:t>d</w:t>
+      </w:r>
+      <w:r>
+        <w:rPr>
+          <w:color w:val="196B24" w:themeColor="accent3"/>
+        </w:rPr>
+        <w:t xml:space="preserve">ix A </w:t>
+      </w:r>
+      <w:r>
+        <w:rPr>
+          <w:noProof/>
+          <w:color w:val="196B24" w:themeColor="accent3"/>
+        </w:rPr>
+        <w:t>1</w:t>
+      </w:r>
+      <w:r>
+        <w:rPr>
+          <w:color w:val="196B24" w:themeColor="accent3"/>
+        </w:rPr>
+        <w:fldChar w:fldCharType="end"/>
+      </w:r>
+      <w:r>
+        <w:t>for a list of Queries</w:t>
+      </w:r>
+    </w:p>
+    <w:p>
       <w:pPr>
         <w:rPr>
           <w:rFonts w:asciiTheme="majorHAnsi" w:eastAsiaTheme="majorEastAsia" w:hAnsiTheme="majorHAnsi" w:cstheme="majorBidi"/>
@@ -2705,10 +4909,13 @@
     </w:p>
     <w:p>
       <w:r>
-        <w:t>| ER diagram (</w:t>
-      </w:r>
-      <w:r>
-        <w:t>.drawio</w:t>
+        <w:t xml:space="preserve">| ER diagram </w:t>
+      </w:r>
+      <w:r>
+        <w:t>(</w:t>
+      </w:r>
+      <w:r>
+        <w:t>. drawio</w:t>
       </w:r>
       <w:r>
         <w:t xml:space="preserve"> / </w:t>
@@ -2939,11 +5146,29 @@
       </w:r>
       <w:bookmarkEnd w:id="10"/>
     </w:p>
-    <w:p/>
+    <w:p>
+      <w:pPr>
+        <w:pStyle w:val="Caption"/>
+      </w:pPr>
+      <w:bookmarkStart w:id="11" w:name="_Ref242697564"/>
+      <w:r>
+        <w:t xml:space="preserve">Appendix A </w:t>
+      </w:r>
+      <w:fldSimple w:instr=" SEQ Appendix_A \* ARABIC ">
+        <w:r>
+          <w:rPr>
+            <w:noProof/>
+          </w:rPr>
+          <w:t>1</w:t>
+        </w:r>
+      </w:fldSimple>
+      <w:bookmarkEnd w:id="11"/>
+    </w:p>
     <w:p>
       <w:r>
         <w:t xml:space="preserve"> </w:t>
       </w:r>
+      <w:proofErr w:type="gramStart"/>
       <w:r>
         <w:rPr>
           <w:b/>
@@ -2960,6 +5185,7 @@
         </w:rPr>
         <w:t>[</w:t>
       </w:r>
+      <w:proofErr w:type="gramEnd"/>
       <w:r>
         <w:rPr>
           <w:i/>
@@ -3040,6 +5266,7 @@
       </w:r>
     </w:p>
     <w:p>
+      <w:proofErr w:type="gramStart"/>
       <w:r>
         <w:rPr>
           <w:b/>
@@ -3055,7 +5282,15 @@
           <w:i/>
           <w:iCs/>
         </w:rPr>
-        <w:t>[author]</w:t>
+        <w:t>[</w:t>
+      </w:r>
+      <w:proofErr w:type="gramEnd"/>
+      <w:r>
+        <w:rPr>
+          <w:i/>
+          <w:iCs/>
+        </w:rPr>
+        <w:t>author]</w:t>
       </w:r>
     </w:p>
     <w:p>
@@ -3072,6 +5307,12 @@
     <w:p/>
     <w:p>
       <w:r>
+        <w:br w:type="page"/>
+      </w:r>
+    </w:p>
+    <w:p>
+      <w:r>
+        <w:lastRenderedPageBreak/>
         <w:t>Q17</w:t>
       </w:r>
       <w:r>
@@ -3085,14 +5326,180 @@
       </w:r>
     </w:p>
     <w:p>
+      <w:pPr>
+        <w:autoSpaceDE w:val="0"/>
+        <w:autoSpaceDN w:val="0"/>
+        <w:adjustRightInd w:val="0"/>
+        <w:spacing w:after="0" w:line="240" w:lineRule="auto"/>
+        <w:rPr>
+          <w:rFonts w:ascii="LMRoman12-Bold" w:eastAsia="LMRoman12-Bold" w:cs="LMRoman12-Bold"/>
+          <w:b/>
+          <w:bCs/>
+          <w:kern w:val="0"/>
+        </w:rPr>
+      </w:pPr>
+      <w:r>
+        <w:rPr>
+          <w:rFonts w:ascii="LMRoman12-Regular" w:eastAsia="LMRoman12-Regular" w:cs="LMRoman12-Regular"/>
+          <w:kern w:val="0"/>
+        </w:rPr>
+        <w:t xml:space="preserve">Find all admissions during which the patient received </w:t>
+      </w:r>
+      <w:r>
+        <w:rPr>
+          <w:rFonts w:ascii="LMRoman12-Bold" w:eastAsia="LMRoman12-Bold" w:cs="LMRoman12-Bold"/>
+          <w:b/>
+          <w:bCs/>
+          <w:kern w:val="0"/>
+        </w:rPr>
+        <w:t>more than one distinct ICD-</w:t>
+      </w:r>
+    </w:p>
+    <w:p>
+      <w:pPr>
+        <w:autoSpaceDE w:val="0"/>
+        <w:autoSpaceDN w:val="0"/>
+        <w:adjustRightInd w:val="0"/>
+        <w:spacing w:after="0" w:line="240" w:lineRule="auto"/>
+        <w:rPr>
+          <w:rFonts w:ascii="LMRoman12-Regular" w:eastAsia="LMRoman12-Regular" w:cs="LMRoman12-Regular"/>
+          <w:kern w:val="0"/>
+        </w:rPr>
+      </w:pPr>
+      <w:r>
+        <w:rPr>
+          <w:rFonts w:ascii="LMRoman12-Bold" w:eastAsia="LMRoman12-Bold" w:cs="LMRoman12-Bold"/>
+          <w:b/>
+          <w:bCs/>
+          <w:kern w:val="0"/>
+        </w:rPr>
+        <w:t xml:space="preserve">9 </w:t>
+      </w:r>
+      <w:r>
+        <w:rPr>
+          <w:rFonts w:ascii="LMRoman12-Bold" w:eastAsia="LMRoman12-Bold" w:cs="LMRoman12-Bold"/>
+          <w:b/>
+          <w:bCs/>
+          <w:kern w:val="0"/>
+        </w:rPr>
+        <w:t>diagnos</w:t>
+      </w:r>
+      <w:r>
+        <w:rPr>
+          <w:rFonts w:ascii="LMRoman12-Bold" w:eastAsia="LMRoman12-Bold" w:cs="LMRoman12-Bold"/>
+          <w:b/>
+          <w:bCs/>
+          <w:kern w:val="0"/>
+        </w:rPr>
+        <w:t>is</w:t>
+      </w:r>
+      <w:r>
+        <w:rPr>
+          <w:rFonts w:ascii="LMRoman12-Regular" w:eastAsia="LMRoman12-Regular" w:cs="LMRoman12-Regular"/>
+          <w:kern w:val="0"/>
+        </w:rPr>
+        <w:t xml:space="preserve">. Display the </w:t>
+      </w:r>
+      <w:r>
+        <w:rPr>
+          <w:rFonts w:ascii="LMRoman12-Regular" w:eastAsia="LMRoman12-Regular" w:cs="LMRoman12-Regular"/>
+          <w:kern w:val="0"/>
+        </w:rPr>
+        <w:t>patient</w:t>
+      </w:r>
+      <w:r>
+        <w:rPr>
+          <w:rFonts w:ascii="LMRoman12-Regular" w:eastAsia="LMRoman12-Regular" w:cs="LMRoman12-Regular"/>
+          <w:kern w:val="0"/>
+        </w:rPr>
+        <w:t>’</w:t>
+      </w:r>
+      <w:r>
+        <w:rPr>
+          <w:rFonts w:ascii="LMRoman12-Regular" w:eastAsia="LMRoman12-Regular" w:cs="LMRoman12-Regular"/>
+          <w:kern w:val="0"/>
+        </w:rPr>
+        <w:t>s</w:t>
+      </w:r>
+      <w:r>
+        <w:rPr>
+          <w:rFonts w:ascii="LMRoman12-Regular" w:eastAsia="LMRoman12-Regular" w:cs="LMRoman12-Regular"/>
+          <w:kern w:val="0"/>
+        </w:rPr>
+        <w:t xml:space="preserve"> name, admission identifier, and number of distinct</w:t>
+      </w:r>
+    </w:p>
+    <w:p>
+      <w:pPr>
+        <w:rPr>
+          <w:rFonts w:ascii="LMRoman12-Regular" w:eastAsia="LMRoman12-Regular" w:cs="LMRoman12-Regular"/>
+          <w:kern w:val="0"/>
+        </w:rPr>
+      </w:pPr>
+      <w:r>
+        <w:rPr>
+          <w:rFonts w:ascii="LMRoman12-Regular" w:eastAsia="LMRoman12-Regular" w:cs="LMRoman12-Regular"/>
+          <w:kern w:val="0"/>
+        </w:rPr>
+        <w:t>ICD-9 codes.</w:t>
+      </w:r>
+    </w:p>
+    <w:p>
       <w:r>
         <w:rPr>
           <w:noProof/>
         </w:rPr>
         <w:drawing>
-          <wp:inline distT="0" distB="0" distL="0" distR="0" wp14:anchorId="1F7E49F4" wp14:editId="51FC9156">
-            <wp:extent cx="3382332" cy="3480593"/>
-            <wp:effectExtent l="0" t="0" r="8890" b="5715"/>
+          <wp:inline distT="0" distB="0" distL="0" distR="0" wp14:anchorId="1DA224D9" wp14:editId="30F5AD56">
+            <wp:extent cx="5943600" cy="1768475"/>
+            <wp:effectExtent l="19050" t="19050" r="19050" b="22225"/>
+            <wp:docPr id="1095981562" name="Picture 1"/>
+            <wp:cNvGraphicFramePr>
+              <a:graphicFrameLocks xmlns:a="http://schemas.openxmlformats.org/drawingml/2006/main" noChangeAspect="1"/>
+            </wp:cNvGraphicFramePr>
+            <a:graphic xmlns:a="http://schemas.openxmlformats.org/drawingml/2006/main">
+              <a:graphicData uri="http://schemas.openxmlformats.org/drawingml/2006/picture">
+                <pic:pic xmlns:pic="http://schemas.openxmlformats.org/drawingml/2006/picture">
+                  <pic:nvPicPr>
+                    <pic:cNvPr id="1095981562" name=""/>
+                    <pic:cNvPicPr/>
+                  </pic:nvPicPr>
+                  <pic:blipFill>
+                    <a:blip r:embed="rId13"/>
+                    <a:stretch>
+                      <a:fillRect/>
+                    </a:stretch>
+                  </pic:blipFill>
+                  <pic:spPr>
+                    <a:xfrm>
+                      <a:off x="0" y="0"/>
+                      <a:ext cx="5943600" cy="1768475"/>
+                    </a:xfrm>
+                    <a:prstGeom prst="rect">
+                      <a:avLst/>
+                    </a:prstGeom>
+                    <a:ln>
+                      <a:solidFill>
+                        <a:schemeClr val="tx1"/>
+                      </a:solidFill>
+                    </a:ln>
+                  </pic:spPr>
+                </pic:pic>
+              </a:graphicData>
+            </a:graphic>
+          </wp:inline>
+        </w:drawing>
+      </w:r>
+    </w:p>
+    <w:p>
+      <w:r>
+        <w:rPr>
+          <w:noProof/>
+        </w:rPr>
+        <w:drawing>
+          <wp:inline distT="0" distB="0" distL="0" distR="0" wp14:anchorId="1F7E49F4" wp14:editId="01F20836">
+            <wp:extent cx="5915025" cy="3480262"/>
+            <wp:effectExtent l="19050" t="19050" r="9525" b="25400"/>
             <wp:docPr id="2018161121" name="Picture 1"/>
             <wp:cNvGraphicFramePr>
               <a:graphicFrameLocks xmlns:a="http://schemas.openxmlformats.org/drawingml/2006/main" noChangeAspect="1"/>
@@ -3105,7 +5512,7 @@
                     <pic:cNvPicPr/>
                   </pic:nvPicPr>
                   <pic:blipFill rotWithShape="1">
-                    <a:blip r:embed="rId13"/>
+                    <a:blip r:embed="rId14"/>
                     <a:srcRect l="-495" r="5930"/>
                     <a:stretch>
                       <a:fillRect/>
@@ -3114,13 +5521,15 @@
                   <pic:spPr bwMode="auto">
                     <a:xfrm>
                       <a:off x="0" y="0"/>
-                      <a:ext cx="3399847" cy="3498617"/>
+                      <a:ext cx="5957284" cy="3505126"/>
                     </a:xfrm>
                     <a:prstGeom prst="rect">
                       <a:avLst/>
                     </a:prstGeom>
                     <a:ln>
-                      <a:noFill/>
+                      <a:solidFill>
+                        <a:schemeClr val="tx1"/>
+                      </a:solidFill>
                     </a:ln>
                     <a:extLst>
                       <a:ext uri="{53640926-AAD7-44D8-BBD7-CCE9431645EC}">
@@ -3155,14 +5564,127 @@
       </w:r>
     </w:p>
     <w:p>
+      <w:pPr>
+        <w:autoSpaceDE w:val="0"/>
+        <w:autoSpaceDN w:val="0"/>
+        <w:adjustRightInd w:val="0"/>
+        <w:spacing w:after="0" w:line="240" w:lineRule="auto"/>
+        <w:rPr>
+          <w:rFonts w:ascii="LMRoman12-Regular" w:eastAsia="LMRoman12-Regular" w:cs="LMRoman12-Regular"/>
+          <w:kern w:val="0"/>
+        </w:rPr>
+      </w:pPr>
+      <w:r>
+        <w:rPr>
+          <w:rFonts w:ascii="LMRoman12-Regular" w:eastAsia="LMRoman12-Regular" w:cs="LMRoman12-Regular"/>
+          <w:kern w:val="0"/>
+        </w:rPr>
+        <w:t xml:space="preserve">Retrieve the </w:t>
+      </w:r>
+      <w:r>
+        <w:rPr>
+          <w:rFonts w:ascii="LMRoman12-Bold" w:eastAsia="LMRoman12-Bold" w:cs="LMRoman12-Bold"/>
+          <w:b/>
+          <w:bCs/>
+          <w:kern w:val="0"/>
+        </w:rPr>
+        <w:t>latest clinical note for each patient</w:t>
+      </w:r>
+      <w:r>
+        <w:rPr>
+          <w:rFonts w:ascii="LMRoman12-Regular" w:eastAsia="LMRoman12-Regular" w:cs="LMRoman12-Regular"/>
+          <w:kern w:val="0"/>
+        </w:rPr>
+        <w:t xml:space="preserve">. Display the </w:t>
+      </w:r>
+      <w:proofErr w:type="gramStart"/>
+      <w:r>
+        <w:rPr>
+          <w:rFonts w:ascii="LMRoman12-Regular" w:eastAsia="LMRoman12-Regular" w:cs="LMRoman12-Regular"/>
+          <w:kern w:val="0"/>
+        </w:rPr>
+        <w:t>patient</w:t>
+      </w:r>
+      <w:proofErr w:type="gramEnd"/>
+      <w:r>
+        <w:rPr>
+          <w:rFonts w:ascii="LMRoman12-Regular" w:eastAsia="LMRoman12-Regular" w:cs="LMRoman12-Regular"/>
+          <w:kern w:val="0"/>
+        </w:rPr>
+        <w:t xml:space="preserve"> name, note</w:t>
+      </w:r>
+    </w:p>
+    <w:p>
+      <w:pPr>
+        <w:rPr>
+          <w:rFonts w:ascii="LMRoman12-Regular" w:eastAsia="LMRoman12-Regular" w:cs="LMRoman12-Regular"/>
+          <w:kern w:val="0"/>
+        </w:rPr>
+      </w:pPr>
+      <w:r>
+        <w:rPr>
+          <w:rFonts w:ascii="LMRoman12-Regular" w:eastAsia="LMRoman12-Regular" w:cs="LMRoman12-Regular"/>
+          <w:kern w:val="0"/>
+        </w:rPr>
+        <w:t>type, note creation date and time, and note contents.</w:t>
+      </w:r>
+    </w:p>
+    <w:p>
       <w:r>
         <w:rPr>
           <w:noProof/>
         </w:rPr>
         <w:drawing>
-          <wp:inline distT="0" distB="0" distL="0" distR="0" wp14:anchorId="0D403ED7" wp14:editId="22617234">
+          <wp:inline distT="0" distB="0" distL="0" distR="0" wp14:anchorId="670BCDCC" wp14:editId="13A737AB">
+            <wp:extent cx="5943600" cy="825500"/>
+            <wp:effectExtent l="19050" t="19050" r="19050" b="12700"/>
+            <wp:docPr id="1281342691" name="Picture 1"/>
+            <wp:cNvGraphicFramePr>
+              <a:graphicFrameLocks xmlns:a="http://schemas.openxmlformats.org/drawingml/2006/main" noChangeAspect="1"/>
+            </wp:cNvGraphicFramePr>
+            <a:graphic xmlns:a="http://schemas.openxmlformats.org/drawingml/2006/main">
+              <a:graphicData uri="http://schemas.openxmlformats.org/drawingml/2006/picture">
+                <pic:pic xmlns:pic="http://schemas.openxmlformats.org/drawingml/2006/picture">
+                  <pic:nvPicPr>
+                    <pic:cNvPr id="1281342691" name=""/>
+                    <pic:cNvPicPr/>
+                  </pic:nvPicPr>
+                  <pic:blipFill>
+                    <a:blip r:embed="rId15"/>
+                    <a:stretch>
+                      <a:fillRect/>
+                    </a:stretch>
+                  </pic:blipFill>
+                  <pic:spPr>
+                    <a:xfrm>
+                      <a:off x="0" y="0"/>
+                      <a:ext cx="5943600" cy="825500"/>
+                    </a:xfrm>
+                    <a:prstGeom prst="rect">
+                      <a:avLst/>
+                    </a:prstGeom>
+                    <a:ln>
+                      <a:solidFill>
+                        <a:schemeClr val="tx1"/>
+                      </a:solidFill>
+                    </a:ln>
+                  </pic:spPr>
+                </pic:pic>
+              </a:graphicData>
+            </a:graphic>
+          </wp:inline>
+        </w:drawing>
+      </w:r>
+    </w:p>
+    <w:p>
+      <w:r>
+        <w:rPr>
+          <w:noProof/>
+        </w:rPr>
+        <w:drawing>
+          <wp:inline distT="0" distB="0" distL="0" distR="0" wp14:anchorId="0D403ED7" wp14:editId="7592F0B7">
             <wp:extent cx="5943600" cy="4824730"/>
-            <wp:effectExtent l="0" t="0" r="0" b="0"/>
+            <wp:effectExtent l="19050" t="19050" r="19050" b="13970"/>
             <wp:docPr id="1051468563" name="Picture 1"/>
             <wp:cNvGraphicFramePr>
               <a:graphicFrameLocks xmlns:a="http://schemas.openxmlformats.org/drawingml/2006/main" noChangeAspect="1"/>
@@ -3175,7 +5697,7 @@
                     <pic:cNvPicPr/>
                   </pic:nvPicPr>
                   <pic:blipFill>
-                    <a:blip r:embed="rId14"/>
+                    <a:blip r:embed="rId16"/>
                     <a:stretch>
                       <a:fillRect/>
                     </a:stretch>
@@ -3188,6 +5710,11 @@
                     <a:prstGeom prst="rect">
                       <a:avLst/>
                     </a:prstGeom>
+                    <a:ln>
+                      <a:solidFill>
+                        <a:schemeClr val="tx1"/>
+                      </a:solidFill>
+                    </a:ln>
                   </pic:spPr>
                 </pic:pic>
               </a:graphicData>
@@ -3206,7 +5733,7 @@
       <w:r>
         <w:t xml:space="preserve"> </w:t>
       </w:r>
-      <w:bookmarkStart w:id="11" w:name="_Toc242304782"/>
+      <w:bookmarkStart w:id="12" w:name="_Toc242304782"/>
       <w:r>
         <w:t>For each patient, pick the single clinical note with the latest creation_date across all their admissions. Join patient → admission → clinical_note, then keep only the top row per patient (DISTINCT ON (patient_id) or ROW_NUMBER () = 1).</w:t>
       </w:r>
@@ -3255,14 +5782,138 @@
       </w:r>
     </w:p>
     <w:p>
-      <w:r>
-        <w:rPr>
+      <w:pPr>
+        <w:autoSpaceDE w:val="0"/>
+        <w:autoSpaceDN w:val="0"/>
+        <w:adjustRightInd w:val="0"/>
+        <w:spacing w:after="0" w:line="240" w:lineRule="auto"/>
+        <w:rPr>
+          <w:rFonts w:ascii="LMRoman12-Regular" w:eastAsia="LMRoman12-Regular" w:cs="LMRoman12-Regular"/>
+          <w:kern w:val="0"/>
+        </w:rPr>
+      </w:pPr>
+      <w:r>
+        <w:rPr>
+          <w:rFonts w:ascii="LMRoman12-Regular" w:eastAsia="LMRoman12-Regular" w:cs="LMRoman12-Regular"/>
+          <w:kern w:val="0"/>
+        </w:rPr>
+        <w:t>List all admissions where the patient</w:t>
+      </w:r>
+      <w:r>
+        <w:rPr>
+          <w:rFonts w:ascii="LMRoman12-Regular" w:eastAsia="LMRoman12-Regular" w:cs="LMRoman12-Regular" w:hint="eastAsia"/>
+          <w:kern w:val="0"/>
+        </w:rPr>
+        <w:t>’</w:t>
+      </w:r>
+      <w:r>
+        <w:rPr>
+          <w:rFonts w:ascii="LMRoman12-Regular" w:eastAsia="LMRoman12-Regular" w:cs="LMRoman12-Regular"/>
+          <w:kern w:val="0"/>
+        </w:rPr>
+        <w:t xml:space="preserve">s discharge status or discharge condition indicates that the patient </w:t>
+      </w:r>
+      <w:r>
+        <w:rPr>
+          <w:rFonts w:ascii="LMRoman12-Bold" w:eastAsia="LMRoman12-Bold" w:cs="LMRoman12-Bold"/>
+          <w:b/>
+          <w:bCs/>
+          <w:kern w:val="0"/>
+        </w:rPr>
+        <w:t>died during the hospital stay</w:t>
+      </w:r>
+      <w:r>
+        <w:rPr>
+          <w:rFonts w:ascii="LMRoman12-Regular" w:eastAsia="LMRoman12-Regular" w:cs="LMRoman12-Regular"/>
+          <w:kern w:val="0"/>
+        </w:rPr>
+        <w:t xml:space="preserve">. Display the </w:t>
+      </w:r>
+      <w:proofErr w:type="gramStart"/>
+      <w:r>
+        <w:rPr>
+          <w:rFonts w:ascii="LMRoman12-Regular" w:eastAsia="LMRoman12-Regular" w:cs="LMRoman12-Regular"/>
+          <w:kern w:val="0"/>
+        </w:rPr>
+        <w:t>patient</w:t>
+      </w:r>
+      <w:proofErr w:type="gramEnd"/>
+      <w:r>
+        <w:rPr>
+          <w:rFonts w:ascii="LMRoman12-Regular" w:eastAsia="LMRoman12-Regular" w:cs="LMRoman12-Regular"/>
+          <w:kern w:val="0"/>
+        </w:rPr>
+        <w:t xml:space="preserve"> name, admission date, recorded date of death, and associated primary ICD-9 diagnosis.</w:t>
+      </w:r>
+    </w:p>
+    <w:p>
+      <w:pPr>
+        <w:autoSpaceDE w:val="0"/>
+        <w:autoSpaceDN w:val="0"/>
+        <w:adjustRightInd w:val="0"/>
+        <w:spacing w:after="0" w:line="240" w:lineRule="auto"/>
+        <w:rPr>
+          <w:rFonts w:ascii="LMRoman12-Regular" w:eastAsia="LMRoman12-Regular" w:cs="LMRoman12-Regular"/>
+          <w:kern w:val="0"/>
+        </w:rPr>
+      </w:pPr>
+      <w:r>
+        <w:rPr>
+          <w:rFonts w:ascii="LMRoman12-Regular" w:eastAsia="LMRoman12-Regular" w:cs="LMRoman12-Regular"/>
           <w:noProof/>
+          <w:kern w:val="0"/>
         </w:rPr>
         <w:drawing>
-          <wp:inline distT="0" distB="0" distL="0" distR="0" wp14:anchorId="1DD396B0" wp14:editId="7BC6271D">
+          <wp:inline distT="0" distB="0" distL="0" distR="0" wp14:anchorId="5A33356C" wp14:editId="68573721">
+            <wp:extent cx="5943600" cy="2119630"/>
+            <wp:effectExtent l="19050" t="19050" r="19050" b="13970"/>
+            <wp:docPr id="951556153" name="Picture 1"/>
+            <wp:cNvGraphicFramePr>
+              <a:graphicFrameLocks xmlns:a="http://schemas.openxmlformats.org/drawingml/2006/main" noChangeAspect="1"/>
+            </wp:cNvGraphicFramePr>
+            <a:graphic xmlns:a="http://schemas.openxmlformats.org/drawingml/2006/main">
+              <a:graphicData uri="http://schemas.openxmlformats.org/drawingml/2006/picture">
+                <pic:pic xmlns:pic="http://schemas.openxmlformats.org/drawingml/2006/picture">
+                  <pic:nvPicPr>
+                    <pic:cNvPr id="951556153" name=""/>
+                    <pic:cNvPicPr/>
+                  </pic:nvPicPr>
+                  <pic:blipFill>
+                    <a:blip r:embed="rId17"/>
+                    <a:stretch>
+                      <a:fillRect/>
+                    </a:stretch>
+                  </pic:blipFill>
+                  <pic:spPr>
+                    <a:xfrm>
+                      <a:off x="0" y="0"/>
+                      <a:ext cx="5943600" cy="2119630"/>
+                    </a:xfrm>
+                    <a:prstGeom prst="rect">
+                      <a:avLst/>
+                    </a:prstGeom>
+                    <a:ln>
+                      <a:solidFill>
+                        <a:schemeClr val="tx1"/>
+                      </a:solidFill>
+                    </a:ln>
+                  </pic:spPr>
+                </pic:pic>
+              </a:graphicData>
+            </a:graphic>
+          </wp:inline>
+        </w:drawing>
+      </w:r>
+    </w:p>
+    <w:p>
+      <w:r>
+        <w:rPr>
+          <w:noProof/>
+        </w:rPr>
+        <w:drawing>
+          <wp:inline distT="0" distB="0" distL="0" distR="0" wp14:anchorId="1DD396B0" wp14:editId="0786117D">
             <wp:extent cx="5943600" cy="1841500"/>
-            <wp:effectExtent l="0" t="0" r="0" b="6350"/>
+            <wp:effectExtent l="19050" t="19050" r="19050" b="25400"/>
             <wp:docPr id="931874033" name="Picture 1"/>
             <wp:cNvGraphicFramePr>
               <a:graphicFrameLocks xmlns:a="http://schemas.openxmlformats.org/drawingml/2006/main" noChangeAspect="1"/>
@@ -3275,7 +5926,7 @@
                     <pic:cNvPicPr/>
                   </pic:nvPicPr>
                   <pic:blipFill>
-                    <a:blip r:embed="rId15"/>
+                    <a:blip r:embed="rId18"/>
                     <a:stretch>
                       <a:fillRect/>
                     </a:stretch>
@@ -3288,6 +5939,11 @@
                     <a:prstGeom prst="rect">
                       <a:avLst/>
                     </a:prstGeom>
+                    <a:ln>
+                      <a:solidFill>
+                        <a:schemeClr val="tx1"/>
+                      </a:solidFill>
+                    </a:ln>
                   </pic:spPr>
                 </pic:pic>
               </a:graphicData>
@@ -3321,18 +5977,163 @@
           <w:color w:val="0F1115"/>
           <w:shd w:val="clear" w:color="auto" w:fill="FFFFFF"/>
         </w:rPr>
+        <w:br w:type="page"/>
+      </w:r>
+    </w:p>
+    <w:p>
+      <w:pPr>
+        <w:rPr>
+          <w:rFonts w:ascii="Segoe UI" w:hAnsi="Segoe UI" w:cs="Segoe UI"/>
+          <w:color w:val="0F1115"/>
+          <w:shd w:val="clear" w:color="auto" w:fill="FFFFFF"/>
+        </w:rPr>
+      </w:pPr>
+      <w:r>
+        <w:rPr>
+          <w:rFonts w:ascii="Segoe UI" w:hAnsi="Segoe UI" w:cs="Segoe UI"/>
+          <w:color w:val="0F1115"/>
+          <w:shd w:val="clear" w:color="auto" w:fill="FFFFFF"/>
+        </w:rPr>
+        <w:lastRenderedPageBreak/>
         <w:t>Q20 – [Freddy Mvemba]</w:t>
       </w:r>
     </w:p>
     <w:p>
-      <w:r>
-        <w:rPr>
+      <w:pPr>
+        <w:autoSpaceDE w:val="0"/>
+        <w:autoSpaceDN w:val="0"/>
+        <w:adjustRightInd w:val="0"/>
+        <w:spacing w:after="0" w:line="240" w:lineRule="auto"/>
+        <w:rPr>
+          <w:rFonts w:ascii="LMRoman12-Regular" w:eastAsia="LMRoman12-Regular" w:cs="LMRoman12-Regular"/>
+          <w:kern w:val="0"/>
+        </w:rPr>
+      </w:pPr>
+      <w:r>
+        <w:rPr>
+          <w:rFonts w:ascii="LMRoman12-Regular" w:eastAsia="LMRoman12-Regular" w:cs="LMRoman12-Regular"/>
+          <w:kern w:val="0"/>
+        </w:rPr>
+        <w:t xml:space="preserve">Find all patients who underwent a </w:t>
+      </w:r>
+      <w:r>
+        <w:rPr>
+          <w:rFonts w:ascii="LMRoman12-Bold" w:eastAsia="LMRoman12-Bold" w:cs="LMRoman12-Bold"/>
+          <w:b/>
+          <w:bCs/>
+          <w:kern w:val="0"/>
+        </w:rPr>
+        <w:t xml:space="preserve">surgical procedure and a radiology examination on the same calendar day </w:t>
+      </w:r>
+      <w:r>
+        <w:rPr>
+          <w:rFonts w:ascii="LMRoman12-Regular" w:eastAsia="LMRoman12-Regular" w:cs="LMRoman12-Regular"/>
+          <w:kern w:val="0"/>
+        </w:rPr>
+        <w:t>during the same admission. Display the patient</w:t>
+      </w:r>
+      <w:r>
+        <w:rPr>
+          <w:rFonts w:ascii="LMRoman12-Bold" w:eastAsia="LMRoman12-Bold" w:cs="LMRoman12-Bold"/>
+          <w:b/>
+          <w:bCs/>
+          <w:kern w:val="0"/>
+        </w:rPr>
+        <w:t xml:space="preserve"> </w:t>
+      </w:r>
+      <w:r>
+        <w:rPr>
+          <w:rFonts w:ascii="LMRoman12-Regular" w:eastAsia="LMRoman12-Regular" w:cs="LMRoman12-Regular"/>
+          <w:kern w:val="0"/>
+        </w:rPr>
+        <w:t>name, admission identifier, procedure type, radiology examination type, and the common</w:t>
+      </w:r>
+      <w:r>
+        <w:rPr>
+          <w:rFonts w:ascii="LMRoman12-Bold" w:eastAsia="LMRoman12-Bold" w:cs="LMRoman12-Bold"/>
+          <w:b/>
+          <w:bCs/>
+          <w:kern w:val="0"/>
+        </w:rPr>
+        <w:t xml:space="preserve"> </w:t>
+      </w:r>
+      <w:r>
+        <w:rPr>
+          <w:rFonts w:ascii="LMRoman12-Regular" w:eastAsia="LMRoman12-Regular" w:cs="LMRoman12-Regular"/>
+          <w:kern w:val="0"/>
+        </w:rPr>
+        <w:t>date.</w:t>
+      </w:r>
+    </w:p>
+    <w:p>
+      <w:pPr>
+        <w:autoSpaceDE w:val="0"/>
+        <w:autoSpaceDN w:val="0"/>
+        <w:adjustRightInd w:val="0"/>
+        <w:spacing w:after="0" w:line="240" w:lineRule="auto"/>
+        <w:rPr>
+          <w:rFonts w:ascii="LMRoman12-Bold" w:eastAsia="LMRoman12-Bold" w:cs="LMRoman12-Bold"/>
+          <w:b/>
+          <w:bCs/>
+          <w:kern w:val="0"/>
+        </w:rPr>
+      </w:pPr>
+      <w:r>
+        <w:rPr>
+          <w:rFonts w:ascii="Segoe UI" w:hAnsi="Segoe UI" w:cs="Segoe UI"/>
           <w:noProof/>
+          <w:color w:val="0F1115"/>
+          <w:shd w:val="clear" w:color="auto" w:fill="FFFFFF"/>
         </w:rPr>
         <w:drawing>
-          <wp:inline distT="0" distB="0" distL="0" distR="0" wp14:anchorId="44376572" wp14:editId="6BFDE191">
+          <wp:inline distT="0" distB="0" distL="0" distR="0" wp14:anchorId="2E4A0A69" wp14:editId="2A9DCB58">
+            <wp:extent cx="5943600" cy="2055495"/>
+            <wp:effectExtent l="19050" t="19050" r="19050" b="20955"/>
+            <wp:docPr id="1026749754" name="Picture 1"/>
+            <wp:cNvGraphicFramePr>
+              <a:graphicFrameLocks xmlns:a="http://schemas.openxmlformats.org/drawingml/2006/main" noChangeAspect="1"/>
+            </wp:cNvGraphicFramePr>
+            <a:graphic xmlns:a="http://schemas.openxmlformats.org/drawingml/2006/main">
+              <a:graphicData uri="http://schemas.openxmlformats.org/drawingml/2006/picture">
+                <pic:pic xmlns:pic="http://schemas.openxmlformats.org/drawingml/2006/picture">
+                  <pic:nvPicPr>
+                    <pic:cNvPr id="1026749754" name=""/>
+                    <pic:cNvPicPr/>
+                  </pic:nvPicPr>
+                  <pic:blipFill>
+                    <a:blip r:embed="rId19"/>
+                    <a:stretch>
+                      <a:fillRect/>
+                    </a:stretch>
+                  </pic:blipFill>
+                  <pic:spPr>
+                    <a:xfrm>
+                      <a:off x="0" y="0"/>
+                      <a:ext cx="5943600" cy="2055495"/>
+                    </a:xfrm>
+                    <a:prstGeom prst="rect">
+                      <a:avLst/>
+                    </a:prstGeom>
+                    <a:ln>
+                      <a:solidFill>
+                        <a:schemeClr val="tx1"/>
+                      </a:solidFill>
+                    </a:ln>
+                  </pic:spPr>
+                </pic:pic>
+              </a:graphicData>
+            </a:graphic>
+          </wp:inline>
+        </w:drawing>
+      </w:r>
+      <w:r>
+        <w:rPr>
+          <w:noProof/>
+        </w:rPr>
+        <w:drawing>
+          <wp:inline distT="0" distB="0" distL="0" distR="0" wp14:anchorId="44376572" wp14:editId="00F48700">
             <wp:extent cx="5943600" cy="1127760"/>
-            <wp:effectExtent l="0" t="0" r="0" b="0"/>
+            <wp:effectExtent l="19050" t="19050" r="19050" b="15240"/>
             <wp:docPr id="30280323" name="Picture 1"/>
             <wp:cNvGraphicFramePr>
               <a:graphicFrameLocks xmlns:a="http://schemas.openxmlformats.org/drawingml/2006/main" noChangeAspect="1"/>
@@ -3345,7 +6146,7 @@
                     <pic:cNvPicPr/>
                   </pic:nvPicPr>
                   <pic:blipFill>
-                    <a:blip r:embed="rId16"/>
+                    <a:blip r:embed="rId20"/>
                     <a:stretch>
                       <a:fillRect/>
                     </a:stretch>
@@ -3358,6 +6159,11 @@
                     <a:prstGeom prst="rect">
                       <a:avLst/>
                     </a:prstGeom>
+                    <a:ln>
+                      <a:solidFill>
+                        <a:schemeClr val="tx1"/>
+                      </a:solidFill>
+                    </a:ln>
                   </pic:spPr>
                 </pic:pic>
               </a:graphicData>
@@ -3406,7 +6212,7 @@
         <w:lastRenderedPageBreak/>
         <w:t>Appendix B — Handout Checklist</w:t>
       </w:r>
-      <w:bookmarkEnd w:id="11"/>
+      <w:bookmarkEnd w:id="12"/>
     </w:p>
     <w:p/>
     <w:p>
@@ -3518,12 +6324,12 @@
       <w:pPr>
         <w:pStyle w:val="Heading1"/>
       </w:pPr>
-      <w:bookmarkStart w:id="12" w:name="_Toc242304783"/>
+      <w:bookmarkStart w:id="13" w:name="_Toc242304783"/>
       <w:r>
         <w:lastRenderedPageBreak/>
         <w:t>Table of Figures</w:t>
       </w:r>
-      <w:bookmarkEnd w:id="12"/>
+      <w:bookmarkEnd w:id="13"/>
     </w:p>
     <w:p>
       <w:pPr>
@@ -3611,7 +6417,7 @@
     <w:p/>
     <w:p/>
     <w:p/>
-    <w:bookmarkStart w:id="13" w:name="_Toc242304784" w:displacedByCustomXml="next"/>
+    <w:bookmarkStart w:id="14" w:name="_Toc242304784" w:displacedByCustomXml="next"/>
     <w:sdt>
       <w:sdtPr>
         <w:rPr>
@@ -3634,7 +6440,7 @@
           <w:r>
             <w:t>Bibliography</w:t>
           </w:r>
-          <w:bookmarkEnd w:id="13"/>
+          <w:bookmarkEnd w:id="14"/>
         </w:p>
         <w:sdt>
           <w:sdtPr>
@@ -3690,7 +6496,7 @@
       </w:r>
     </w:p>
     <w:sectPr>
-      <w:footerReference w:type="default" r:id="rId17"/>
+      <w:footerReference w:type="default" r:id="rId21"/>
       <w:pgSz w:w="12240" w:h="15840"/>
       <w:pgMar w:top="1440" w:right="1440" w:bottom="1440" w:left="1440" w:header="720" w:footer="720" w:gutter="0"/>
       <w:pgNumType w:start="0"/>
@@ -4993,6 +7799,155 @@
     </w:lvl>
   </w:abstractNum>
   <w:abstractNum w:abstractNumId="10" w15:restartNumberingAfterBreak="0">
+    <w:nsid w:val="447C19B6"/>
+    <w:multiLevelType w:val="multilevel"/>
+    <w:tmpl w:val="18FE50A8"/>
+    <w:lvl w:ilvl="0">
+      <w:start w:val="1"/>
+      <w:numFmt w:val="bullet"/>
+      <w:lvlText w:val=""/>
+      <w:lvlJc w:val="left"/>
+      <w:pPr>
+        <w:tabs>
+          <w:tab w:val="num" w:pos="720"/>
+        </w:tabs>
+        <w:ind w:left="720" w:hanging="360"/>
+      </w:pPr>
+      <w:rPr>
+        <w:rFonts w:ascii="Symbol" w:hAnsi="Symbol" w:hint="default"/>
+        <w:sz w:val="20"/>
+      </w:rPr>
+    </w:lvl>
+    <w:lvl w:ilvl="1">
+      <w:start w:val="1"/>
+      <w:numFmt w:val="bullet"/>
+      <w:lvlText w:val="o"/>
+      <w:lvlJc w:val="left"/>
+      <w:pPr>
+        <w:tabs>
+          <w:tab w:val="num" w:pos="1440"/>
+        </w:tabs>
+        <w:ind w:left="1440" w:hanging="360"/>
+      </w:pPr>
+      <w:rPr>
+        <w:rFonts w:ascii="Courier New" w:hAnsi="Courier New" w:hint="default"/>
+        <w:sz w:val="20"/>
+      </w:rPr>
+    </w:lvl>
+    <w:lvl w:ilvl="2" w:tentative="1">
+      <w:start w:val="1"/>
+      <w:numFmt w:val="bullet"/>
+      <w:lvlText w:val=""/>
+      <w:lvlJc w:val="left"/>
+      <w:pPr>
+        <w:tabs>
+          <w:tab w:val="num" w:pos="2160"/>
+        </w:tabs>
+        <w:ind w:left="2160" w:hanging="360"/>
+      </w:pPr>
+      <w:rPr>
+        <w:rFonts w:ascii="Wingdings" w:hAnsi="Wingdings" w:hint="default"/>
+        <w:sz w:val="20"/>
+      </w:rPr>
+    </w:lvl>
+    <w:lvl w:ilvl="3" w:tentative="1">
+      <w:start w:val="1"/>
+      <w:numFmt w:val="bullet"/>
+      <w:lvlText w:val=""/>
+      <w:lvlJc w:val="left"/>
+      <w:pPr>
+        <w:tabs>
+          <w:tab w:val="num" w:pos="2880"/>
+        </w:tabs>
+        <w:ind w:left="2880" w:hanging="360"/>
+      </w:pPr>
+      <w:rPr>
+        <w:rFonts w:ascii="Wingdings" w:hAnsi="Wingdings" w:hint="default"/>
+        <w:sz w:val="20"/>
+      </w:rPr>
+    </w:lvl>
+    <w:lvl w:ilvl="4" w:tentative="1">
+      <w:start w:val="1"/>
+      <w:numFmt w:val="bullet"/>
+      <w:lvlText w:val=""/>
+      <w:lvlJc w:val="left"/>
+      <w:pPr>
+        <w:tabs>
+          <w:tab w:val="num" w:pos="3600"/>
+        </w:tabs>
+        <w:ind w:left="3600" w:hanging="360"/>
+      </w:pPr>
+      <w:rPr>
+        <w:rFonts w:ascii="Wingdings" w:hAnsi="Wingdings" w:hint="default"/>
+        <w:sz w:val="20"/>
+      </w:rPr>
+    </w:lvl>
+    <w:lvl w:ilvl="5" w:tentative="1">
+      <w:start w:val="1"/>
+      <w:numFmt w:val="bullet"/>
+      <w:lvlText w:val=""/>
+      <w:lvlJc w:val="left"/>
+      <w:pPr>
+        <w:tabs>
+          <w:tab w:val="num" w:pos="4320"/>
+        </w:tabs>
+        <w:ind w:left="4320" w:hanging="360"/>
+      </w:pPr>
+      <w:rPr>
+        <w:rFonts w:ascii="Wingdings" w:hAnsi="Wingdings" w:hint="default"/>
+        <w:sz w:val="20"/>
+      </w:rPr>
+    </w:lvl>
+    <w:lvl w:ilvl="6" w:tentative="1">
+      <w:start w:val="1"/>
+      <w:numFmt w:val="bullet"/>
+      <w:lvlText w:val=""/>
+      <w:lvlJc w:val="left"/>
+      <w:pPr>
+        <w:tabs>
+          <w:tab w:val="num" w:pos="5040"/>
+        </w:tabs>
+        <w:ind w:left="5040" w:hanging="360"/>
+      </w:pPr>
+      <w:rPr>
+        <w:rFonts w:ascii="Wingdings" w:hAnsi="Wingdings" w:hint="default"/>
+        <w:sz w:val="20"/>
+      </w:rPr>
+    </w:lvl>
+    <w:lvl w:ilvl="7" w:tentative="1">
+      <w:start w:val="1"/>
+      <w:numFmt w:val="bullet"/>
+      <w:lvlText w:val=""/>
+      <w:lvlJc w:val="left"/>
+      <w:pPr>
+        <w:tabs>
+          <w:tab w:val="num" w:pos="5760"/>
+        </w:tabs>
+        <w:ind w:left="5760" w:hanging="360"/>
+      </w:pPr>
+      <w:rPr>
+        <w:rFonts w:ascii="Wingdings" w:hAnsi="Wingdings" w:hint="default"/>
+        <w:sz w:val="20"/>
+      </w:rPr>
+    </w:lvl>
+    <w:lvl w:ilvl="8" w:tentative="1">
+      <w:start w:val="1"/>
+      <w:numFmt w:val="bullet"/>
+      <w:lvlText w:val=""/>
+      <w:lvlJc w:val="left"/>
+      <w:pPr>
+        <w:tabs>
+          <w:tab w:val="num" w:pos="6480"/>
+        </w:tabs>
+        <w:ind w:left="6480" w:hanging="360"/>
+      </w:pPr>
+      <w:rPr>
+        <w:rFonts w:ascii="Wingdings" w:hAnsi="Wingdings" w:hint="default"/>
+        <w:sz w:val="20"/>
+      </w:rPr>
+    </w:lvl>
+  </w:abstractNum>
+  <w:abstractNum w:abstractNumId="11" w15:restartNumberingAfterBreak="0">
     <w:nsid w:val="46E61869"/>
     <w:multiLevelType w:val="hybridMultilevel"/>
     <w:tmpl w:val="29502D34"/>
@@ -5105,7 +8060,7 @@
       </w:rPr>
     </w:lvl>
   </w:abstractNum>
-  <w:abstractNum w:abstractNumId="11" w15:restartNumberingAfterBreak="0">
+  <w:abstractNum w:abstractNumId="12" w15:restartNumberingAfterBreak="0">
     <w:nsid w:val="66D830FD"/>
     <w:multiLevelType w:val="hybridMultilevel"/>
     <w:tmpl w:val="DEF6FF6C"/>
@@ -5194,7 +8149,7 @@
       </w:pPr>
     </w:lvl>
   </w:abstractNum>
-  <w:abstractNum w:abstractNumId="12" w15:restartNumberingAfterBreak="0">
+  <w:abstractNum w:abstractNumId="13" w15:restartNumberingAfterBreak="0">
     <w:nsid w:val="68820408"/>
     <w:multiLevelType w:val="multilevel"/>
     <w:tmpl w:val="88165F06"/>
@@ -5343,7 +8298,7 @@
       </w:rPr>
     </w:lvl>
   </w:abstractNum>
-  <w:abstractNum w:abstractNumId="13" w15:restartNumberingAfterBreak="0">
+  <w:abstractNum w:abstractNumId="14" w15:restartNumberingAfterBreak="0">
     <w:nsid w:val="6F6A0647"/>
     <w:multiLevelType w:val="hybridMultilevel"/>
     <w:tmpl w:val="06183E2C"/>
@@ -5456,7 +8411,7 @@
       </w:rPr>
     </w:lvl>
   </w:abstractNum>
-  <w:abstractNum w:abstractNumId="14" w15:restartNumberingAfterBreak="0">
+  <w:abstractNum w:abstractNumId="15" w15:restartNumberingAfterBreak="0">
     <w:nsid w:val="790A3B3D"/>
     <w:multiLevelType w:val="hybridMultilevel"/>
     <w:tmpl w:val="89FC2032"/>
@@ -5569,7 +8524,7 @@
       </w:rPr>
     </w:lvl>
   </w:abstractNum>
-  <w:abstractNum w:abstractNumId="15" w15:restartNumberingAfterBreak="0">
+  <w:abstractNum w:abstractNumId="16" w15:restartNumberingAfterBreak="0">
     <w:nsid w:val="7BAF4AD2"/>
     <w:multiLevelType w:val="hybridMultilevel"/>
     <w:tmpl w:val="55A281BE"/>
@@ -5685,10 +8640,10 @@
     <w:abstractNumId w:val="8"/>
   </w:num>
   <w:num w:numId="2" w16cid:durableId="1811360442">
-    <w:abstractNumId w:val="13"/>
+    <w:abstractNumId w:val="14"/>
   </w:num>
   <w:num w:numId="3" w16cid:durableId="1771118619">
-    <w:abstractNumId w:val="12"/>
+    <w:abstractNumId w:val="13"/>
   </w:num>
   <w:num w:numId="4" w16cid:durableId="1588879511">
     <w:abstractNumId w:val="6"/>
@@ -5712,13 +8667,13 @@
     <w:abstractNumId w:val="3"/>
   </w:num>
   <w:num w:numId="11" w16cid:durableId="1725788097">
-    <w:abstractNumId w:val="15"/>
+    <w:abstractNumId w:val="16"/>
   </w:num>
   <w:num w:numId="12" w16cid:durableId="1788230365">
-    <w:abstractNumId w:val="11"/>
+    <w:abstractNumId w:val="12"/>
   </w:num>
   <w:num w:numId="13" w16cid:durableId="599263809">
-    <w:abstractNumId w:val="10"/>
+    <w:abstractNumId w:val="11"/>
   </w:num>
   <w:num w:numId="14" w16cid:durableId="1185434697">
     <w:abstractNumId w:val="9"/>
@@ -5727,7 +8682,10 @@
     <w:abstractNumId w:val="5"/>
   </w:num>
   <w:num w:numId="16" w16cid:durableId="1349212510">
-    <w:abstractNumId w:val="14"/>
+    <w:abstractNumId w:val="15"/>
+  </w:num>
+  <w:num w:numId="17" w16cid:durableId="1189491618">
+    <w:abstractNumId w:val="10"/>
   </w:num>
 </w:numbering>
 </file>
@@ -6668,7 +9626,6 @@
     <w:basedOn w:val="Normal"/>
     <w:next w:val="Normal"/>
     <w:uiPriority w:val="35"/>
-    <w:semiHidden/>
     <w:unhideWhenUsed/>
     <w:qFormat/>
     <w:rsid w:val="00AC0ABE"/>
@@ -6866,6 +9823,24 @@
       <w14:ligatures w14:val="none"/>
     </w:rPr>
   </w:style>
+  <w:style w:type="paragraph" w:customStyle="1" w:styleId="z1qcye">
+    <w:name w:val="z1qcye"/>
+    <w:basedOn w:val="Normal"/>
+    <w:rsid w:val="00653058"/>
+    <w:pPr>
+      <w:spacing w:before="100" w:beforeAutospacing="1" w:after="100" w:afterAutospacing="1" w:line="240" w:lineRule="auto"/>
+    </w:pPr>
+    <w:rPr>
+      <w:rFonts w:ascii="Times New Roman" w:eastAsia="Times New Roman" w:hAnsi="Times New Roman" w:cs="Times New Roman"/>
+      <w:kern w:val="0"/>
+      <w14:ligatures w14:val="none"/>
+    </w:rPr>
+  </w:style>
+  <w:style w:type="character" w:customStyle="1" w:styleId="inqyif">
+    <w:name w:val="inqyif"/>
+    <w:basedOn w:val="DefaultParagraphFont"/>
+    <w:rsid w:val="00653058"/>
+  </w:style>
 </w:styles>
 </file>
 
@@ -6982,6 +9957,31 @@
     <w:pitch w:val="variable"/>
     <w:sig w:usb0="20000287" w:usb1="00000003" w:usb2="00000000" w:usb3="00000000" w:csb0="0000019F" w:csb1="00000000"/>
   </w:font>
+  <w:font w:name="Arial">
+    <w:panose1 w:val="020B0604020202020204"/>
+    <w:charset w:val="00"/>
+    <w:family w:val="swiss"/>
+    <w:pitch w:val="variable"/>
+    <w:sig w:usb0="E0002EFF" w:usb1="C000785B" w:usb2="00000009" w:usb3="00000000" w:csb0="000001FF" w:csb1="00000000"/>
+  </w:font>
+  <w:font w:name="LMRoman12-Regular">
+    <w:altName w:val="Yu Gothic"/>
+    <w:panose1 w:val="00000000000000000000"/>
+    <w:charset w:val="80"/>
+    <w:family w:val="auto"/>
+    <w:notTrueType/>
+    <w:pitch w:val="default"/>
+    <w:sig w:usb0="00000001" w:usb1="08070000" w:usb2="00000010" w:usb3="00000000" w:csb0="00020000" w:csb1="00000000"/>
+  </w:font>
+  <w:font w:name="LMRoman12-Bold">
+    <w:altName w:val="Yu Gothic"/>
+    <w:panose1 w:val="00000000000000000000"/>
+    <w:charset w:val="80"/>
+    <w:family w:val="auto"/>
+    <w:notTrueType/>
+    <w:pitch w:val="default"/>
+    <w:sig w:usb0="00000001" w:usb1="08070000" w:usb2="00000010" w:usb3="00000000" w:csb0="00020000" w:csb1="00000000"/>
+  </w:font>
   <w:font w:name="Segoe UI">
     <w:panose1 w:val="020B0502040204020203"/>
     <w:charset w:val="00"/>
@@ -7009,11 +10009,19 @@
   <w:rsids>
     <w:rsidRoot w:val="00DD1CA2"/>
     <w:rsid w:val="00017C17"/>
+    <w:rsid w:val="001461A4"/>
+    <w:rsid w:val="00241ED3"/>
+    <w:rsid w:val="00246D5C"/>
     <w:rsid w:val="002550DE"/>
+    <w:rsid w:val="003072A9"/>
+    <w:rsid w:val="003958D2"/>
+    <w:rsid w:val="004A5179"/>
     <w:rsid w:val="005F7401"/>
     <w:rsid w:val="00657D28"/>
     <w:rsid w:val="0068640A"/>
+    <w:rsid w:val="006B4E26"/>
     <w:rsid w:val="006C46B9"/>
+    <w:rsid w:val="008C6D0D"/>
     <w:rsid w:val="009C02DB"/>
     <w:rsid w:val="00CF76F8"/>
     <w:rsid w:val="00DD1CA2"/>

</xml_diff>

<commit_message>
udpate for report and queries files
</commit_message>
<xml_diff>
--- a/SOEN363_Project_Phase1_TeamName.docx
+++ b/SOEN363_Project_Phase1_TeamName.docx
@@ -4425,6 +4425,9 @@
     </w:p>
     <w:p>
       <w:r>
+        <w:rPr>
+          <w:noProof/>
+        </w:rPr>
         <w:drawing>
           <wp:inline distT="0" distB="0" distL="0" distR="0" wp14:anchorId="2B08CAA2" wp14:editId="243D712C">
             <wp:extent cx="5943600" cy="2395220"/>
@@ -4714,19 +4717,7 @@
         <w:rPr>
           <w:color w:val="196B24" w:themeColor="accent3"/>
         </w:rPr>
-        <w:t>Appen</w:t>
-      </w:r>
-      <w:r>
-        <w:rPr>
-          <w:color w:val="196B24" w:themeColor="accent3"/>
-        </w:rPr>
-        <w:t>d</w:t>
-      </w:r>
-      <w:r>
-        <w:rPr>
-          <w:color w:val="196B24" w:themeColor="accent3"/>
-        </w:rPr>
-        <w:t xml:space="preserve">ix A </w:t>
+        <w:t xml:space="preserve">Appendix A </w:t>
       </w:r>
       <w:r>
         <w:rPr>
@@ -5168,7 +5159,6 @@
       <w:r>
         <w:t xml:space="preserve"> </w:t>
       </w:r>
-      <w:proofErr w:type="gramStart"/>
       <w:r>
         <w:rPr>
           <w:b/>
@@ -5176,152 +5166,457 @@
         <w:t>Q1</w:t>
       </w:r>
       <w:r>
-        <w:t xml:space="preserve"> — </w:t>
+        <w:rPr>
+          <w:b/>
+        </w:rPr>
+        <w:t xml:space="preserve">: </w:t>
+      </w:r>
+      <w:r>
+        <w:t>[</w:t>
+      </w:r>
+      <w:r>
+        <w:rPr>
+          <w:lang w:val="fr-FR"/>
+        </w:rPr>
+        <w:t>Z</w:t>
+      </w:r>
+      <w:r>
+        <w:rPr>
+          <w:lang w:val="fr-FR"/>
+        </w:rPr>
+        <w:t>achary</w:t>
       </w:r>
       <w:r>
         <w:rPr>
           <w:i/>
           <w:iCs/>
         </w:rPr>
-        <w:t>[</w:t>
-      </w:r>
-      <w:proofErr w:type="gramEnd"/>
-      <w:r>
-        <w:rPr>
-          <w:i/>
-        </w:rPr>
-        <w:t>author</w:t>
+        <w:t>]</w:t>
+      </w:r>
+    </w:p>
+    <w:p>
+      <w:r>
+        <w:t xml:space="preserve">  </w:t>
       </w:r>
       <w:r>
         <w:rPr>
           <w:i/>
           <w:iCs/>
         </w:rPr>
-        <w:t>]</w:t>
-      </w:r>
-    </w:p>
-    <w:p>
-      <w:r>
-        <w:t xml:space="preserve">  </w:t>
+        <w:t xml:space="preserve">[insert </w:t>
+      </w:r>
+      <w:r>
+        <w:rPr>
+          <w:i/>
+        </w:rPr>
+        <w:t>screenshot</w:t>
       </w:r>
       <w:r>
         <w:rPr>
           <w:i/>
           <w:iCs/>
         </w:rPr>
-        <w:t xml:space="preserve">[insert </w:t>
-      </w:r>
-      <w:r>
-        <w:rPr>
-          <w:i/>
-        </w:rPr>
-        <w:t>screenshot</w:t>
+        <w:t>]</w:t>
+      </w:r>
+    </w:p>
+    <w:p>
+      <w:r>
+        <w:t xml:space="preserve">Explanation: </w:t>
       </w:r>
       <w:r>
         <w:rPr>
           <w:i/>
           <w:iCs/>
         </w:rPr>
-        <w:t>]</w:t>
-      </w:r>
-    </w:p>
-    <w:p>
-      <w:r>
-        <w:t xml:space="preserve">Explanation: </w:t>
+        <w:t>[</w:t>
       </w:r>
       <w:r>
         <w:rPr>
           <w:i/>
           <w:iCs/>
         </w:rPr>
-        <w:t>[</w:t>
+        <w:t>summarize</w:t>
       </w:r>
       <w:r>
         <w:rPr>
           <w:i/>
           <w:iCs/>
         </w:rPr>
-        <w:t>summarize</w:t>
+        <w:t xml:space="preserve"> the query logic and </w:t>
       </w:r>
       <w:r>
         <w:rPr>
           <w:i/>
           <w:iCs/>
         </w:rPr>
-        <w:t xml:space="preserve"> the query logic and </w:t>
+        <w:t xml:space="preserve">key </w:t>
       </w:r>
       <w:r>
         <w:rPr>
           <w:i/>
           <w:iCs/>
         </w:rPr>
-        <w:t xml:space="preserve">key </w:t>
-      </w:r>
-      <w:r>
+        <w:t>result]</w:t>
+      </w:r>
+    </w:p>
+    <w:p>
+      <w:pPr>
         <w:rPr>
           <w:i/>
           <w:iCs/>
         </w:rPr>
-        <w:t>result]</w:t>
-      </w:r>
-    </w:p>
-    <w:p>
-      <w:proofErr w:type="gramStart"/>
-      <w:r>
-        <w:rPr>
-          <w:b/>
-          <w:bCs/>
-        </w:rPr>
-        <w:t>Q2</w:t>
-      </w:r>
-      <w:r>
-        <w:t xml:space="preserve"> — </w:t>
+      </w:pPr>
+      <w:r>
+        <w:rPr>
+          <w:b/>
+        </w:rPr>
+        <w:t>Q</w:t>
+      </w:r>
+      <w:r>
+        <w:rPr>
+          <w:b/>
+        </w:rPr>
+        <w:t xml:space="preserve">2: </w:t>
+      </w:r>
+      <w:r>
+        <w:t>[</w:t>
+      </w:r>
+      <w:r>
+        <w:rPr>
+          <w:lang w:val="fr-FR"/>
+        </w:rPr>
+        <w:t>Z</w:t>
+      </w:r>
+      <w:r>
+        <w:rPr>
+          <w:lang w:val="fr-FR"/>
+        </w:rPr>
+        <w:t>achary</w:t>
       </w:r>
       <w:r>
         <w:rPr>
           <w:i/>
           <w:iCs/>
         </w:rPr>
+        <w:t>]</w:t>
+      </w:r>
+    </w:p>
+    <w:p>
+      <w:r>
+        <w:rPr>
+          <w:b/>
+        </w:rPr>
+        <w:t>Q</w:t>
+      </w:r>
+      <w:r>
+        <w:rPr>
+          <w:b/>
+        </w:rPr>
+        <w:t>3</w:t>
+      </w:r>
+      <w:r>
+        <w:rPr>
+          <w:b/>
+        </w:rPr>
+        <w:t xml:space="preserve">: </w:t>
+      </w:r>
+      <w:r>
         <w:t>[</w:t>
       </w:r>
-      <w:proofErr w:type="gramEnd"/>
+      <w:r>
+        <w:t>Zachary</w:t>
+      </w:r>
       <w:r>
         <w:rPr>
           <w:i/>
           <w:iCs/>
         </w:rPr>
-        <w:t>author]</w:t>
-      </w:r>
-    </w:p>
-    <w:p>
-      <w:r>
-        <w:t>Repeat this format for Q3 through Q</w:t>
-      </w:r>
-      <w:r>
-        <w:t>17</w:t>
-      </w:r>
-      <w:r>
-        <w:t>.</w:t>
+        <w:t>]</w:t>
+      </w:r>
+    </w:p>
+    <w:p>
+      <w:pPr>
+        <w:rPr>
+          <w:i/>
+          <w:iCs/>
+        </w:rPr>
+      </w:pPr>
+      <w:r>
+        <w:rPr>
+          <w:b/>
+        </w:rPr>
+        <w:t>Q</w:t>
+      </w:r>
+      <w:r>
+        <w:rPr>
+          <w:b/>
+        </w:rPr>
+        <w:t>4</w:t>
+      </w:r>
+      <w:r>
+        <w:rPr>
+          <w:b/>
+        </w:rPr>
+        <w:t xml:space="preserve">: </w:t>
+      </w:r>
+      <w:r>
+        <w:t>[</w:t>
+      </w:r>
+      <w:r>
+        <w:t>Zachary</w:t>
+      </w:r>
+      <w:r>
+        <w:rPr>
+          <w:i/>
+          <w:iCs/>
+        </w:rPr>
+        <w:t>]</w:t>
+      </w:r>
+    </w:p>
+    <w:p>
+      <w:pPr>
+        <w:rPr>
+          <w:i/>
+          <w:iCs/>
+        </w:rPr>
+      </w:pPr>
+    </w:p>
+    <w:p>
+      <w:r>
+        <w:rPr>
+          <w:b/>
+        </w:rPr>
+        <w:t>Q</w:t>
+      </w:r>
+      <w:r>
+        <w:rPr>
+          <w:b/>
+        </w:rPr>
+        <w:t>5</w:t>
+      </w:r>
+      <w:r>
+        <w:rPr>
+          <w:b/>
+        </w:rPr>
+        <w:t xml:space="preserve">: </w:t>
+      </w:r>
+      <w:r>
+        <w:t>[</w:t>
+      </w:r>
+      <w:r>
+        <w:t>Juan</w:t>
+      </w:r>
+      <w:r>
+        <w:rPr>
+          <w:i/>
+          <w:iCs/>
+        </w:rPr>
+        <w:t>]</w:t>
+      </w:r>
+    </w:p>
+    <w:p>
+      <w:r>
+        <w:t xml:space="preserve">  </w:t>
+      </w:r>
+      <w:r>
+        <w:rPr>
+          <w:i/>
+          <w:iCs/>
+        </w:rPr>
+        <w:t xml:space="preserve">[insert </w:t>
+      </w:r>
+      <w:r>
+        <w:rPr>
+          <w:i/>
+        </w:rPr>
+        <w:t>screenshot</w:t>
+      </w:r>
+      <w:r>
+        <w:rPr>
+          <w:i/>
+          <w:iCs/>
+        </w:rPr>
+        <w:t>]</w:t>
+      </w:r>
+    </w:p>
+    <w:p>
+      <w:r>
+        <w:t xml:space="preserve">Explanation: </w:t>
+      </w:r>
+      <w:r>
+        <w:rPr>
+          <w:i/>
+          <w:iCs/>
+        </w:rPr>
+        <w:t>[summarize the query logic and key result]</w:t>
+      </w:r>
+    </w:p>
+    <w:p>
+      <w:pPr>
+        <w:rPr>
+          <w:i/>
+          <w:iCs/>
+        </w:rPr>
+      </w:pPr>
+      <w:r>
+        <w:rPr>
+          <w:b/>
+        </w:rPr>
+        <w:t>Q</w:t>
+      </w:r>
+      <w:r>
+        <w:rPr>
+          <w:b/>
+        </w:rPr>
+        <w:t>6</w:t>
+      </w:r>
+      <w:r>
+        <w:rPr>
+          <w:b/>
+        </w:rPr>
+        <w:t xml:space="preserve">: </w:t>
+      </w:r>
+      <w:r>
+        <w:t>[</w:t>
+      </w:r>
+      <w:r>
+        <w:t>JuanMa</w:t>
+      </w:r>
+      <w:r>
+        <w:rPr>
+          <w:i/>
+          <w:iCs/>
+        </w:rPr>
+        <w:t>]</w:t>
+      </w:r>
+    </w:p>
+    <w:p>
+      <w:r>
+        <w:rPr>
+          <w:b/>
+        </w:rPr>
+        <w:t>Q</w:t>
+      </w:r>
+      <w:r>
+        <w:rPr>
+          <w:b/>
+        </w:rPr>
+        <w:t>7</w:t>
+      </w:r>
+      <w:r>
+        <w:rPr>
+          <w:b/>
+        </w:rPr>
+        <w:t xml:space="preserve">: </w:t>
+      </w:r>
+      <w:r>
+        <w:t>[</w:t>
+      </w:r>
+      <w:r>
+        <w:t>JuanMa</w:t>
+      </w:r>
+      <w:r>
+        <w:rPr>
+          <w:i/>
+          <w:iCs/>
+        </w:rPr>
+        <w:t>]</w:t>
+      </w:r>
+    </w:p>
+    <w:p>
+      <w:pPr>
+        <w:rPr>
+          <w:i/>
+          <w:iCs/>
+        </w:rPr>
+      </w:pPr>
+      <w:r>
+        <w:rPr>
+          <w:b/>
+        </w:rPr>
+        <w:t>Q</w:t>
+      </w:r>
+      <w:r>
+        <w:rPr>
+          <w:b/>
+        </w:rPr>
+        <w:t>8</w:t>
+      </w:r>
+      <w:r>
+        <w:rPr>
+          <w:b/>
+        </w:rPr>
+        <w:t xml:space="preserve">: </w:t>
+      </w:r>
+      <w:r>
+        <w:t>[</w:t>
+      </w:r>
+      <w:r>
+        <w:t>Jua</w:t>
+      </w:r>
+      <w:r>
+        <w:t>n</w:t>
+      </w:r>
+      <w:r>
+        <w:t>Ma</w:t>
+      </w:r>
+      <w:r>
+        <w:rPr>
+          <w:i/>
+          <w:iCs/>
+        </w:rPr>
+        <w:t>]</w:t>
       </w:r>
     </w:p>
     <w:p/>
-    <w:p>
-      <w:r>
+    <w:p/>
+    <w:p/>
+    <w:p/>
+    <w:p>
+      <w:pPr>
+        <w:rPr>
+          <w:b/>
+          <w:bCs/>
+        </w:rPr>
+      </w:pPr>
+      <w:r>
+        <w:rPr>
+          <w:b/>
+          <w:bCs/>
+        </w:rPr>
         <w:br w:type="page"/>
       </w:r>
     </w:p>
     <w:p>
-      <w:r>
+      <w:pPr>
+        <w:rPr>
+          <w:i/>
+          <w:iCs/>
+        </w:rPr>
+      </w:pPr>
+      <w:r>
+        <w:rPr>
+          <w:b/>
+          <w:bCs/>
+        </w:rPr>
         <w:lastRenderedPageBreak/>
-        <w:t>Q17</w:t>
-      </w:r>
-      <w:r>
-        <w:t>- [</w:t>
-      </w:r>
-      <w:r>
-        <w:t>Freddy Mvemba</w:t>
-      </w:r>
-      <w:r>
+        <w:t xml:space="preserve">Q9: </w:t>
+      </w:r>
+      <w:r>
+        <w:t>[</w:t>
+      </w:r>
+      <w:r>
+        <w:rPr>
+          <w:i/>
+          <w:iCs/>
+        </w:rPr>
+        <w:t>Mohammad</w:t>
+      </w:r>
+      <w:r>
+        <w:rPr>
+          <w:i/>
+          <w:iCs/>
+        </w:rPr>
         <w:t>]</w:t>
       </w:r>
     </w:p>
@@ -5332,27 +5627,240 @@
         <w:adjustRightInd w:val="0"/>
         <w:spacing w:after="0" w:line="240" w:lineRule="auto"/>
         <w:rPr>
+          <w:rFonts w:ascii="LMRoman12-Regular" w:eastAsia="LMRoman12-Regular" w:cs="LMRoman12-Regular"/>
+          <w:kern w:val="0"/>
+        </w:rPr>
+      </w:pPr>
+      <w:r>
+        <w:rPr>
+          <w:rFonts w:ascii="LMRoman12-Regular" w:eastAsia="LMRoman12-Regular" w:cs="LMRoman12-Regular"/>
+          <w:kern w:val="0"/>
+        </w:rPr>
+        <w:t xml:space="preserve">Calculate the </w:t>
+      </w:r>
+      <w:r>
+        <w:rPr>
           <w:rFonts w:ascii="LMRoman12-Bold" w:eastAsia="LMRoman12-Bold" w:cs="LMRoman12-Bold"/>
           <w:b/>
           <w:bCs/>
           <w:kern w:val="0"/>
         </w:rPr>
-      </w:pPr>
+        <w:t xml:space="preserve">average length of stay </w:t>
+      </w:r>
       <w:r>
         <w:rPr>
           <w:rFonts w:ascii="LMRoman12-Regular" w:eastAsia="LMRoman12-Regular" w:cs="LMRoman12-Regular"/>
           <w:kern w:val="0"/>
         </w:rPr>
-        <w:t xml:space="preserve">Find all admissions during which the patient received </w:t>
-      </w:r>
-      <w:r>
-        <w:rPr>
-          <w:rFonts w:ascii="LMRoman12-Bold" w:eastAsia="LMRoman12-Bold" w:cs="LMRoman12-Bold"/>
+        <w:t>for each critical care unit type, such as MICU,</w:t>
+      </w:r>
+    </w:p>
+    <w:p>
+      <w:pPr>
+        <w:rPr>
+          <w:rFonts w:ascii="LMRoman12-Regular" w:eastAsia="LMRoman12-Regular" w:cs="LMRoman12-Regular"/>
+          <w:kern w:val="0"/>
+        </w:rPr>
+      </w:pPr>
+      <w:r>
+        <w:rPr>
+          <w:rFonts w:ascii="LMRoman12-Regular" w:eastAsia="LMRoman12-Regular" w:cs="LMRoman12-Regular"/>
+          <w:kern w:val="0"/>
+        </w:rPr>
+        <w:t>SICU, ICU, and CCU. Display the unit type and its average length of stay.</w:t>
+      </w:r>
+    </w:p>
+    <w:p>
+      <w:pPr>
+        <w:rPr>
+          <w:rFonts w:ascii="LMRoman12-Regular" w:eastAsia="LMRoman12-Regular" w:cs="LMRoman12-Regular"/>
+          <w:kern w:val="0"/>
+        </w:rPr>
+      </w:pPr>
+      <w:r>
+        <w:rPr>
+          <w:rFonts w:ascii="LMRoman12-Regular" w:eastAsia="LMRoman12-Regular" w:cs="LMRoman12-Regular"/>
+          <w:kern w:val="0"/>
+        </w:rPr>
+        <w:t>Query:</w:t>
+      </w:r>
+    </w:p>
+    <w:p>
+      <w:pPr>
+        <w:rPr>
           <w:b/>
           <w:bCs/>
-          <w:kern w:val="0"/>
-        </w:rPr>
-        <w:t>more than one distinct ICD-</w:t>
+        </w:rPr>
+      </w:pPr>
+      <w:r>
+        <w:rPr>
+          <w:b/>
+          <w:bCs/>
+        </w:rPr>
+        <w:drawing>
+          <wp:inline distT="0" distB="0" distL="0" distR="0" wp14:anchorId="6BF7CE79" wp14:editId="13FFC825">
+            <wp:extent cx="5943600" cy="1776730"/>
+            <wp:effectExtent l="19050" t="19050" r="19050" b="13970"/>
+            <wp:docPr id="792280254" name="Picture 1"/>
+            <wp:cNvGraphicFramePr>
+              <a:graphicFrameLocks xmlns:a="http://schemas.openxmlformats.org/drawingml/2006/main" noChangeAspect="1"/>
+            </wp:cNvGraphicFramePr>
+            <a:graphic xmlns:a="http://schemas.openxmlformats.org/drawingml/2006/main">
+              <a:graphicData uri="http://schemas.openxmlformats.org/drawingml/2006/picture">
+                <pic:pic xmlns:pic="http://schemas.openxmlformats.org/drawingml/2006/picture">
+                  <pic:nvPicPr>
+                    <pic:cNvPr id="792280254" name=""/>
+                    <pic:cNvPicPr/>
+                  </pic:nvPicPr>
+                  <pic:blipFill>
+                    <a:blip r:embed="rId13"/>
+                    <a:stretch>
+                      <a:fillRect/>
+                    </a:stretch>
+                  </pic:blipFill>
+                  <pic:spPr>
+                    <a:xfrm>
+                      <a:off x="0" y="0"/>
+                      <a:ext cx="5943600" cy="1776730"/>
+                    </a:xfrm>
+                    <a:prstGeom prst="rect">
+                      <a:avLst/>
+                    </a:prstGeom>
+                    <a:ln>
+                      <a:solidFill>
+                        <a:schemeClr val="tx1"/>
+                      </a:solidFill>
+                    </a:ln>
+                  </pic:spPr>
+                </pic:pic>
+              </a:graphicData>
+            </a:graphic>
+          </wp:inline>
+        </w:drawing>
+      </w:r>
+    </w:p>
+    <w:p>
+      <w:pPr>
+        <w:rPr>
+          <w:b/>
+          <w:bCs/>
+        </w:rPr>
+      </w:pPr>
+      <w:r>
+        <w:rPr>
+          <w:b/>
+          <w:bCs/>
+        </w:rPr>
+        <w:t>Output:</w:t>
+      </w:r>
+    </w:p>
+    <w:p>
+      <w:r>
+        <w:drawing>
+          <wp:inline distT="0" distB="0" distL="0" distR="0" wp14:anchorId="714AA6B1" wp14:editId="34205CC1">
+            <wp:extent cx="5993394" cy="1904365"/>
+            <wp:effectExtent l="19050" t="19050" r="26670" b="19685"/>
+            <wp:docPr id="34876797" name="Picture 1"/>
+            <wp:cNvGraphicFramePr>
+              <a:graphicFrameLocks xmlns:a="http://schemas.openxmlformats.org/drawingml/2006/main" noChangeAspect="1"/>
+            </wp:cNvGraphicFramePr>
+            <a:graphic xmlns:a="http://schemas.openxmlformats.org/drawingml/2006/main">
+              <a:graphicData uri="http://schemas.openxmlformats.org/drawingml/2006/picture">
+                <pic:pic xmlns:pic="http://schemas.openxmlformats.org/drawingml/2006/picture">
+                  <pic:nvPicPr>
+                    <pic:cNvPr id="34876797" name=""/>
+                    <pic:cNvPicPr/>
+                  </pic:nvPicPr>
+                  <pic:blipFill>
+                    <a:blip r:embed="rId14"/>
+                    <a:stretch>
+                      <a:fillRect/>
+                    </a:stretch>
+                  </pic:blipFill>
+                  <pic:spPr>
+                    <a:xfrm>
+                      <a:off x="0" y="0"/>
+                      <a:ext cx="6000551" cy="1906639"/>
+                    </a:xfrm>
+                    <a:prstGeom prst="rect">
+                      <a:avLst/>
+                    </a:prstGeom>
+                    <a:ln>
+                      <a:solidFill>
+                        <a:schemeClr val="tx1"/>
+                      </a:solidFill>
+                    </a:ln>
+                  </pic:spPr>
+                </pic:pic>
+              </a:graphicData>
+            </a:graphic>
+          </wp:inline>
+        </w:drawing>
+      </w:r>
+    </w:p>
+    <w:p>
+      <w:pPr>
+        <w:rPr>
+          <w:b/>
+          <w:bCs/>
+        </w:rPr>
+      </w:pPr>
+      <w:r>
+        <w:rPr>
+          <w:b/>
+          <w:bCs/>
+        </w:rPr>
+        <w:t>Logic:</w:t>
+      </w:r>
+    </w:p>
+    <w:p/>
+    <w:p/>
+    <w:p/>
+    <w:p/>
+    <w:p/>
+    <w:p>
+      <w:r>
+        <w:br w:type="page"/>
+      </w:r>
+    </w:p>
+    <w:p>
+      <w:pPr>
+        <w:rPr>
+          <w:i/>
+          <w:iCs/>
+        </w:rPr>
+      </w:pPr>
+      <w:r>
+        <w:rPr>
+          <w:b/>
+          <w:bCs/>
+        </w:rPr>
+        <w:lastRenderedPageBreak/>
+        <w:t>Q</w:t>
+      </w:r>
+      <w:r>
+        <w:rPr>
+          <w:b/>
+          <w:bCs/>
+        </w:rPr>
+        <w:t>10</w:t>
+      </w:r>
+      <w:r>
+        <w:rPr>
+          <w:b/>
+          <w:bCs/>
+        </w:rPr>
+        <w:t xml:space="preserve">: </w:t>
+      </w:r>
+      <w:r>
+        <w:t>[</w:t>
+      </w:r>
+      <w:r>
+        <w:rPr>
+          <w:i/>
+          <w:iCs/>
+        </w:rPr>
+        <w:t>Mohammad]</w:t>
       </w:r>
     </w:p>
     <w:p>
@@ -5362,10 +5870,19 @@
         <w:adjustRightInd w:val="0"/>
         <w:spacing w:after="0" w:line="240" w:lineRule="auto"/>
         <w:rPr>
+          <w:rFonts w:ascii="LMRoman12-Bold" w:eastAsia="LMRoman12-Bold" w:cs="LMRoman12-Bold"/>
+          <w:b/>
+          <w:bCs/>
+          <w:kern w:val="0"/>
+        </w:rPr>
+      </w:pPr>
+      <w:r>
+        <w:rPr>
           <w:rFonts w:ascii="LMRoman12-Regular" w:eastAsia="LMRoman12-Regular" w:cs="LMRoman12-Regular"/>
           <w:kern w:val="0"/>
         </w:rPr>
-      </w:pPr>
+        <w:t xml:space="preserve">List all patients who underwent a </w:t>
+      </w:r>
       <w:r>
         <w:rPr>
           <w:rFonts w:ascii="LMRoman12-Bold" w:eastAsia="LMRoman12-Bold" w:cs="LMRoman12-Bold"/>
@@ -5373,6 +5890,1217 @@
           <w:bCs/>
           <w:kern w:val="0"/>
         </w:rPr>
+        <w:t>surgical procedure before entering an ICU or</w:t>
+      </w:r>
+    </w:p>
+    <w:p>
+      <w:pPr>
+        <w:autoSpaceDE w:val="0"/>
+        <w:autoSpaceDN w:val="0"/>
+        <w:adjustRightInd w:val="0"/>
+        <w:spacing w:after="0" w:line="240" w:lineRule="auto"/>
+        <w:rPr>
+          <w:rFonts w:ascii="LMRoman12-Regular" w:eastAsia="LMRoman12-Regular" w:cs="LMRoman12-Regular"/>
+          <w:kern w:val="0"/>
+        </w:rPr>
+      </w:pPr>
+      <w:r>
+        <w:rPr>
+          <w:rFonts w:ascii="LMRoman12-Bold" w:eastAsia="LMRoman12-Bold" w:cs="LMRoman12-Bold"/>
+          <w:b/>
+          <w:bCs/>
+          <w:kern w:val="0"/>
+        </w:rPr>
+        <w:t xml:space="preserve">CCU </w:t>
+      </w:r>
+      <w:r>
+        <w:rPr>
+          <w:rFonts w:ascii="LMRoman12-Regular" w:eastAsia="LMRoman12-Regular" w:cs="LMRoman12-Regular"/>
+          <w:kern w:val="0"/>
+        </w:rPr>
+        <w:t xml:space="preserve">during the same admission. Display the </w:t>
+      </w:r>
+      <w:r>
+        <w:rPr>
+          <w:rFonts w:ascii="LMRoman12-Regular" w:eastAsia="LMRoman12-Regular" w:cs="LMRoman12-Regular"/>
+          <w:kern w:val="0"/>
+        </w:rPr>
+        <w:t>patient</w:t>
+      </w:r>
+      <w:r>
+        <w:rPr>
+          <w:rFonts w:ascii="LMRoman12-Regular" w:eastAsia="LMRoman12-Regular" w:cs="LMRoman12-Regular"/>
+          <w:kern w:val="0"/>
+        </w:rPr>
+        <w:t>’</w:t>
+      </w:r>
+      <w:r>
+        <w:rPr>
+          <w:rFonts w:ascii="LMRoman12-Regular" w:eastAsia="LMRoman12-Regular" w:cs="LMRoman12-Regular"/>
+          <w:kern w:val="0"/>
+        </w:rPr>
+        <w:t>s</w:t>
+      </w:r>
+      <w:r>
+        <w:rPr>
+          <w:rFonts w:ascii="LMRoman12-Regular" w:eastAsia="LMRoman12-Regular" w:cs="LMRoman12-Regular"/>
+          <w:kern w:val="0"/>
+        </w:rPr>
+        <w:t xml:space="preserve"> name, procedure date and </w:t>
+      </w:r>
+      <w:r>
+        <w:rPr>
+          <w:rFonts w:ascii="LMRoman12-Regular" w:eastAsia="LMRoman12-Regular" w:cs="LMRoman12-Regular"/>
+          <w:kern w:val="0"/>
+        </w:rPr>
+        <w:t>time, critical</w:t>
+      </w:r>
+      <w:r>
+        <w:rPr>
+          <w:rFonts w:ascii="LMRoman12-Regular" w:eastAsia="LMRoman12-Regular" w:cs="LMRoman12-Regular"/>
+          <w:kern w:val="0"/>
+        </w:rPr>
+        <w:t xml:space="preserve"> care unit type, and unit entry time.</w:t>
+      </w:r>
+    </w:p>
+    <w:p>
+      <w:pPr>
+        <w:autoSpaceDE w:val="0"/>
+        <w:autoSpaceDN w:val="0"/>
+        <w:adjustRightInd w:val="0"/>
+        <w:spacing w:after="0" w:line="240" w:lineRule="auto"/>
+        <w:rPr>
+          <w:rFonts w:ascii="LMRoman12-Regular" w:eastAsia="LMRoman12-Regular" w:cs="LMRoman12-Regular"/>
+          <w:b/>
+          <w:bCs/>
+          <w:kern w:val="0"/>
+        </w:rPr>
+      </w:pPr>
+      <w:r>
+        <w:rPr>
+          <w:rFonts w:ascii="LMRoman12-Regular" w:eastAsia="LMRoman12-Regular" w:cs="LMRoman12-Regular"/>
+          <w:b/>
+          <w:bCs/>
+          <w:kern w:val="0"/>
+        </w:rPr>
+        <w:t>Query:</w:t>
+      </w:r>
+    </w:p>
+    <w:p>
+      <w:pPr>
+        <w:autoSpaceDE w:val="0"/>
+        <w:autoSpaceDN w:val="0"/>
+        <w:adjustRightInd w:val="0"/>
+        <w:spacing w:after="0" w:line="240" w:lineRule="auto"/>
+        <w:rPr>
+          <w:rFonts w:ascii="LMRoman12-Regular" w:eastAsia="LMRoman12-Regular" w:cs="LMRoman12-Regular"/>
+          <w:b/>
+          <w:bCs/>
+          <w:kern w:val="0"/>
+        </w:rPr>
+      </w:pPr>
+      <w:r>
+        <w:rPr>
+          <w:rFonts w:ascii="LMRoman12-Regular" w:eastAsia="LMRoman12-Regular" w:cs="LMRoman12-Regular"/>
+          <w:b/>
+          <w:bCs/>
+          <w:kern w:val="0"/>
+        </w:rPr>
+        <w:drawing>
+          <wp:inline distT="0" distB="0" distL="0" distR="0" wp14:anchorId="6EC597A2" wp14:editId="20780C56">
+            <wp:extent cx="5943600" cy="1496060"/>
+            <wp:effectExtent l="19050" t="19050" r="19050" b="27940"/>
+            <wp:docPr id="1138296361" name="Picture 1"/>
+            <wp:cNvGraphicFramePr>
+              <a:graphicFrameLocks xmlns:a="http://schemas.openxmlformats.org/drawingml/2006/main" noChangeAspect="1"/>
+            </wp:cNvGraphicFramePr>
+            <a:graphic xmlns:a="http://schemas.openxmlformats.org/drawingml/2006/main">
+              <a:graphicData uri="http://schemas.openxmlformats.org/drawingml/2006/picture">
+                <pic:pic xmlns:pic="http://schemas.openxmlformats.org/drawingml/2006/picture">
+                  <pic:nvPicPr>
+                    <pic:cNvPr id="1138296361" name=""/>
+                    <pic:cNvPicPr/>
+                  </pic:nvPicPr>
+                  <pic:blipFill>
+                    <a:blip r:embed="rId15"/>
+                    <a:stretch>
+                      <a:fillRect/>
+                    </a:stretch>
+                  </pic:blipFill>
+                  <pic:spPr>
+                    <a:xfrm>
+                      <a:off x="0" y="0"/>
+                      <a:ext cx="5943600" cy="1496060"/>
+                    </a:xfrm>
+                    <a:prstGeom prst="rect">
+                      <a:avLst/>
+                    </a:prstGeom>
+                    <a:ln>
+                      <a:solidFill>
+                        <a:schemeClr val="tx1"/>
+                      </a:solidFill>
+                    </a:ln>
+                  </pic:spPr>
+                </pic:pic>
+              </a:graphicData>
+            </a:graphic>
+          </wp:inline>
+        </w:drawing>
+      </w:r>
+    </w:p>
+    <w:p>
+      <w:pPr>
+        <w:autoSpaceDE w:val="0"/>
+        <w:autoSpaceDN w:val="0"/>
+        <w:adjustRightInd w:val="0"/>
+        <w:spacing w:after="0" w:line="240" w:lineRule="auto"/>
+        <w:rPr>
+          <w:rFonts w:ascii="LMRoman12-Regular" w:eastAsia="LMRoman12-Regular" w:cs="LMRoman12-Regular"/>
+          <w:b/>
+          <w:bCs/>
+          <w:kern w:val="0"/>
+        </w:rPr>
+      </w:pPr>
+      <w:r>
+        <w:rPr>
+          <w:rFonts w:ascii="LMRoman12-Regular" w:eastAsia="LMRoman12-Regular" w:cs="LMRoman12-Regular"/>
+          <w:b/>
+          <w:bCs/>
+          <w:kern w:val="0"/>
+        </w:rPr>
+        <w:t>Output:</w:t>
+      </w:r>
+    </w:p>
+    <w:p>
+      <w:pPr>
+        <w:autoSpaceDE w:val="0"/>
+        <w:autoSpaceDN w:val="0"/>
+        <w:adjustRightInd w:val="0"/>
+        <w:spacing w:after="0" w:line="240" w:lineRule="auto"/>
+        <w:rPr>
+          <w:rFonts w:ascii="LMRoman12-Regular" w:eastAsia="LMRoman12-Regular" w:cs="LMRoman12-Regular"/>
+          <w:b/>
+          <w:bCs/>
+          <w:kern w:val="0"/>
+        </w:rPr>
+      </w:pPr>
+      <w:r>
+        <w:rPr>
+          <w:rFonts w:ascii="LMRoman12-Regular" w:eastAsia="LMRoman12-Regular" w:cs="LMRoman12-Regular"/>
+          <w:b/>
+          <w:bCs/>
+          <w:kern w:val="0"/>
+        </w:rPr>
+        <w:drawing>
+          <wp:inline distT="0" distB="0" distL="0" distR="0" wp14:anchorId="3A3D9AA0" wp14:editId="45445FF4">
+            <wp:extent cx="5943600" cy="605790"/>
+            <wp:effectExtent l="19050" t="19050" r="19050" b="22860"/>
+            <wp:docPr id="1296749761" name="Picture 1"/>
+            <wp:cNvGraphicFramePr>
+              <a:graphicFrameLocks xmlns:a="http://schemas.openxmlformats.org/drawingml/2006/main" noChangeAspect="1"/>
+            </wp:cNvGraphicFramePr>
+            <a:graphic xmlns:a="http://schemas.openxmlformats.org/drawingml/2006/main">
+              <a:graphicData uri="http://schemas.openxmlformats.org/drawingml/2006/picture">
+                <pic:pic xmlns:pic="http://schemas.openxmlformats.org/drawingml/2006/picture">
+                  <pic:nvPicPr>
+                    <pic:cNvPr id="1296749761" name=""/>
+                    <pic:cNvPicPr/>
+                  </pic:nvPicPr>
+                  <pic:blipFill>
+                    <a:blip r:embed="rId16"/>
+                    <a:stretch>
+                      <a:fillRect/>
+                    </a:stretch>
+                  </pic:blipFill>
+                  <pic:spPr>
+                    <a:xfrm>
+                      <a:off x="0" y="0"/>
+                      <a:ext cx="5943600" cy="605790"/>
+                    </a:xfrm>
+                    <a:prstGeom prst="rect">
+                      <a:avLst/>
+                    </a:prstGeom>
+                    <a:ln>
+                      <a:solidFill>
+                        <a:schemeClr val="tx1"/>
+                      </a:solidFill>
+                    </a:ln>
+                  </pic:spPr>
+                </pic:pic>
+              </a:graphicData>
+            </a:graphic>
+          </wp:inline>
+        </w:drawing>
+      </w:r>
+    </w:p>
+    <w:p>
+      <w:pPr>
+        <w:autoSpaceDE w:val="0"/>
+        <w:autoSpaceDN w:val="0"/>
+        <w:adjustRightInd w:val="0"/>
+        <w:spacing w:after="0" w:line="240" w:lineRule="auto"/>
+        <w:rPr>
+          <w:rFonts w:ascii="LMRoman12-Regular" w:eastAsia="LMRoman12-Regular" w:cs="LMRoman12-Regular"/>
+          <w:b/>
+          <w:bCs/>
+          <w:kern w:val="0"/>
+        </w:rPr>
+      </w:pPr>
+      <w:r>
+        <w:rPr>
+          <w:rFonts w:ascii="LMRoman12-Regular" w:eastAsia="LMRoman12-Regular" w:cs="LMRoman12-Regular"/>
+          <w:b/>
+          <w:bCs/>
+          <w:kern w:val="0"/>
+        </w:rPr>
+        <w:t>Logic:</w:t>
+      </w:r>
+    </w:p>
+    <w:p>
+      <w:pPr>
+        <w:autoSpaceDE w:val="0"/>
+        <w:autoSpaceDN w:val="0"/>
+        <w:adjustRightInd w:val="0"/>
+        <w:spacing w:after="0" w:line="240" w:lineRule="auto"/>
+        <w:rPr>
+          <w:rFonts w:ascii="LMRoman12-Regular" w:eastAsia="LMRoman12-Regular" w:cs="LMRoman12-Regular"/>
+          <w:b/>
+          <w:bCs/>
+          <w:kern w:val="0"/>
+        </w:rPr>
+      </w:pPr>
+    </w:p>
+    <w:p>
+      <w:pPr>
+        <w:rPr>
+          <w:b/>
+          <w:bCs/>
+        </w:rPr>
+      </w:pPr>
+      <w:r>
+        <w:rPr>
+          <w:b/>
+          <w:bCs/>
+        </w:rPr>
+        <w:br w:type="page"/>
+      </w:r>
+    </w:p>
+    <w:p>
+      <w:pPr>
+        <w:rPr>
+          <w:i/>
+          <w:iCs/>
+        </w:rPr>
+      </w:pPr>
+      <w:r>
+        <w:rPr>
+          <w:b/>
+          <w:bCs/>
+        </w:rPr>
+        <w:lastRenderedPageBreak/>
+        <w:t>Q1</w:t>
+      </w:r>
+      <w:r>
+        <w:rPr>
+          <w:b/>
+          <w:bCs/>
+        </w:rPr>
+        <w:t>1</w:t>
+      </w:r>
+      <w:r>
+        <w:rPr>
+          <w:b/>
+          <w:bCs/>
+        </w:rPr>
+        <w:t xml:space="preserve">: </w:t>
+      </w:r>
+      <w:r>
+        <w:t>[</w:t>
+      </w:r>
+      <w:r>
+        <w:rPr>
+          <w:i/>
+          <w:iCs/>
+        </w:rPr>
+        <w:t>Mohammad]</w:t>
+      </w:r>
+    </w:p>
+    <w:p>
+      <w:pPr>
+        <w:autoSpaceDE w:val="0"/>
+        <w:autoSpaceDN w:val="0"/>
+        <w:adjustRightInd w:val="0"/>
+        <w:spacing w:after="0" w:line="240" w:lineRule="auto"/>
+        <w:rPr>
+          <w:rFonts w:ascii="LMRoman12-Bold" w:eastAsia="LMRoman12-Bold" w:cs="LMRoman12-Bold"/>
+          <w:b/>
+          <w:bCs/>
+          <w:kern w:val="0"/>
+        </w:rPr>
+      </w:pPr>
+      <w:r>
+        <w:rPr>
+          <w:rFonts w:ascii="LMRoman12-Regular" w:eastAsia="LMRoman12-Regular" w:cs="LMRoman12-Regular"/>
+          <w:kern w:val="0"/>
+        </w:rPr>
+        <w:t xml:space="preserve">Retrieve the name of each patient and the </w:t>
+      </w:r>
+      <w:r>
+        <w:rPr>
+          <w:rFonts w:ascii="LMRoman12-Bold" w:eastAsia="LMRoman12-Bold" w:cs="LMRoman12-Bold"/>
+          <w:b/>
+          <w:bCs/>
+          <w:kern w:val="0"/>
+        </w:rPr>
+        <w:t>total number of radiology examinations</w:t>
+      </w:r>
+    </w:p>
+    <w:p>
+      <w:pPr>
+        <w:autoSpaceDE w:val="0"/>
+        <w:autoSpaceDN w:val="0"/>
+        <w:adjustRightInd w:val="0"/>
+        <w:spacing w:after="0" w:line="240" w:lineRule="auto"/>
+        <w:rPr>
+          <w:rFonts w:ascii="LMRoman12-Regular" w:eastAsia="LMRoman12-Regular" w:cs="LMRoman12-Regular"/>
+          <w:kern w:val="0"/>
+        </w:rPr>
+      </w:pPr>
+      <w:r>
+        <w:rPr>
+          <w:rFonts w:ascii="LMRoman12-Regular" w:eastAsia="LMRoman12-Regular" w:cs="LMRoman12-Regular"/>
+          <w:kern w:val="0"/>
+        </w:rPr>
+        <w:t xml:space="preserve">received across all admissions. </w:t>
+      </w:r>
+      <w:r>
+        <w:rPr>
+          <w:rFonts w:ascii="LMRoman12-Regular" w:eastAsia="LMRoman12-Regular" w:cs="LMRoman12-Regular"/>
+          <w:kern w:val="0"/>
+        </w:rPr>
+        <w:t>Including</w:t>
+      </w:r>
+      <w:r>
+        <w:rPr>
+          <w:rFonts w:ascii="LMRoman12-Regular" w:eastAsia="LMRoman12-Regular" w:cs="LMRoman12-Regular"/>
+          <w:kern w:val="0"/>
+        </w:rPr>
+        <w:t xml:space="preserve"> patients who have not received any radiology</w:t>
+      </w:r>
+      <w:r>
+        <w:rPr>
+          <w:rFonts w:ascii="LMRoman12-Regular" w:eastAsia="LMRoman12-Regular" w:cs="LMRoman12-Regular"/>
+          <w:kern w:val="0"/>
+        </w:rPr>
+        <w:t xml:space="preserve"> </w:t>
+      </w:r>
+      <w:r>
+        <w:rPr>
+          <w:rFonts w:ascii="LMRoman12-Regular" w:eastAsia="LMRoman12-Regular" w:cs="LMRoman12-Regular"/>
+          <w:kern w:val="0"/>
+        </w:rPr>
+        <w:t>examinations and display zero for their examination count.</w:t>
+      </w:r>
+    </w:p>
+    <w:p>
+      <w:pPr>
+        <w:rPr>
+          <w:b/>
+          <w:bCs/>
+          <w:i/>
+          <w:iCs/>
+        </w:rPr>
+      </w:pPr>
+      <w:r>
+        <w:rPr>
+          <w:b/>
+          <w:bCs/>
+          <w:i/>
+          <w:iCs/>
+        </w:rPr>
+        <w:t>Query:</w:t>
+      </w:r>
+    </w:p>
+    <w:p>
+      <w:pPr>
+        <w:rPr>
+          <w:b/>
+          <w:bCs/>
+          <w:i/>
+          <w:iCs/>
+        </w:rPr>
+      </w:pPr>
+      <w:r>
+        <w:rPr>
+          <w:b/>
+          <w:bCs/>
+          <w:i/>
+          <w:iCs/>
+        </w:rPr>
+        <w:drawing>
+          <wp:inline distT="0" distB="0" distL="0" distR="0" wp14:anchorId="6C18B240" wp14:editId="5A172C40">
+            <wp:extent cx="4394514" cy="1532607"/>
+            <wp:effectExtent l="19050" t="19050" r="25400" b="10795"/>
+            <wp:docPr id="3563593" name="Picture 1"/>
+            <wp:cNvGraphicFramePr>
+              <a:graphicFrameLocks xmlns:a="http://schemas.openxmlformats.org/drawingml/2006/main" noChangeAspect="1"/>
+            </wp:cNvGraphicFramePr>
+            <a:graphic xmlns:a="http://schemas.openxmlformats.org/drawingml/2006/main">
+              <a:graphicData uri="http://schemas.openxmlformats.org/drawingml/2006/picture">
+                <pic:pic xmlns:pic="http://schemas.openxmlformats.org/drawingml/2006/picture">
+                  <pic:nvPicPr>
+                    <pic:cNvPr id="3563593" name=""/>
+                    <pic:cNvPicPr/>
+                  </pic:nvPicPr>
+                  <pic:blipFill>
+                    <a:blip r:embed="rId17"/>
+                    <a:stretch>
+                      <a:fillRect/>
+                    </a:stretch>
+                  </pic:blipFill>
+                  <pic:spPr>
+                    <a:xfrm>
+                      <a:off x="0" y="0"/>
+                      <a:ext cx="4438698" cy="1548017"/>
+                    </a:xfrm>
+                    <a:prstGeom prst="rect">
+                      <a:avLst/>
+                    </a:prstGeom>
+                    <a:ln>
+                      <a:solidFill>
+                        <a:schemeClr val="tx1"/>
+                      </a:solidFill>
+                    </a:ln>
+                  </pic:spPr>
+                </pic:pic>
+              </a:graphicData>
+            </a:graphic>
+          </wp:inline>
+        </w:drawing>
+      </w:r>
+    </w:p>
+    <w:p>
+      <w:pPr>
+        <w:rPr>
+          <w:b/>
+          <w:bCs/>
+          <w:i/>
+          <w:iCs/>
+        </w:rPr>
+      </w:pPr>
+      <w:r>
+        <w:rPr>
+          <w:b/>
+          <w:bCs/>
+          <w:i/>
+          <w:iCs/>
+        </w:rPr>
+        <w:t>Output:</w:t>
+      </w:r>
+    </w:p>
+    <w:p>
+      <w:pPr>
+        <w:rPr>
+          <w:b/>
+          <w:bCs/>
+          <w:i/>
+          <w:iCs/>
+        </w:rPr>
+      </w:pPr>
+      <w:r>
+        <w:rPr>
+          <w:b/>
+          <w:bCs/>
+          <w:i/>
+          <w:iCs/>
+        </w:rPr>
+        <w:drawing>
+          <wp:inline distT="0" distB="0" distL="0" distR="0" wp14:anchorId="613EBD55" wp14:editId="00FA2916">
+            <wp:extent cx="4024265" cy="3739642"/>
+            <wp:effectExtent l="0" t="0" r="0" b="0"/>
+            <wp:docPr id="1313505702" name="Picture 1"/>
+            <wp:cNvGraphicFramePr>
+              <a:graphicFrameLocks xmlns:a="http://schemas.openxmlformats.org/drawingml/2006/main" noChangeAspect="1"/>
+            </wp:cNvGraphicFramePr>
+            <a:graphic xmlns:a="http://schemas.openxmlformats.org/drawingml/2006/main">
+              <a:graphicData uri="http://schemas.openxmlformats.org/drawingml/2006/picture">
+                <pic:pic xmlns:pic="http://schemas.openxmlformats.org/drawingml/2006/picture">
+                  <pic:nvPicPr>
+                    <pic:cNvPr id="1313505702" name=""/>
+                    <pic:cNvPicPr/>
+                  </pic:nvPicPr>
+                  <pic:blipFill>
+                    <a:blip r:embed="rId18"/>
+                    <a:stretch>
+                      <a:fillRect/>
+                    </a:stretch>
+                  </pic:blipFill>
+                  <pic:spPr>
+                    <a:xfrm>
+                      <a:off x="0" y="0"/>
+                      <a:ext cx="4046611" cy="3760408"/>
+                    </a:xfrm>
+                    <a:prstGeom prst="rect">
+                      <a:avLst/>
+                    </a:prstGeom>
+                  </pic:spPr>
+                </pic:pic>
+              </a:graphicData>
+            </a:graphic>
+          </wp:inline>
+        </w:drawing>
+      </w:r>
+    </w:p>
+    <w:p>
+      <w:pPr>
+        <w:rPr>
+          <w:b/>
+          <w:bCs/>
+          <w:i/>
+          <w:iCs/>
+        </w:rPr>
+      </w:pPr>
+      <w:r>
+        <w:rPr>
+          <w:b/>
+          <w:bCs/>
+          <w:i/>
+          <w:iCs/>
+        </w:rPr>
+        <w:t>Logic:</w:t>
+      </w:r>
+    </w:p>
+    <w:p>
+      <w:pPr>
+        <w:rPr>
+          <w:b/>
+          <w:bCs/>
+          <w:i/>
+          <w:iCs/>
+        </w:rPr>
+      </w:pPr>
+      <w:r>
+        <w:rPr>
+          <w:b/>
+          <w:bCs/>
+          <w:i/>
+          <w:iCs/>
+        </w:rPr>
+        <w:br w:type="page"/>
+      </w:r>
+    </w:p>
+    <w:p>
+      <w:pPr>
+        <w:rPr>
+          <w:i/>
+          <w:iCs/>
+        </w:rPr>
+      </w:pPr>
+      <w:r>
+        <w:rPr>
+          <w:b/>
+          <w:bCs/>
+        </w:rPr>
+        <w:lastRenderedPageBreak/>
+        <w:t>Q1</w:t>
+      </w:r>
+      <w:r>
+        <w:rPr>
+          <w:b/>
+          <w:bCs/>
+        </w:rPr>
+        <w:t>2</w:t>
+      </w:r>
+      <w:r>
+        <w:rPr>
+          <w:b/>
+          <w:bCs/>
+        </w:rPr>
+        <w:t xml:space="preserve">: </w:t>
+      </w:r>
+      <w:r>
+        <w:t>[</w:t>
+      </w:r>
+      <w:r>
+        <w:rPr>
+          <w:i/>
+          <w:iCs/>
+        </w:rPr>
+        <w:t>Mohammad]</w:t>
+      </w:r>
+    </w:p>
+    <w:p>
+      <w:pPr>
+        <w:autoSpaceDE w:val="0"/>
+        <w:autoSpaceDN w:val="0"/>
+        <w:adjustRightInd w:val="0"/>
+        <w:spacing w:after="0" w:line="240" w:lineRule="auto"/>
+        <w:rPr>
+          <w:rFonts w:ascii="LMRoman12-Regular" w:eastAsia="LMRoman12-Regular" w:cs="LMRoman12-Regular"/>
+          <w:kern w:val="0"/>
+        </w:rPr>
+      </w:pPr>
+      <w:r>
+        <w:rPr>
+          <w:rFonts w:ascii="LMRoman12-Regular" w:eastAsia="LMRoman12-Regular" w:cs="LMRoman12-Regular"/>
+          <w:kern w:val="0"/>
+        </w:rPr>
+        <w:t xml:space="preserve">Find all patients whose </w:t>
+      </w:r>
+      <w:r>
+        <w:rPr>
+          <w:rFonts w:ascii="LMRoman12-Bold" w:eastAsia="LMRoman12-Bold" w:cs="LMRoman12-Bold"/>
+          <w:b/>
+          <w:bCs/>
+          <w:kern w:val="0"/>
+        </w:rPr>
+        <w:t xml:space="preserve">discharge-summary clinical note </w:t>
+      </w:r>
+      <w:r>
+        <w:rPr>
+          <w:rFonts w:ascii="LMRoman12-Regular" w:eastAsia="LMRoman12-Regular" w:cs="LMRoman12-Regular"/>
+          <w:kern w:val="0"/>
+        </w:rPr>
+        <w:t>contains the keyword</w:t>
+      </w:r>
+    </w:p>
+    <w:p>
+      <w:pPr>
+        <w:rPr>
+          <w:rFonts w:ascii="LMRoman12-Regular" w:eastAsia="LMRoman12-Regular" w:cs="LMRoman12-Regular"/>
+          <w:kern w:val="0"/>
+        </w:rPr>
+      </w:pPr>
+      <w:r>
+        <w:rPr>
+          <w:rFonts w:ascii="LMRoman12-Regular" w:eastAsia="LMRoman12-Regular" w:cs="LMRoman12-Regular" w:hint="eastAsia"/>
+          <w:kern w:val="0"/>
+        </w:rPr>
+        <w:t>“</w:t>
+      </w:r>
+      <w:r>
+        <w:rPr>
+          <w:rFonts w:ascii="LMRoman12-Regular" w:eastAsia="LMRoman12-Regular" w:cs="LMRoman12-Regular"/>
+          <w:kern w:val="0"/>
+        </w:rPr>
+        <w:t>recovery</w:t>
+      </w:r>
+      <w:r>
+        <w:rPr>
+          <w:rFonts w:ascii="LMRoman12-Regular" w:eastAsia="LMRoman12-Regular" w:cs="LMRoman12-Regular" w:hint="eastAsia"/>
+          <w:kern w:val="0"/>
+        </w:rPr>
+        <w:t>”</w:t>
+      </w:r>
+      <w:r>
+        <w:rPr>
+          <w:rFonts w:ascii="LMRoman12-Regular" w:eastAsia="LMRoman12-Regular" w:cs="LMRoman12-Regular"/>
+          <w:kern w:val="0"/>
+        </w:rPr>
+        <w:t>. The search should be case-insensitive.</w:t>
+      </w:r>
+    </w:p>
+    <w:p>
+      <w:pPr>
+        <w:rPr>
+          <w:rFonts w:ascii="LMRoman12-Regular" w:eastAsia="LMRoman12-Regular" w:cs="LMRoman12-Regular"/>
+          <w:b/>
+          <w:bCs/>
+          <w:kern w:val="0"/>
+        </w:rPr>
+      </w:pPr>
+      <w:r>
+        <w:rPr>
+          <w:rFonts w:ascii="LMRoman12-Regular" w:eastAsia="LMRoman12-Regular" w:cs="LMRoman12-Regular"/>
+          <w:b/>
+          <w:bCs/>
+          <w:kern w:val="0"/>
+        </w:rPr>
+        <w:t>Query:</w:t>
+      </w:r>
+    </w:p>
+    <w:p>
+      <w:pPr>
+        <w:rPr>
+          <w:rFonts w:ascii="LMRoman12-Regular" w:eastAsia="LMRoman12-Regular" w:cs="LMRoman12-Regular"/>
+          <w:b/>
+          <w:bCs/>
+          <w:kern w:val="0"/>
+        </w:rPr>
+      </w:pPr>
+      <w:r>
+        <w:rPr>
+          <w:rFonts w:ascii="LMRoman12-Regular" w:eastAsia="LMRoman12-Regular" w:cs="LMRoman12-Regular"/>
+          <w:b/>
+          <w:bCs/>
+          <w:kern w:val="0"/>
+        </w:rPr>
+        <w:drawing>
+          <wp:inline distT="0" distB="0" distL="0" distR="0" wp14:anchorId="56E4B4D1" wp14:editId="725DC865">
+            <wp:extent cx="3885714" cy="1904762"/>
+            <wp:effectExtent l="19050" t="19050" r="19685" b="19685"/>
+            <wp:docPr id="1882226557" name="Picture 1"/>
+            <wp:cNvGraphicFramePr>
+              <a:graphicFrameLocks xmlns:a="http://schemas.openxmlformats.org/drawingml/2006/main" noChangeAspect="1"/>
+            </wp:cNvGraphicFramePr>
+            <a:graphic xmlns:a="http://schemas.openxmlformats.org/drawingml/2006/main">
+              <a:graphicData uri="http://schemas.openxmlformats.org/drawingml/2006/picture">
+                <pic:pic xmlns:pic="http://schemas.openxmlformats.org/drawingml/2006/picture">
+                  <pic:nvPicPr>
+                    <pic:cNvPr id="1882226557" name=""/>
+                    <pic:cNvPicPr/>
+                  </pic:nvPicPr>
+                  <pic:blipFill>
+                    <a:blip r:embed="rId19"/>
+                    <a:stretch>
+                      <a:fillRect/>
+                    </a:stretch>
+                  </pic:blipFill>
+                  <pic:spPr>
+                    <a:xfrm>
+                      <a:off x="0" y="0"/>
+                      <a:ext cx="3885714" cy="1904762"/>
+                    </a:xfrm>
+                    <a:prstGeom prst="rect">
+                      <a:avLst/>
+                    </a:prstGeom>
+                    <a:ln>
+                      <a:solidFill>
+                        <a:schemeClr val="tx1"/>
+                      </a:solidFill>
+                    </a:ln>
+                  </pic:spPr>
+                </pic:pic>
+              </a:graphicData>
+            </a:graphic>
+          </wp:inline>
+        </w:drawing>
+      </w:r>
+    </w:p>
+    <w:p>
+      <w:pPr>
+        <w:rPr>
+          <w:b/>
+          <w:bCs/>
+          <w:i/>
+          <w:iCs/>
+        </w:rPr>
+      </w:pPr>
+      <w:r>
+        <w:rPr>
+          <w:rFonts w:ascii="LMRoman12-Regular" w:eastAsia="LMRoman12-Regular" w:cs="LMRoman12-Regular"/>
+          <w:b/>
+          <w:bCs/>
+          <w:kern w:val="0"/>
+        </w:rPr>
+        <w:t>Output:</w:t>
+      </w:r>
+    </w:p>
+    <w:p>
+      <w:r>
+        <w:drawing>
+          <wp:inline distT="0" distB="0" distL="0" distR="0" wp14:anchorId="62A2485F" wp14:editId="1D88EFFB">
+            <wp:extent cx="2349374" cy="2613472"/>
+            <wp:effectExtent l="19050" t="19050" r="13335" b="15875"/>
+            <wp:docPr id="1002388315" name="Picture 1"/>
+            <wp:cNvGraphicFramePr>
+              <a:graphicFrameLocks xmlns:a="http://schemas.openxmlformats.org/drawingml/2006/main" noChangeAspect="1"/>
+            </wp:cNvGraphicFramePr>
+            <a:graphic xmlns:a="http://schemas.openxmlformats.org/drawingml/2006/main">
+              <a:graphicData uri="http://schemas.openxmlformats.org/drawingml/2006/picture">
+                <pic:pic xmlns:pic="http://schemas.openxmlformats.org/drawingml/2006/picture">
+                  <pic:nvPicPr>
+                    <pic:cNvPr id="1002388315" name=""/>
+                    <pic:cNvPicPr/>
+                  </pic:nvPicPr>
+                  <pic:blipFill>
+                    <a:blip r:embed="rId20"/>
+                    <a:stretch>
+                      <a:fillRect/>
+                    </a:stretch>
+                  </pic:blipFill>
+                  <pic:spPr>
+                    <a:xfrm>
+                      <a:off x="0" y="0"/>
+                      <a:ext cx="2362382" cy="2627942"/>
+                    </a:xfrm>
+                    <a:prstGeom prst="rect">
+                      <a:avLst/>
+                    </a:prstGeom>
+                    <a:ln>
+                      <a:solidFill>
+                        <a:schemeClr val="tx1"/>
+                      </a:solidFill>
+                    </a:ln>
+                  </pic:spPr>
+                </pic:pic>
+              </a:graphicData>
+            </a:graphic>
+          </wp:inline>
+        </w:drawing>
+      </w:r>
+    </w:p>
+    <w:p>
+      <w:pPr>
+        <w:rPr>
+          <w:b/>
+          <w:bCs/>
+        </w:rPr>
+      </w:pPr>
+      <w:r>
+        <w:rPr>
+          <w:b/>
+          <w:bCs/>
+        </w:rPr>
+        <w:t>Logic:</w:t>
+      </w:r>
+    </w:p>
+    <w:p>
+      <w:pPr>
+        <w:rPr>
+          <w:b/>
+          <w:bCs/>
+        </w:rPr>
+      </w:pPr>
+      <w:r>
+        <w:rPr>
+          <w:b/>
+          <w:bCs/>
+        </w:rPr>
+        <w:br w:type="page"/>
+      </w:r>
+    </w:p>
+    <w:p>
+      <w:r>
+        <w:rPr>
+          <w:b/>
+        </w:rPr>
+        <w:lastRenderedPageBreak/>
+        <w:t>Q</w:t>
+      </w:r>
+      <w:r>
+        <w:rPr>
+          <w:b/>
+        </w:rPr>
+        <w:t>13</w:t>
+      </w:r>
+      <w:r>
+        <w:rPr>
+          <w:b/>
+        </w:rPr>
+        <w:t xml:space="preserve">: </w:t>
+      </w:r>
+      <w:r>
+        <w:t>[</w:t>
+      </w:r>
+      <w:r>
+        <w:t>Laurent</w:t>
+      </w:r>
+      <w:r>
+        <w:rPr>
+          <w:i/>
+          <w:iCs/>
+        </w:rPr>
+        <w:t>]</w:t>
+      </w:r>
+    </w:p>
+    <w:p>
+      <w:r>
+        <w:t xml:space="preserve">  </w:t>
+      </w:r>
+      <w:r>
+        <w:rPr>
+          <w:i/>
+          <w:iCs/>
+        </w:rPr>
+        <w:t xml:space="preserve">[insert </w:t>
+      </w:r>
+      <w:r>
+        <w:rPr>
+          <w:i/>
+        </w:rPr>
+        <w:t>screenshot</w:t>
+      </w:r>
+      <w:r>
+        <w:rPr>
+          <w:i/>
+          <w:iCs/>
+        </w:rPr>
+        <w:t>]</w:t>
+      </w:r>
+    </w:p>
+    <w:p>
+      <w:r>
+        <w:t xml:space="preserve">Explanation: </w:t>
+      </w:r>
+      <w:r>
+        <w:rPr>
+          <w:i/>
+          <w:iCs/>
+        </w:rPr>
+        <w:t>[summarize the query logic and key result]</w:t>
+      </w:r>
+    </w:p>
+    <w:p>
+      <w:pPr>
+        <w:rPr>
+          <w:i/>
+          <w:iCs/>
+          <w:lang w:val="fr-FR"/>
+        </w:rPr>
+      </w:pPr>
+      <w:r>
+        <w:rPr>
+          <w:b/>
+          <w:lang w:val="fr-FR"/>
+        </w:rPr>
+        <w:t>Q</w:t>
+      </w:r>
+      <w:r>
+        <w:rPr>
+          <w:b/>
+          <w:lang w:val="fr-FR"/>
+        </w:rPr>
+        <w:t>14</w:t>
+      </w:r>
+      <w:r>
+        <w:rPr>
+          <w:b/>
+          <w:lang w:val="fr-FR"/>
+        </w:rPr>
+        <w:t xml:space="preserve"> :</w:t>
+      </w:r>
+      <w:r>
+        <w:rPr>
+          <w:b/>
+          <w:lang w:val="fr-FR"/>
+        </w:rPr>
+        <w:t xml:space="preserve"> </w:t>
+      </w:r>
+      <w:r>
+        <w:rPr>
+          <w:lang w:val="fr-FR"/>
+        </w:rPr>
+        <w:t>[</w:t>
+      </w:r>
+      <w:r>
+        <w:rPr>
+          <w:lang w:val="fr-FR"/>
+        </w:rPr>
+        <w:t>Laurent</w:t>
+      </w:r>
+      <w:r>
+        <w:rPr>
+          <w:i/>
+          <w:iCs/>
+          <w:lang w:val="fr-FR"/>
+        </w:rPr>
+        <w:t>]</w:t>
+      </w:r>
+    </w:p>
+    <w:p>
+      <w:pPr>
+        <w:rPr>
+          <w:lang w:val="fr-FR"/>
+        </w:rPr>
+      </w:pPr>
+      <w:r>
+        <w:rPr>
+          <w:b/>
+          <w:lang w:val="fr-FR"/>
+        </w:rPr>
+        <w:t>Q</w:t>
+      </w:r>
+      <w:r>
+        <w:rPr>
+          <w:b/>
+          <w:lang w:val="fr-FR"/>
+        </w:rPr>
+        <w:t>15</w:t>
+      </w:r>
+      <w:r>
+        <w:rPr>
+          <w:b/>
+          <w:lang w:val="fr-FR"/>
+        </w:rPr>
+        <w:t xml:space="preserve"> :</w:t>
+      </w:r>
+      <w:r>
+        <w:rPr>
+          <w:b/>
+          <w:lang w:val="fr-FR"/>
+        </w:rPr>
+        <w:t xml:space="preserve"> </w:t>
+      </w:r>
+      <w:r>
+        <w:rPr>
+          <w:lang w:val="fr-FR"/>
+        </w:rPr>
+        <w:t>[</w:t>
+      </w:r>
+      <w:r>
+        <w:rPr>
+          <w:lang w:val="fr-FR"/>
+        </w:rPr>
+        <w:t>Laurent</w:t>
+      </w:r>
+      <w:r>
+        <w:rPr>
+          <w:i/>
+          <w:iCs/>
+          <w:lang w:val="fr-FR"/>
+        </w:rPr>
+        <w:t>]</w:t>
+      </w:r>
+    </w:p>
+    <w:p>
+      <w:pPr>
+        <w:rPr>
+          <w:i/>
+          <w:iCs/>
+          <w:lang w:val="fr-FR"/>
+        </w:rPr>
+      </w:pPr>
+      <w:r>
+        <w:rPr>
+          <w:b/>
+          <w:lang w:val="fr-FR"/>
+        </w:rPr>
+        <w:t>Q</w:t>
+      </w:r>
+      <w:r>
+        <w:rPr>
+          <w:b/>
+          <w:lang w:val="fr-FR"/>
+        </w:rPr>
+        <w:t>16</w:t>
+      </w:r>
+      <w:r>
+        <w:rPr>
+          <w:b/>
+          <w:lang w:val="fr-FR"/>
+        </w:rPr>
+        <w:t xml:space="preserve"> :</w:t>
+      </w:r>
+      <w:r>
+        <w:rPr>
+          <w:b/>
+          <w:lang w:val="fr-FR"/>
+        </w:rPr>
+        <w:t xml:space="preserve"> </w:t>
+      </w:r>
+      <w:r>
+        <w:rPr>
+          <w:lang w:val="fr-FR"/>
+        </w:rPr>
+        <w:t>[</w:t>
+      </w:r>
+      <w:r>
+        <w:rPr>
+          <w:lang w:val="fr-FR"/>
+        </w:rPr>
+        <w:t>Laurent</w:t>
+      </w:r>
+      <w:r>
+        <w:rPr>
+          <w:i/>
+          <w:iCs/>
+          <w:lang w:val="fr-FR"/>
+        </w:rPr>
+        <w:t>]</w:t>
+      </w:r>
+    </w:p>
+    <w:p>
+      <w:pPr>
+        <w:rPr>
+          <w:b/>
+          <w:bCs/>
+          <w:lang w:val="fr-FR"/>
+        </w:rPr>
+      </w:pPr>
+      <w:r>
+        <w:rPr>
+          <w:b/>
+          <w:bCs/>
+          <w:lang w:val="fr-FR"/>
+        </w:rPr>
+        <w:br w:type="page"/>
+      </w:r>
+    </w:p>
+    <w:p>
+      <w:pPr>
+        <w:rPr>
+          <w:b/>
+          <w:bCs/>
+          <w:lang w:val="fr-FR"/>
+        </w:rPr>
+      </w:pPr>
+    </w:p>
+    <w:p>
+      <w:r>
+        <w:t>Q17</w:t>
+      </w:r>
+      <w:r>
+        <w:t xml:space="preserve">: </w:t>
+      </w:r>
+      <w:r>
+        <w:t>[</w:t>
+      </w:r>
+      <w:r>
+        <w:t>Freddy Mvemba</w:t>
+      </w:r>
+      <w:r>
+        <w:t>]</w:t>
+      </w:r>
+    </w:p>
+    <w:p>
+      <w:pPr>
+        <w:autoSpaceDE w:val="0"/>
+        <w:autoSpaceDN w:val="0"/>
+        <w:adjustRightInd w:val="0"/>
+        <w:spacing w:after="0" w:line="240" w:lineRule="auto"/>
+        <w:rPr>
+          <w:rFonts w:ascii="LMRoman12-Bold" w:eastAsia="LMRoman12-Bold" w:cs="LMRoman12-Bold"/>
+          <w:b/>
+          <w:bCs/>
+          <w:kern w:val="0"/>
+        </w:rPr>
+      </w:pPr>
+      <w:r>
+        <w:rPr>
+          <w:rFonts w:ascii="LMRoman12-Regular" w:eastAsia="LMRoman12-Regular" w:cs="LMRoman12-Regular"/>
+          <w:kern w:val="0"/>
+        </w:rPr>
+        <w:t xml:space="preserve">Find all admissions during which the patient received </w:t>
+      </w:r>
+      <w:r>
+        <w:rPr>
+          <w:rFonts w:ascii="LMRoman12-Bold" w:eastAsia="LMRoman12-Bold" w:cs="LMRoman12-Bold"/>
+          <w:b/>
+          <w:bCs/>
+          <w:kern w:val="0"/>
+        </w:rPr>
+        <w:t>more than one distinct ICD-</w:t>
+      </w:r>
+    </w:p>
+    <w:p>
+      <w:pPr>
+        <w:autoSpaceDE w:val="0"/>
+        <w:autoSpaceDN w:val="0"/>
+        <w:adjustRightInd w:val="0"/>
+        <w:spacing w:after="0" w:line="240" w:lineRule="auto"/>
+        <w:rPr>
+          <w:rFonts w:ascii="LMRoman12-Regular" w:eastAsia="LMRoman12-Regular" w:cs="LMRoman12-Regular"/>
+          <w:kern w:val="0"/>
+        </w:rPr>
+      </w:pPr>
+      <w:r>
+        <w:rPr>
+          <w:rFonts w:ascii="LMRoman12-Bold" w:eastAsia="LMRoman12-Bold" w:cs="LMRoman12-Bold"/>
+          <w:b/>
+          <w:bCs/>
+          <w:kern w:val="0"/>
+        </w:rPr>
         <w:t xml:space="preserve">9 </w:t>
       </w:r>
       <w:r>
@@ -5442,6 +7170,21 @@
           <w:kern w:val="0"/>
         </w:rPr>
         <w:t>ICD-9 codes.</w:t>
+      </w:r>
+    </w:p>
+    <w:p>
+      <w:pPr>
+        <w:rPr>
+          <w:rFonts w:ascii="LMRoman12-Regular" w:eastAsia="LMRoman12-Regular" w:cs="LMRoman12-Regular"/>
+          <w:kern w:val="0"/>
+        </w:rPr>
+      </w:pPr>
+      <w:r>
+        <w:rPr>
+          <w:rFonts w:ascii="LMRoman12-Regular" w:eastAsia="LMRoman12-Regular" w:cs="LMRoman12-Regular"/>
+          <w:kern w:val="0"/>
+        </w:rPr>
+        <w:t>Query:</w:t>
       </w:r>
     </w:p>
     <w:p>
@@ -5465,7 +7208,7 @@
                     <pic:cNvPicPr/>
                   </pic:nvPicPr>
                   <pic:blipFill>
-                    <a:blip r:embed="rId13"/>
+                    <a:blip r:embed="rId21"/>
                     <a:stretch>
                       <a:fillRect/>
                     </a:stretch>
@@ -5493,6 +7236,11 @@
     </w:p>
     <w:p>
       <w:r>
+        <w:t>Output</w:t>
+      </w:r>
+    </w:p>
+    <w:p>
+      <w:r>
         <w:rPr>
           <w:noProof/>
         </w:rPr>
@@ -5512,7 +7260,7 @@
                     <pic:cNvPicPr/>
                   </pic:nvPicPr>
                   <pic:blipFill rotWithShape="1">
-                    <a:blip r:embed="rId14"/>
+                    <a:blip r:embed="rId22"/>
                     <a:srcRect l="-495" r="5930"/>
                     <a:stretch>
                       <a:fillRect/>
@@ -5546,6 +7294,7 @@
     </w:p>
     <w:p>
       <w:r>
+        <w:lastRenderedPageBreak/>
         <w:t xml:space="preserve">Logic: </w:t>
       </w:r>
       <w:r>
@@ -5650,7 +7399,7 @@
                     <pic:cNvPicPr/>
                   </pic:nvPicPr>
                   <pic:blipFill>
-                    <a:blip r:embed="rId15"/>
+                    <a:blip r:embed="rId23"/>
                     <a:stretch>
                       <a:fillRect/>
                     </a:stretch>
@@ -5697,7 +7446,7 @@
                     <pic:cNvPicPr/>
                   </pic:nvPicPr>
                   <pic:blipFill>
-                    <a:blip r:embed="rId16"/>
+                    <a:blip r:embed="rId24"/>
                     <a:stretch>
                       <a:fillRect/>
                     </a:stretch>
@@ -5879,7 +7628,7 @@
                     <pic:cNvPicPr/>
                   </pic:nvPicPr>
                   <pic:blipFill>
-                    <a:blip r:embed="rId17"/>
+                    <a:blip r:embed="rId25"/>
                     <a:stretch>
                       <a:fillRect/>
                     </a:stretch>
@@ -5926,7 +7675,7 @@
                     <pic:cNvPicPr/>
                   </pic:nvPicPr>
                   <pic:blipFill>
-                    <a:blip r:embed="rId18"/>
+                    <a:blip r:embed="rId26"/>
                     <a:stretch>
                       <a:fillRect/>
                     </a:stretch>
@@ -6101,7 +7850,7 @@
                     <pic:cNvPicPr/>
                   </pic:nvPicPr>
                   <pic:blipFill>
-                    <a:blip r:embed="rId19"/>
+                    <a:blip r:embed="rId27"/>
                     <a:stretch>
                       <a:fillRect/>
                     </a:stretch>
@@ -6146,7 +7895,7 @@
                     <pic:cNvPicPr/>
                   </pic:nvPicPr>
                   <pic:blipFill>
-                    <a:blip r:embed="rId20"/>
+                    <a:blip r:embed="rId28"/>
                     <a:stretch>
                       <a:fillRect/>
                     </a:stretch>
@@ -6496,7 +8245,7 @@
       </w:r>
     </w:p>
     <w:sectPr>
-      <w:footerReference w:type="default" r:id="rId21"/>
+      <w:footerReference w:type="default" r:id="rId29"/>
       <w:pgSz w:w="12240" w:h="15840"/>
       <w:pgMar w:top="1440" w:right="1440" w:bottom="1440" w:left="1440" w:header="720" w:footer="720" w:gutter="0"/>
       <w:pgNumType w:start="0"/>
@@ -9841,6 +11590,25 @@
     <w:basedOn w:val="DefaultParagraphFont"/>
     <w:rsid w:val="00653058"/>
   </w:style>
+  <w:style w:type="table" w:styleId="TableGrid">
+    <w:name w:val="Table Grid"/>
+    <w:basedOn w:val="TableNormal"/>
+    <w:uiPriority w:val="39"/>
+    <w:rsid w:val="002501AE"/>
+    <w:pPr>
+      <w:spacing w:after="0" w:line="240" w:lineRule="auto"/>
+    </w:pPr>
+    <w:tblPr>
+      <w:tblBorders>
+        <w:top w:val="single" w:sz="4" w:space="0" w:color="auto"/>
+        <w:left w:val="single" w:sz="4" w:space="0" w:color="auto"/>
+        <w:bottom w:val="single" w:sz="4" w:space="0" w:color="auto"/>
+        <w:right w:val="single" w:sz="4" w:space="0" w:color="auto"/>
+        <w:insideH w:val="single" w:sz="4" w:space="0" w:color="auto"/>
+        <w:insideV w:val="single" w:sz="4" w:space="0" w:color="auto"/>
+      </w:tblBorders>
+    </w:tblPr>
+  </w:style>
 </w:styles>
 </file>
 
@@ -10009,6 +11777,7 @@
   <w:rsids>
     <w:rsidRoot w:val="00DD1CA2"/>
     <w:rsid w:val="00017C17"/>
+    <w:rsid w:val="000B592B"/>
     <w:rsid w:val="001461A4"/>
     <w:rsid w:val="00241ED3"/>
     <w:rsid w:val="00246D5C"/>
@@ -10016,6 +11785,7 @@
     <w:rsid w:val="003072A9"/>
     <w:rsid w:val="003958D2"/>
     <w:rsid w:val="004A5179"/>
+    <w:rsid w:val="00500C87"/>
     <w:rsid w:val="005F7401"/>
     <w:rsid w:val="00657D28"/>
     <w:rsid w:val="0068640A"/>

</xml_diff>

<commit_message>
Upate Queries and First Draft Report
</commit_message>
<xml_diff>
--- a/SOEN363_Project_Phase1_TeamName.docx
+++ b/SOEN363_Project_Phase1_TeamName.docx
@@ -2094,10 +2094,10 @@
           <w:noProof/>
         </w:rPr>
         <w:drawing>
-          <wp:inline distT="0" distB="0" distL="0" distR="0" wp14:anchorId="60499106" wp14:editId="7EB61564">
+          <wp:inline distT="0" distB="0" distL="0" distR="0" wp14:anchorId="69D78317" wp14:editId="065E43FC">
             <wp:extent cx="5943600" cy="3350895"/>
-            <wp:effectExtent l="19050" t="19050" r="19050" b="20955"/>
-            <wp:docPr id="601776701" name="Picture 2"/>
+            <wp:effectExtent l="0" t="0" r="0" b="1905"/>
+            <wp:docPr id="1658238473" name="Picture 2"/>
             <wp:cNvGraphicFramePr>
               <a:graphicFrameLocks xmlns:a="http://schemas.openxmlformats.org/drawingml/2006/main" noChangeAspect="1"/>
             </wp:cNvGraphicFramePr>
@@ -2105,7 +2105,7 @@
               <a:graphicData uri="http://schemas.openxmlformats.org/drawingml/2006/picture">
                 <pic:pic xmlns:pic="http://schemas.openxmlformats.org/drawingml/2006/picture">
                   <pic:nvPicPr>
-                    <pic:cNvPr id="601776701" name="Picture 601776701"/>
+                    <pic:cNvPr id="1658238473" name="Picture 1658238473"/>
                     <pic:cNvPicPr/>
                   </pic:nvPicPr>
                   <pic:blipFill>
@@ -2128,11 +2128,6 @@
                     <a:prstGeom prst="rect">
                       <a:avLst/>
                     </a:prstGeom>
-                    <a:ln>
-                      <a:solidFill>
-                        <a:schemeClr val="tx1"/>
-                      </a:solidFill>
-                    </a:ln>
                   </pic:spPr>
                 </pic:pic>
               </a:graphicData>
@@ -5746,61 +5741,7 @@
           <w:sz w:val="22"/>
           <w:szCs w:val="22"/>
         </w:rPr>
-        <w:t xml:space="preserve">. For that we use count on the admission id from the patient </w:t>
-      </w:r>
-      <w:proofErr w:type="gramStart"/>
-      <w:r>
-        <w:rPr>
-          <w:rFonts w:ascii="Arial" w:eastAsia="Arial" w:hAnsi="Arial" w:cs="Arial"/>
-          <w:sz w:val="22"/>
-          <w:szCs w:val="22"/>
-        </w:rPr>
-        <w:t>p</w:t>
-      </w:r>
-      <w:proofErr w:type="gramEnd"/>
-      <w:r>
-        <w:rPr>
-          <w:rFonts w:ascii="Arial" w:eastAsia="Arial" w:hAnsi="Arial" w:cs="Arial"/>
-          <w:sz w:val="22"/>
-          <w:szCs w:val="22"/>
-        </w:rPr>
-        <w:t xml:space="preserve"> and we display </w:t>
-      </w:r>
-      <w:proofErr w:type="gramStart"/>
-      <w:r>
-        <w:rPr>
-          <w:rFonts w:ascii="Arial" w:eastAsia="Arial" w:hAnsi="Arial" w:cs="Arial"/>
-          <w:sz w:val="22"/>
-          <w:szCs w:val="22"/>
-        </w:rPr>
-        <w:t>is</w:t>
-      </w:r>
-      <w:proofErr w:type="gramEnd"/>
-      <w:r>
-        <w:rPr>
-          <w:rFonts w:ascii="Arial" w:eastAsia="Arial" w:hAnsi="Arial" w:cs="Arial"/>
-          <w:sz w:val="22"/>
-          <w:szCs w:val="22"/>
-        </w:rPr>
-        <w:t xml:space="preserve"> as total_admissions. Then we use join to only show the admission where the patient </w:t>
-      </w:r>
-      <w:proofErr w:type="gramStart"/>
-      <w:r>
-        <w:rPr>
-          <w:rFonts w:ascii="Arial" w:eastAsia="Arial" w:hAnsi="Arial" w:cs="Arial"/>
-          <w:sz w:val="22"/>
-          <w:szCs w:val="22"/>
-        </w:rPr>
-        <w:t>id’s</w:t>
-      </w:r>
-      <w:proofErr w:type="gramEnd"/>
-      <w:r>
-        <w:rPr>
-          <w:rFonts w:ascii="Arial" w:eastAsia="Arial" w:hAnsi="Arial" w:cs="Arial"/>
-          <w:sz w:val="22"/>
-          <w:szCs w:val="22"/>
-        </w:rPr>
-        <w:t xml:space="preserve"> are the same. And </w:t>
+        <w:t xml:space="preserve">. For that we use count on the admission id from the patient p and we display is as total_admissions. Then we use join to only show the admission where the patient id’s are the same. And </w:t>
       </w:r>
       <w:r>
         <w:rPr>
@@ -6006,15 +5947,14 @@
       <w:r>
         <w:rPr>
           <w:rFonts w:ascii="Arial" w:eastAsia="Arial" w:hAnsi="Arial" w:cs="Arial"/>
-          <w:noProof/>
           <w:sz w:val="22"/>
           <w:szCs w:val="22"/>
         </w:rPr>
         <w:drawing>
-          <wp:inline distT="0" distB="0" distL="0" distR="0" wp14:anchorId="31BBCB5C" wp14:editId="171BD7CF">
-            <wp:extent cx="5216220" cy="781050"/>
-            <wp:effectExtent l="19050" t="19050" r="22860" b="19050"/>
-            <wp:docPr id="393646094" name="Picture 1"/>
+          <wp:inline distT="0" distB="0" distL="0" distR="0" wp14:anchorId="2AFB8E19" wp14:editId="14C9C114">
+            <wp:extent cx="5456006" cy="1562100"/>
+            <wp:effectExtent l="19050" t="19050" r="11430" b="19050"/>
+            <wp:docPr id="720991908" name="Picture 1"/>
             <wp:cNvGraphicFramePr>
               <a:graphicFrameLocks xmlns:a="http://schemas.openxmlformats.org/drawingml/2006/main" noChangeAspect="1"/>
             </wp:cNvGraphicFramePr>
@@ -6022,7 +5962,7 @@
               <a:graphicData uri="http://schemas.openxmlformats.org/drawingml/2006/picture">
                 <pic:pic xmlns:pic="http://schemas.openxmlformats.org/drawingml/2006/picture">
                   <pic:nvPicPr>
-                    <pic:cNvPr id="393646094" name=""/>
+                    <pic:cNvPr id="720991908" name=""/>
                     <pic:cNvPicPr/>
                   </pic:nvPicPr>
                   <pic:blipFill>
@@ -6034,7 +5974,7 @@
                   <pic:spPr>
                     <a:xfrm>
                       <a:off x="0" y="0"/>
-                      <a:ext cx="5221028" cy="781770"/>
+                      <a:ext cx="5458777" cy="1562893"/>
                     </a:xfrm>
                     <a:prstGeom prst="rect">
                       <a:avLst/>
@@ -6057,14 +5997,13 @@
         <w:spacing w:after="0" w:line="276" w:lineRule="auto"/>
         <w:rPr>
           <w:rFonts w:ascii="Arial" w:eastAsia="Arial" w:hAnsi="Arial" w:cs="Arial"/>
+          <w:b/>
+          <w:bCs/>
           <w:sz w:val="22"/>
           <w:szCs w:val="22"/>
         </w:rPr>
       </w:pPr>
-    </w:p>
-    <w:p>
-      <w:pPr>
-        <w:spacing w:after="0" w:line="276" w:lineRule="auto"/>
+      <w:r>
         <w:rPr>
           <w:rFonts w:ascii="Arial" w:eastAsia="Arial" w:hAnsi="Arial" w:cs="Arial"/>
           <w:b/>
@@ -6072,29 +6011,8 @@
           <w:sz w:val="22"/>
           <w:szCs w:val="22"/>
         </w:rPr>
-      </w:pPr>
-      <w:r>
-        <w:rPr>
-          <w:rFonts w:ascii="Arial" w:eastAsia="Arial" w:hAnsi="Arial" w:cs="Arial"/>
-          <w:b/>
-          <w:bCs/>
-          <w:sz w:val="22"/>
-          <w:szCs w:val="22"/>
-        </w:rPr>
         <w:t>Output:</w:t>
       </w:r>
-    </w:p>
-    <w:p>
-      <w:pPr>
-        <w:spacing w:after="0" w:line="276" w:lineRule="auto"/>
-        <w:rPr>
-          <w:rFonts w:ascii="Arial" w:eastAsia="Arial" w:hAnsi="Arial" w:cs="Arial"/>
-          <w:b/>
-          <w:bCs/>
-          <w:sz w:val="22"/>
-          <w:szCs w:val="22"/>
-        </w:rPr>
-      </w:pPr>
     </w:p>
     <w:p>
       <w:pPr>
@@ -6130,15 +6048,14 @@
       <w:r>
         <w:rPr>
           <w:rFonts w:ascii="Arial" w:eastAsia="Arial" w:hAnsi="Arial" w:cs="Arial"/>
-          <w:noProof/>
           <w:sz w:val="22"/>
           <w:szCs w:val="22"/>
         </w:rPr>
         <w:drawing>
-          <wp:inline distT="0" distB="0" distL="0" distR="0" wp14:anchorId="10662E89" wp14:editId="493EAE9F">
-            <wp:extent cx="5513705" cy="4048125"/>
-            <wp:effectExtent l="19050" t="19050" r="10795" b="28575"/>
-            <wp:docPr id="193664481" name="Picture 1"/>
+          <wp:inline distT="0" distB="0" distL="0" distR="0" wp14:anchorId="556ED231" wp14:editId="7F4FA45C">
+            <wp:extent cx="4444337" cy="4114800"/>
+            <wp:effectExtent l="19050" t="19050" r="13970" b="19050"/>
+            <wp:docPr id="1399291374" name="Picture 1"/>
             <wp:cNvGraphicFramePr>
               <a:graphicFrameLocks xmlns:a="http://schemas.openxmlformats.org/drawingml/2006/main" noChangeAspect="1"/>
             </wp:cNvGraphicFramePr>
@@ -6146,7 +6063,7 @@
               <a:graphicData uri="http://schemas.openxmlformats.org/drawingml/2006/picture">
                 <pic:pic xmlns:pic="http://schemas.openxmlformats.org/drawingml/2006/picture">
                   <pic:nvPicPr>
-                    <pic:cNvPr id="193664481" name=""/>
+                    <pic:cNvPr id="1399291374" name=""/>
                     <pic:cNvPicPr/>
                   </pic:nvPicPr>
                   <pic:blipFill>
@@ -6158,7 +6075,7 @@
                   <pic:spPr>
                     <a:xfrm>
                       <a:off x="0" y="0"/>
-                      <a:ext cx="5514287" cy="4048552"/>
+                      <a:ext cx="4444337" cy="4114800"/>
                     </a:xfrm>
                     <a:prstGeom prst="rect">
                       <a:avLst/>
@@ -6205,22 +6122,23 @@
           <w:szCs w:val="22"/>
         </w:rPr>
       </w:pPr>
-      <w:r>
+    </w:p>
+    <w:p>
+      <w:pPr>
+        <w:spacing w:after="0" w:line="276" w:lineRule="auto"/>
         <w:rPr>
           <w:rFonts w:ascii="Arial" w:eastAsia="Arial" w:hAnsi="Arial" w:cs="Arial"/>
           <w:sz w:val="22"/>
           <w:szCs w:val="22"/>
         </w:rPr>
-        <w:t xml:space="preserve">Logic: The main logic of this query is that we need to find what link exists between a patient, the admission and the surgical procedure. Between the patient and the admission, it is the patient id, we can then use that to find a patient with certain condition from the admission and patient </w:t>
-      </w:r>
+      </w:pPr>
       <w:r>
         <w:rPr>
           <w:rFonts w:ascii="Arial" w:eastAsia="Arial" w:hAnsi="Arial" w:cs="Arial"/>
           <w:sz w:val="22"/>
           <w:szCs w:val="22"/>
         </w:rPr>
-        <w:lastRenderedPageBreak/>
-        <w:t xml:space="preserve">table. The surgical procedure table is also based on the admission id, so we can do the same thing using join. The final step is to check if the discharge date time is not null because we want </w:t>
+        <w:t xml:space="preserve">Logic: The main logic of this query is that we need to find what link exists between a patient, the admission and the surgical procedure. Between the patient and the admission, it is the patient id, we can then use that to find a patient with certain condition from the admission and patient table. The surgical procedure table is also based on the admission id, so we can do the same thing using join. The final step is to check if the discharge date time is not null because we want </w:t>
       </w:r>
       <w:r>
         <w:rPr>
@@ -6452,16 +6370,6 @@
     </w:p>
     <w:p>
       <w:pPr>
-        <w:spacing w:after="0" w:line="276" w:lineRule="auto"/>
-        <w:rPr>
-          <w:rFonts w:ascii="Arial" w:eastAsia="Arial" w:hAnsi="Arial" w:cs="Arial"/>
-          <w:sz w:val="22"/>
-          <w:szCs w:val="22"/>
-        </w:rPr>
-      </w:pPr>
-    </w:p>
-    <w:p>
-      <w:pPr>
         <w:pStyle w:val="Caption"/>
         <w:keepNext/>
       </w:pPr>
@@ -6499,9 +6407,9 @@
           <w:szCs w:val="22"/>
         </w:rPr>
         <w:drawing>
-          <wp:inline distT="0" distB="0" distL="0" distR="0" wp14:anchorId="787A435F" wp14:editId="70282456">
-            <wp:extent cx="2304762" cy="2476190"/>
-            <wp:effectExtent l="19050" t="19050" r="19685" b="19685"/>
+          <wp:inline distT="0" distB="0" distL="0" distR="0" wp14:anchorId="787A435F" wp14:editId="37C98567">
+            <wp:extent cx="2304415" cy="2200275"/>
+            <wp:effectExtent l="19050" t="19050" r="19685" b="28575"/>
             <wp:docPr id="844283263" name="Picture 1"/>
             <wp:cNvGraphicFramePr>
               <a:graphicFrameLocks xmlns:a="http://schemas.openxmlformats.org/drawingml/2006/main" noChangeAspect="1"/>
@@ -6522,7 +6430,7 @@
                   <pic:spPr>
                     <a:xfrm>
                       <a:off x="0" y="0"/>
-                      <a:ext cx="2304762" cy="2476190"/>
+                      <a:ext cx="2304765" cy="2200609"/>
                     </a:xfrm>
                     <a:prstGeom prst="rect">
                       <a:avLst/>
@@ -6641,40 +6549,7 @@
           <w:i/>
           <w:iCs/>
         </w:rPr>
-        <w:t xml:space="preserve"> the patient id. After that, for the diagnostic order, </w:t>
-      </w:r>
-      <w:proofErr w:type="spellStart"/>
-      <w:proofErr w:type="gramStart"/>
-      <w:r>
-        <w:rPr>
-          <w:i/>
-          <w:iCs/>
-        </w:rPr>
-        <w:t>its</w:t>
-      </w:r>
-      <w:proofErr w:type="spellEnd"/>
-      <w:proofErr w:type="gramEnd"/>
-      <w:r>
-        <w:rPr>
-          <w:i/>
-          <w:iCs/>
-        </w:rPr>
-        <w:t xml:space="preserve"> the admissions id. Th</w:t>
-      </w:r>
-    </w:p>
-    <w:p>
-      <w:pPr>
-        <w:rPr>
-          <w:b/>
-          <w:bCs/>
-        </w:rPr>
-      </w:pPr>
-      <w:r>
-        <w:rPr>
-          <w:b/>
-          <w:bCs/>
-        </w:rPr>
-        <w:br w:type="page"/>
+        <w:t xml:space="preserve"> the patient id. After that, for the diagnostic order, its the admissions id. Th</w:t>
       </w:r>
     </w:p>
     <w:p>
@@ -6900,13 +6775,12 @@
         <w:rPr>
           <w:b/>
           <w:bCs/>
-          <w:noProof/>
         </w:rPr>
         <w:drawing>
-          <wp:inline distT="0" distB="0" distL="0" distR="0" wp14:anchorId="214725CB" wp14:editId="4A8050E4">
-            <wp:extent cx="5943600" cy="1141730"/>
-            <wp:effectExtent l="19050" t="19050" r="19050" b="20320"/>
-            <wp:docPr id="459490604" name="Picture 1"/>
+          <wp:inline distT="0" distB="0" distL="0" distR="0" wp14:anchorId="6B043C63" wp14:editId="669DA91B">
+            <wp:extent cx="5943600" cy="1481455"/>
+            <wp:effectExtent l="19050" t="19050" r="19050" b="23495"/>
+            <wp:docPr id="2061444504" name="Picture 1"/>
             <wp:cNvGraphicFramePr>
               <a:graphicFrameLocks xmlns:a="http://schemas.openxmlformats.org/drawingml/2006/main" noChangeAspect="1"/>
             </wp:cNvGraphicFramePr>
@@ -6914,7 +6788,7 @@
               <a:graphicData uri="http://schemas.openxmlformats.org/drawingml/2006/picture">
                 <pic:pic xmlns:pic="http://schemas.openxmlformats.org/drawingml/2006/picture">
                   <pic:nvPicPr>
-                    <pic:cNvPr id="459490604" name=""/>
+                    <pic:cNvPr id="2061444504" name=""/>
                     <pic:cNvPicPr/>
                   </pic:nvPicPr>
                   <pic:blipFill>
@@ -6926,7 +6800,7 @@
                   <pic:spPr>
                     <a:xfrm>
                       <a:off x="0" y="0"/>
-                      <a:ext cx="5943600" cy="1141730"/>
+                      <a:ext cx="5943600" cy="1481455"/>
                     </a:xfrm>
                     <a:prstGeom prst="rect">
                       <a:avLst/>
@@ -6961,14 +6835,11 @@
     </w:p>
     <w:p>
       <w:r>
-        <w:rPr>
-          <w:noProof/>
-        </w:rPr>
         <w:drawing>
-          <wp:inline distT="0" distB="0" distL="0" distR="0" wp14:anchorId="449903FE" wp14:editId="6C89A39F">
-            <wp:extent cx="3409524" cy="1980952"/>
-            <wp:effectExtent l="19050" t="19050" r="19685" b="19685"/>
-            <wp:docPr id="1676293039" name="Picture 1"/>
+          <wp:inline distT="0" distB="0" distL="0" distR="0" wp14:anchorId="3DD38835" wp14:editId="7F546F31">
+            <wp:extent cx="3580952" cy="2161905"/>
+            <wp:effectExtent l="19050" t="19050" r="19685" b="10160"/>
+            <wp:docPr id="950735697" name="Picture 1"/>
             <wp:cNvGraphicFramePr>
               <a:graphicFrameLocks xmlns:a="http://schemas.openxmlformats.org/drawingml/2006/main" noChangeAspect="1"/>
             </wp:cNvGraphicFramePr>
@@ -6976,7 +6847,7 @@
               <a:graphicData uri="http://schemas.openxmlformats.org/drawingml/2006/picture">
                 <pic:pic xmlns:pic="http://schemas.openxmlformats.org/drawingml/2006/picture">
                   <pic:nvPicPr>
-                    <pic:cNvPr id="1676293039" name=""/>
+                    <pic:cNvPr id="950735697" name=""/>
                     <pic:cNvPicPr/>
                   </pic:nvPicPr>
                   <pic:blipFill>
@@ -6988,7 +6859,7 @@
                   <pic:spPr>
                     <a:xfrm>
                       <a:off x="0" y="0"/>
-                      <a:ext cx="3409524" cy="1980952"/>
+                      <a:ext cx="3580952" cy="2161905"/>
                     </a:xfrm>
                     <a:prstGeom prst="rect">
                       <a:avLst/>
@@ -8256,13 +8127,8 @@
         <w:spacing w:after="0" w:line="276" w:lineRule="auto"/>
       </w:pPr>
       <w:r>
-        <w:t xml:space="preserve">patient’s first placement is not considered a transfer; each subsequent unit </w:t>
-      </w:r>
-      <w:proofErr w:type="gramStart"/>
-      <w:r>
-        <w:t>stay</w:t>
-      </w:r>
-      <w:proofErr w:type="gramEnd"/>
+        <w:t>patient’s first placement is not considered a transfer; each subsequent unit stay</w:t>
+      </w:r>
     </w:p>
     <w:p>
       <w:pPr>
@@ -8715,18 +8581,8 @@
           <w:b/>
           <w:bCs/>
         </w:rPr>
-        <w:t xml:space="preserve">9 </w:t>
-      </w:r>
-      <w:proofErr w:type="gramStart"/>
-      <w:r>
-        <w:rPr>
-          <w:rFonts w:ascii="LMRoman12-Bold" w:eastAsia="LMRoman12-Bold" w:hAnsi="LMRoman12-Bold" w:cs="LMRoman12-Bold"/>
-          <w:b/>
-          <w:bCs/>
-        </w:rPr>
-        <w:t>diagnosis</w:t>
-      </w:r>
-      <w:proofErr w:type="gramEnd"/>
+        <w:t>9 diagnosis</w:t>
+      </w:r>
       <w:r>
         <w:rPr>
           <w:rFonts w:ascii="LMRoman12-Regular" w:eastAsia="LMRoman12-Regular" w:hAnsi="LMRoman12-Regular" w:cs="LMRoman12-Regular"/>
@@ -9717,15 +9573,7 @@
     </w:p>
     <w:p>
       <w:r>
-        <w:t xml:space="preserve">- [x] Apply </w:t>
-      </w:r>
-      <w:proofErr w:type="gramStart"/>
-      <w:r>
-        <w:t>joins</w:t>
-      </w:r>
-      <w:proofErr w:type="gramEnd"/>
-      <w:r>
-        <w:t>, grouping, subqueries, aggregates, date/time functions, and CTEs where appropriate.</w:t>
+        <w:t>- [x] Apply joins, grouping, subqueries, aggregates, date/time functions, and CTEs where appropriate.</w:t>
       </w:r>
     </w:p>
     <w:p>

</xml_diff>

<commit_message>
Finalization of the final report
</commit_message>
<xml_diff>
--- a/SOEN363_Project_Phase1_TeamName.docx
+++ b/SOEN363_Project_Phase1_TeamName.docx
@@ -495,15 +495,16 @@
       <w:sdtContent>
         <w:p>
           <w:pPr>
-            <w:widowControl w:val="0"/>
+            <w:pStyle w:val="TOC1"/>
             <w:tabs>
-              <w:tab w:val="right" w:leader="dot" w:pos="12000"/>
+              <w:tab w:val="right" w:leader="dot" w:pos="9350"/>
             </w:tabs>
-            <w:spacing w:before="60" w:after="0" w:line="240" w:lineRule="auto"/>
             <w:rPr>
-              <w:b/>
-              <w:bCs/>
-              <w:color w:val="000000"/>
+              <w:rFonts w:asciiTheme="minorHAnsi" w:eastAsiaTheme="minorEastAsia" w:hAnsiTheme="minorHAnsi" w:cstheme="minorBidi"/>
+              <w:noProof/>
+              <w:kern w:val="2"/>
+              <w:lang w:val="en-US"/>
+              <w14:ligatures w14:val="standardContextual"/>
             </w:rPr>
           </w:pPr>
           <w:r>
@@ -515,23 +516,637 @@
           <w:r>
             <w:fldChar w:fldCharType="separate"/>
           </w:r>
-          <w:hyperlink w:anchor="_heading=h.cfuvdsbbd5v4">
+          <w:hyperlink w:anchor="_Toc243412414" w:history="1">
             <w:r>
               <w:rPr>
-                <w:b/>
-                <w:bCs/>
-                <w:color w:val="000000"/>
+                <w:rStyle w:val="Hyperlink"/>
+                <w:rFonts w:ascii="Arial" w:eastAsia="Arial" w:hAnsi="Arial" w:cs="Arial"/>
+                <w:noProof/>
               </w:rPr>
               <w:t>Introduction</w:t>
             </w:r>
             <w:r>
               <w:rPr>
-                <w:b/>
-                <w:bCs/>
-                <w:color w:val="000000"/>
+                <w:noProof/>
+                <w:webHidden/>
               </w:rPr>
               <w:tab/>
-              <w:t>4</w:t>
+            </w:r>
+            <w:r>
+              <w:rPr>
+                <w:noProof/>
+                <w:webHidden/>
+              </w:rPr>
+              <w:fldChar w:fldCharType="begin"/>
+            </w:r>
+            <w:r>
+              <w:rPr>
+                <w:noProof/>
+                <w:webHidden/>
+              </w:rPr>
+              <w:instrText xml:space="preserve"> PAGEREF _Toc243412414 \h </w:instrText>
+            </w:r>
+            <w:r>
+              <w:rPr>
+                <w:noProof/>
+                <w:webHidden/>
+              </w:rPr>
+            </w:r>
+            <w:r>
+              <w:rPr>
+                <w:noProof/>
+                <w:webHidden/>
+              </w:rPr>
+              <w:fldChar w:fldCharType="separate"/>
+            </w:r>
+            <w:r>
+              <w:rPr>
+                <w:noProof/>
+                <w:webHidden/>
+              </w:rPr>
+              <w:t>2</w:t>
+            </w:r>
+            <w:r>
+              <w:rPr>
+                <w:noProof/>
+                <w:webHidden/>
+              </w:rPr>
+              <w:fldChar w:fldCharType="end"/>
+            </w:r>
+          </w:hyperlink>
+        </w:p>
+        <w:p>
+          <w:pPr>
+            <w:pStyle w:val="TOC1"/>
+            <w:tabs>
+              <w:tab w:val="right" w:leader="dot" w:pos="9350"/>
+            </w:tabs>
+            <w:rPr>
+              <w:rFonts w:asciiTheme="minorHAnsi" w:eastAsiaTheme="minorEastAsia" w:hAnsiTheme="minorHAnsi" w:cstheme="minorBidi"/>
+              <w:noProof/>
+              <w:kern w:val="2"/>
+              <w:lang w:val="en-US"/>
+              <w14:ligatures w14:val="standardContextual"/>
+            </w:rPr>
+          </w:pPr>
+          <w:hyperlink w:anchor="_Toc243412415" w:history="1">
+            <w:r>
+              <w:rPr>
+                <w:rStyle w:val="Hyperlink"/>
+                <w:rFonts w:ascii="Arial" w:eastAsia="Arial" w:hAnsi="Arial" w:cs="Arial"/>
+                <w:noProof/>
+              </w:rPr>
+              <w:t>System Overview</w:t>
+            </w:r>
+            <w:r>
+              <w:rPr>
+                <w:noProof/>
+                <w:webHidden/>
+              </w:rPr>
+              <w:tab/>
+            </w:r>
+            <w:r>
+              <w:rPr>
+                <w:noProof/>
+                <w:webHidden/>
+              </w:rPr>
+              <w:fldChar w:fldCharType="begin"/>
+            </w:r>
+            <w:r>
+              <w:rPr>
+                <w:noProof/>
+                <w:webHidden/>
+              </w:rPr>
+              <w:instrText xml:space="preserve"> PAGEREF _Toc243412415 \h </w:instrText>
+            </w:r>
+            <w:r>
+              <w:rPr>
+                <w:noProof/>
+                <w:webHidden/>
+              </w:rPr>
+            </w:r>
+            <w:r>
+              <w:rPr>
+                <w:noProof/>
+                <w:webHidden/>
+              </w:rPr>
+              <w:fldChar w:fldCharType="separate"/>
+            </w:r>
+            <w:r>
+              <w:rPr>
+                <w:noProof/>
+                <w:webHidden/>
+              </w:rPr>
+              <w:t>2</w:t>
+            </w:r>
+            <w:r>
+              <w:rPr>
+                <w:noProof/>
+                <w:webHidden/>
+              </w:rPr>
+              <w:fldChar w:fldCharType="end"/>
+            </w:r>
+          </w:hyperlink>
+        </w:p>
+        <w:p>
+          <w:pPr>
+            <w:pStyle w:val="TOC1"/>
+            <w:tabs>
+              <w:tab w:val="right" w:leader="dot" w:pos="9350"/>
+            </w:tabs>
+            <w:rPr>
+              <w:rFonts w:asciiTheme="minorHAnsi" w:eastAsiaTheme="minorEastAsia" w:hAnsiTheme="minorHAnsi" w:cstheme="minorBidi"/>
+              <w:noProof/>
+              <w:kern w:val="2"/>
+              <w:lang w:val="en-US"/>
+              <w14:ligatures w14:val="standardContextual"/>
+            </w:rPr>
+          </w:pPr>
+          <w:hyperlink w:anchor="_Toc243412416" w:history="1">
+            <w:r>
+              <w:rPr>
+                <w:rStyle w:val="Hyperlink"/>
+                <w:rFonts w:ascii="Arial" w:eastAsia="Arial" w:hAnsi="Arial" w:cs="Arial"/>
+                <w:noProof/>
+              </w:rPr>
+              <w:t>Entity-Relationship Diagram</w:t>
+            </w:r>
+            <w:r>
+              <w:rPr>
+                <w:noProof/>
+                <w:webHidden/>
+              </w:rPr>
+              <w:tab/>
+            </w:r>
+            <w:r>
+              <w:rPr>
+                <w:noProof/>
+                <w:webHidden/>
+              </w:rPr>
+              <w:fldChar w:fldCharType="begin"/>
+            </w:r>
+            <w:r>
+              <w:rPr>
+                <w:noProof/>
+                <w:webHidden/>
+              </w:rPr>
+              <w:instrText xml:space="preserve"> PAGEREF _Toc243412416 \h </w:instrText>
+            </w:r>
+            <w:r>
+              <w:rPr>
+                <w:noProof/>
+                <w:webHidden/>
+              </w:rPr>
+            </w:r>
+            <w:r>
+              <w:rPr>
+                <w:noProof/>
+                <w:webHidden/>
+              </w:rPr>
+              <w:fldChar w:fldCharType="separate"/>
+            </w:r>
+            <w:r>
+              <w:rPr>
+                <w:noProof/>
+                <w:webHidden/>
+              </w:rPr>
+              <w:t>3</w:t>
+            </w:r>
+            <w:r>
+              <w:rPr>
+                <w:noProof/>
+                <w:webHidden/>
+              </w:rPr>
+              <w:fldChar w:fldCharType="end"/>
+            </w:r>
+          </w:hyperlink>
+        </w:p>
+        <w:p>
+          <w:pPr>
+            <w:pStyle w:val="TOC1"/>
+            <w:tabs>
+              <w:tab w:val="right" w:leader="dot" w:pos="9350"/>
+            </w:tabs>
+            <w:rPr>
+              <w:rFonts w:asciiTheme="minorHAnsi" w:eastAsiaTheme="minorEastAsia" w:hAnsiTheme="minorHAnsi" w:cstheme="minorBidi"/>
+              <w:noProof/>
+              <w:kern w:val="2"/>
+              <w:lang w:val="en-US"/>
+              <w14:ligatures w14:val="standardContextual"/>
+            </w:rPr>
+          </w:pPr>
+          <w:hyperlink w:anchor="_Toc243412417" w:history="1">
+            <w:r>
+              <w:rPr>
+                <w:rStyle w:val="Hyperlink"/>
+                <w:rFonts w:ascii="Arial" w:eastAsia="Arial" w:hAnsi="Arial" w:cs="Arial"/>
+                <w:noProof/>
+              </w:rPr>
+              <w:t>Data Population</w:t>
+            </w:r>
+            <w:r>
+              <w:rPr>
+                <w:noProof/>
+                <w:webHidden/>
+              </w:rPr>
+              <w:tab/>
+            </w:r>
+            <w:r>
+              <w:rPr>
+                <w:noProof/>
+                <w:webHidden/>
+              </w:rPr>
+              <w:fldChar w:fldCharType="begin"/>
+            </w:r>
+            <w:r>
+              <w:rPr>
+                <w:noProof/>
+                <w:webHidden/>
+              </w:rPr>
+              <w:instrText xml:space="preserve"> PAGEREF _Toc243412417 \h </w:instrText>
+            </w:r>
+            <w:r>
+              <w:rPr>
+                <w:noProof/>
+                <w:webHidden/>
+              </w:rPr>
+            </w:r>
+            <w:r>
+              <w:rPr>
+                <w:noProof/>
+                <w:webHidden/>
+              </w:rPr>
+              <w:fldChar w:fldCharType="separate"/>
+            </w:r>
+            <w:r>
+              <w:rPr>
+                <w:noProof/>
+                <w:webHidden/>
+              </w:rPr>
+              <w:t>6</w:t>
+            </w:r>
+            <w:r>
+              <w:rPr>
+                <w:noProof/>
+                <w:webHidden/>
+              </w:rPr>
+              <w:fldChar w:fldCharType="end"/>
+            </w:r>
+          </w:hyperlink>
+        </w:p>
+        <w:p>
+          <w:pPr>
+            <w:pStyle w:val="TOC1"/>
+            <w:tabs>
+              <w:tab w:val="right" w:leader="dot" w:pos="9350"/>
+            </w:tabs>
+            <w:rPr>
+              <w:rFonts w:asciiTheme="minorHAnsi" w:eastAsiaTheme="minorEastAsia" w:hAnsiTheme="minorHAnsi" w:cstheme="minorBidi"/>
+              <w:noProof/>
+              <w:kern w:val="2"/>
+              <w:lang w:val="en-US"/>
+              <w14:ligatures w14:val="standardContextual"/>
+            </w:rPr>
+          </w:pPr>
+          <w:hyperlink w:anchor="_Toc243412418" w:history="1">
+            <w:r>
+              <w:rPr>
+                <w:rStyle w:val="Hyperlink"/>
+                <w:rFonts w:ascii="Arial" w:eastAsia="Arial" w:hAnsi="Arial" w:cs="Arial"/>
+                <w:noProof/>
+              </w:rPr>
+              <w:t>Reproduction Steps</w:t>
+            </w:r>
+            <w:r>
+              <w:rPr>
+                <w:noProof/>
+                <w:webHidden/>
+              </w:rPr>
+              <w:tab/>
+            </w:r>
+            <w:r>
+              <w:rPr>
+                <w:noProof/>
+                <w:webHidden/>
+              </w:rPr>
+              <w:fldChar w:fldCharType="begin"/>
+            </w:r>
+            <w:r>
+              <w:rPr>
+                <w:noProof/>
+                <w:webHidden/>
+              </w:rPr>
+              <w:instrText xml:space="preserve"> PAGEREF _Toc243412418 \h </w:instrText>
+            </w:r>
+            <w:r>
+              <w:rPr>
+                <w:noProof/>
+                <w:webHidden/>
+              </w:rPr>
+            </w:r>
+            <w:r>
+              <w:rPr>
+                <w:noProof/>
+                <w:webHidden/>
+              </w:rPr>
+              <w:fldChar w:fldCharType="separate"/>
+            </w:r>
+            <w:r>
+              <w:rPr>
+                <w:noProof/>
+                <w:webHidden/>
+              </w:rPr>
+              <w:t>7</w:t>
+            </w:r>
+            <w:r>
+              <w:rPr>
+                <w:noProof/>
+                <w:webHidden/>
+              </w:rPr>
+              <w:fldChar w:fldCharType="end"/>
+            </w:r>
+          </w:hyperlink>
+        </w:p>
+        <w:p>
+          <w:pPr>
+            <w:pStyle w:val="TOC1"/>
+            <w:tabs>
+              <w:tab w:val="right" w:leader="dot" w:pos="9350"/>
+            </w:tabs>
+            <w:rPr>
+              <w:rFonts w:asciiTheme="minorHAnsi" w:eastAsiaTheme="minorEastAsia" w:hAnsiTheme="minorHAnsi" w:cstheme="minorBidi"/>
+              <w:noProof/>
+              <w:kern w:val="2"/>
+              <w:lang w:val="en-US"/>
+              <w14:ligatures w14:val="standardContextual"/>
+            </w:rPr>
+          </w:pPr>
+          <w:hyperlink w:anchor="_Toc243412419" w:history="1">
+            <w:r>
+              <w:rPr>
+                <w:rStyle w:val="Hyperlink"/>
+                <w:rFonts w:ascii="Arial" w:eastAsia="Arial" w:hAnsi="Arial" w:cs="Arial"/>
+                <w:noProof/>
+              </w:rPr>
+              <w:t>Conclusion</w:t>
+            </w:r>
+            <w:r>
+              <w:rPr>
+                <w:noProof/>
+                <w:webHidden/>
+              </w:rPr>
+              <w:tab/>
+            </w:r>
+            <w:r>
+              <w:rPr>
+                <w:noProof/>
+                <w:webHidden/>
+              </w:rPr>
+              <w:fldChar w:fldCharType="begin"/>
+            </w:r>
+            <w:r>
+              <w:rPr>
+                <w:noProof/>
+                <w:webHidden/>
+              </w:rPr>
+              <w:instrText xml:space="preserve"> PAGEREF _Toc243412419 \h </w:instrText>
+            </w:r>
+            <w:r>
+              <w:rPr>
+                <w:noProof/>
+                <w:webHidden/>
+              </w:rPr>
+            </w:r>
+            <w:r>
+              <w:rPr>
+                <w:noProof/>
+                <w:webHidden/>
+              </w:rPr>
+              <w:fldChar w:fldCharType="separate"/>
+            </w:r>
+            <w:r>
+              <w:rPr>
+                <w:noProof/>
+                <w:webHidden/>
+              </w:rPr>
+              <w:t>7</w:t>
+            </w:r>
+            <w:r>
+              <w:rPr>
+                <w:noProof/>
+                <w:webHidden/>
+              </w:rPr>
+              <w:fldChar w:fldCharType="end"/>
+            </w:r>
+          </w:hyperlink>
+        </w:p>
+        <w:p>
+          <w:pPr>
+            <w:pStyle w:val="TOC1"/>
+            <w:tabs>
+              <w:tab w:val="right" w:leader="dot" w:pos="9350"/>
+            </w:tabs>
+            <w:rPr>
+              <w:rFonts w:asciiTheme="minorHAnsi" w:eastAsiaTheme="minorEastAsia" w:hAnsiTheme="minorHAnsi" w:cstheme="minorBidi"/>
+              <w:noProof/>
+              <w:kern w:val="2"/>
+              <w:lang w:val="en-US"/>
+              <w14:ligatures w14:val="standardContextual"/>
+            </w:rPr>
+          </w:pPr>
+          <w:hyperlink w:anchor="_Toc243412420" w:history="1">
+            <w:r>
+              <w:rPr>
+                <w:rStyle w:val="Hyperlink"/>
+                <w:rFonts w:ascii="Arial" w:eastAsia="Arial" w:hAnsi="Arial" w:cs="Arial"/>
+                <w:noProof/>
+              </w:rPr>
+              <w:t>Appendix A — Individual Query Screenshots</w:t>
+            </w:r>
+            <w:r>
+              <w:rPr>
+                <w:noProof/>
+                <w:webHidden/>
+              </w:rPr>
+              <w:tab/>
+            </w:r>
+            <w:r>
+              <w:rPr>
+                <w:noProof/>
+                <w:webHidden/>
+              </w:rPr>
+              <w:fldChar w:fldCharType="begin"/>
+            </w:r>
+            <w:r>
+              <w:rPr>
+                <w:noProof/>
+                <w:webHidden/>
+              </w:rPr>
+              <w:instrText xml:space="preserve"> PAGEREF _Toc243412420 \h </w:instrText>
+            </w:r>
+            <w:r>
+              <w:rPr>
+                <w:noProof/>
+                <w:webHidden/>
+              </w:rPr>
+            </w:r>
+            <w:r>
+              <w:rPr>
+                <w:noProof/>
+                <w:webHidden/>
+              </w:rPr>
+              <w:fldChar w:fldCharType="separate"/>
+            </w:r>
+            <w:r>
+              <w:rPr>
+                <w:noProof/>
+                <w:webHidden/>
+              </w:rPr>
+              <w:t>8</w:t>
+            </w:r>
+            <w:r>
+              <w:rPr>
+                <w:noProof/>
+                <w:webHidden/>
+              </w:rPr>
+              <w:fldChar w:fldCharType="end"/>
+            </w:r>
+          </w:hyperlink>
+        </w:p>
+        <w:p>
+          <w:pPr>
+            <w:pStyle w:val="TOC1"/>
+            <w:tabs>
+              <w:tab w:val="right" w:leader="dot" w:pos="9350"/>
+            </w:tabs>
+            <w:rPr>
+              <w:rFonts w:asciiTheme="minorHAnsi" w:eastAsiaTheme="minorEastAsia" w:hAnsiTheme="minorHAnsi" w:cstheme="minorBidi"/>
+              <w:noProof/>
+              <w:kern w:val="2"/>
+              <w:lang w:val="en-US"/>
+              <w14:ligatures w14:val="standardContextual"/>
+            </w:rPr>
+          </w:pPr>
+          <w:hyperlink w:anchor="_Toc243412421" w:history="1">
+            <w:r>
+              <w:rPr>
+                <w:noProof/>
+                <w:webHidden/>
+              </w:rPr>
+              <w:tab/>
+            </w:r>
+            <w:r>
+              <w:rPr>
+                <w:noProof/>
+                <w:webHidden/>
+              </w:rPr>
+              <w:fldChar w:fldCharType="begin"/>
+            </w:r>
+            <w:r>
+              <w:rPr>
+                <w:noProof/>
+                <w:webHidden/>
+              </w:rPr>
+              <w:instrText xml:space="preserve"> PAGEREF _Toc243412421 \h </w:instrText>
+            </w:r>
+            <w:r>
+              <w:rPr>
+                <w:noProof/>
+                <w:webHidden/>
+              </w:rPr>
+            </w:r>
+            <w:r>
+              <w:rPr>
+                <w:noProof/>
+                <w:webHidden/>
+              </w:rPr>
+              <w:fldChar w:fldCharType="separate"/>
+            </w:r>
+            <w:r>
+              <w:rPr>
+                <w:noProof/>
+                <w:webHidden/>
+              </w:rPr>
+              <w:t>12</w:t>
+            </w:r>
+            <w:r>
+              <w:rPr>
+                <w:noProof/>
+                <w:webHidden/>
+              </w:rPr>
+              <w:fldChar w:fldCharType="end"/>
+            </w:r>
+          </w:hyperlink>
+        </w:p>
+        <w:p>
+          <w:pPr>
+            <w:pStyle w:val="TOC1"/>
+            <w:tabs>
+              <w:tab w:val="right" w:leader="dot" w:pos="9350"/>
+            </w:tabs>
+            <w:rPr>
+              <w:rFonts w:asciiTheme="minorHAnsi" w:eastAsiaTheme="minorEastAsia" w:hAnsiTheme="minorHAnsi" w:cstheme="minorBidi"/>
+              <w:noProof/>
+              <w:kern w:val="2"/>
+              <w:lang w:val="en-US"/>
+              <w14:ligatures w14:val="standardContextual"/>
+            </w:rPr>
+          </w:pPr>
+          <w:hyperlink w:anchor="_Toc243412422" w:history="1">
+            <w:r>
+              <w:rPr>
+                <w:rStyle w:val="Hyperlink"/>
+                <w:noProof/>
+              </w:rPr>
+              <w:t>Table of Figures</w:t>
+            </w:r>
+            <w:r>
+              <w:rPr>
+                <w:noProof/>
+                <w:webHidden/>
+              </w:rPr>
+              <w:tab/>
+            </w:r>
+            <w:r>
+              <w:rPr>
+                <w:noProof/>
+                <w:webHidden/>
+              </w:rPr>
+              <w:fldChar w:fldCharType="begin"/>
+            </w:r>
+            <w:r>
+              <w:rPr>
+                <w:noProof/>
+                <w:webHidden/>
+              </w:rPr>
+              <w:instrText xml:space="preserve"> PAGEREF _Toc243412422 \h </w:instrText>
+            </w:r>
+            <w:r>
+              <w:rPr>
+                <w:noProof/>
+                <w:webHidden/>
+              </w:rPr>
+            </w:r>
+            <w:r>
+              <w:rPr>
+                <w:noProof/>
+                <w:webHidden/>
+              </w:rPr>
+              <w:fldChar w:fldCharType="separate"/>
+            </w:r>
+            <w:r>
+              <w:rPr>
+                <w:noProof/>
+                <w:webHidden/>
+              </w:rPr>
+              <w:t>28</w:t>
+            </w:r>
+            <w:r>
+              <w:rPr>
+                <w:noProof/>
+                <w:webHidden/>
+              </w:rPr>
+              <w:fldChar w:fldCharType="end"/>
             </w:r>
           </w:hyperlink>
         </w:p>
@@ -548,223 +1163,6 @@
               <w:color w:val="000000"/>
             </w:rPr>
           </w:pPr>
-          <w:hyperlink w:anchor="_heading=h.mfif8peltl6r">
-            <w:r>
-              <w:rPr>
-                <w:b/>
-                <w:bCs/>
-                <w:color w:val="000000"/>
-              </w:rPr>
-              <w:t>System Overview</w:t>
-            </w:r>
-            <w:r>
-              <w:rPr>
-                <w:b/>
-                <w:bCs/>
-                <w:color w:val="000000"/>
-              </w:rPr>
-              <w:tab/>
-              <w:t>4</w:t>
-            </w:r>
-          </w:hyperlink>
-        </w:p>
-        <w:p>
-          <w:pPr>
-            <w:widowControl w:val="0"/>
-            <w:tabs>
-              <w:tab w:val="right" w:leader="dot" w:pos="12000"/>
-            </w:tabs>
-            <w:spacing w:before="60" w:after="0" w:line="240" w:lineRule="auto"/>
-            <w:rPr>
-              <w:b/>
-              <w:bCs/>
-              <w:color w:val="000000"/>
-            </w:rPr>
-          </w:pPr>
-          <w:hyperlink w:anchor="_heading=">
-            <w:r>
-              <w:rPr>
-                <w:b/>
-                <w:bCs/>
-                <w:color w:val="000000"/>
-              </w:rPr>
-              <w:t>Entity-Relationship Diagram</w:t>
-            </w:r>
-            <w:r>
-              <w:rPr>
-                <w:b/>
-                <w:bCs/>
-                <w:color w:val="000000"/>
-              </w:rPr>
-              <w:tab/>
-              <w:t>5</w:t>
-            </w:r>
-          </w:hyperlink>
-        </w:p>
-        <w:p>
-          <w:pPr>
-            <w:widowControl w:val="0"/>
-            <w:tabs>
-              <w:tab w:val="right" w:leader="dot" w:pos="12000"/>
-            </w:tabs>
-            <w:spacing w:before="60" w:after="0" w:line="240" w:lineRule="auto"/>
-            <w:rPr>
-              <w:b/>
-              <w:bCs/>
-              <w:color w:val="000000"/>
-            </w:rPr>
-          </w:pPr>
-          <w:hyperlink w:anchor="_heading=">
-            <w:r>
-              <w:rPr>
-                <w:b/>
-                <w:bCs/>
-                <w:color w:val="000000"/>
-              </w:rPr>
-              <w:t>Relational Schema</w:t>
-            </w:r>
-            <w:r>
-              <w:rPr>
-                <w:b/>
-                <w:bCs/>
-                <w:color w:val="000000"/>
-              </w:rPr>
-              <w:tab/>
-              <w:t>6</w:t>
-            </w:r>
-          </w:hyperlink>
-        </w:p>
-        <w:p>
-          <w:pPr>
-            <w:widowControl w:val="0"/>
-            <w:tabs>
-              <w:tab w:val="right" w:leader="dot" w:pos="12000"/>
-            </w:tabs>
-            <w:spacing w:before="60" w:after="0" w:line="240" w:lineRule="auto"/>
-            <w:rPr>
-              <w:b/>
-              <w:bCs/>
-              <w:color w:val="000000"/>
-            </w:rPr>
-          </w:pPr>
-          <w:hyperlink w:anchor="_heading=">
-            <w:r>
-              <w:rPr>
-                <w:b/>
-                <w:bCs/>
-                <w:color w:val="000000"/>
-              </w:rPr>
-              <w:t>Data Population</w:t>
-            </w:r>
-            <w:r>
-              <w:rPr>
-                <w:b/>
-                <w:bCs/>
-                <w:color w:val="000000"/>
-              </w:rPr>
-              <w:tab/>
-              <w:t>8</w:t>
-            </w:r>
-          </w:hyperlink>
-        </w:p>
-        <w:p>
-          <w:pPr>
-            <w:widowControl w:val="0"/>
-            <w:tabs>
-              <w:tab w:val="right" w:leader="dot" w:pos="12000"/>
-            </w:tabs>
-            <w:spacing w:before="60" w:after="0" w:line="240" w:lineRule="auto"/>
-            <w:rPr>
-              <w:b/>
-              <w:bCs/>
-              <w:color w:val="000000"/>
-            </w:rPr>
-          </w:pPr>
-          <w:hyperlink w:anchor="_heading=h.qh17jrceleu0">
-            <w:r>
-              <w:rPr>
-                <w:b/>
-                <w:bCs/>
-                <w:color w:val="000000"/>
-              </w:rPr>
-              <w:t>Reproduction Steps</w:t>
-            </w:r>
-            <w:r>
-              <w:rPr>
-                <w:b/>
-                <w:bCs/>
-                <w:color w:val="000000"/>
-              </w:rPr>
-              <w:tab/>
-              <w:t>9</w:t>
-            </w:r>
-          </w:hyperlink>
-        </w:p>
-        <w:p>
-          <w:pPr>
-            <w:widowControl w:val="0"/>
-            <w:tabs>
-              <w:tab w:val="right" w:leader="dot" w:pos="12000"/>
-            </w:tabs>
-            <w:spacing w:before="60" w:after="0" w:line="240" w:lineRule="auto"/>
-            <w:rPr>
-              <w:b/>
-              <w:bCs/>
-              <w:color w:val="000000"/>
-            </w:rPr>
-          </w:pPr>
-          <w:hyperlink w:anchor="_heading=h.fmujo3trct73">
-            <w:r>
-              <w:rPr>
-                <w:b/>
-                <w:bCs/>
-                <w:color w:val="000000"/>
-              </w:rPr>
-              <w:t>Conclusion</w:t>
-            </w:r>
-            <w:r>
-              <w:rPr>
-                <w:b/>
-                <w:bCs/>
-                <w:color w:val="000000"/>
-              </w:rPr>
-              <w:tab/>
-              <w:t>9</w:t>
-            </w:r>
-          </w:hyperlink>
-        </w:p>
-        <w:p>
-          <w:pPr>
-            <w:widowControl w:val="0"/>
-            <w:tabs>
-              <w:tab w:val="right" w:leader="dot" w:pos="12000"/>
-            </w:tabs>
-            <w:spacing w:before="60" w:after="0" w:line="240" w:lineRule="auto"/>
-            <w:rPr>
-              <w:b/>
-              <w:bCs/>
-              <w:color w:val="000000"/>
-            </w:rPr>
-          </w:pPr>
-          <w:hyperlink w:anchor="_heading=">
-            <w:r>
-              <w:rPr>
-                <w:b/>
-                <w:bCs/>
-                <w:color w:val="000000"/>
-              </w:rPr>
-              <w:t>Appendix A — Individual Query Screenshots</w:t>
-            </w:r>
-            <w:r>
-              <w:rPr>
-                <w:b/>
-                <w:bCs/>
-                <w:color w:val="000000"/>
-              </w:rPr>
-              <w:tab/>
-              <w:t>10</w:t>
-            </w:r>
-          </w:hyperlink>
           <w:r>
             <w:fldChar w:fldCharType="end"/>
           </w:r>
@@ -801,8 +1199,7 @@
           <w:rFonts w:ascii="Arial" w:eastAsia="Arial" w:hAnsi="Arial" w:cs="Arial"/>
         </w:rPr>
       </w:pPr>
-      <w:bookmarkStart w:id="1" w:name="_heading=h.cfuvdsbbd5v4" w:colFirst="0" w:colLast="0"/>
-      <w:bookmarkEnd w:id="1"/>
+      <w:bookmarkStart w:id="1" w:name="_Toc243412414"/>
       <w:r>
         <w:rPr>
           <w:rFonts w:ascii="Arial" w:eastAsia="Arial" w:hAnsi="Arial" w:cs="Arial"/>
@@ -810,6 +1207,7 @@
         <w:lastRenderedPageBreak/>
         <w:t>Introduction</w:t>
       </w:r>
+      <w:bookmarkEnd w:id="1"/>
     </w:p>
     <w:p>
       <w:pPr>
@@ -835,14 +1233,14 @@
           <w:rFonts w:ascii="Arial" w:eastAsia="Arial" w:hAnsi="Arial" w:cs="Arial"/>
         </w:rPr>
       </w:pPr>
-      <w:bookmarkStart w:id="2" w:name="_heading=h.mfif8peltl6r" w:colFirst="0" w:colLast="0"/>
+      <w:bookmarkStart w:id="2" w:name="_Toc243412415"/>
+      <w:r>
+        <w:rPr>
+          <w:rFonts w:ascii="Arial" w:eastAsia="Arial" w:hAnsi="Arial" w:cs="Arial"/>
+        </w:rPr>
+        <w:t>System Overview</w:t>
+      </w:r>
       <w:bookmarkEnd w:id="2"/>
-      <w:r>
-        <w:rPr>
-          <w:rFonts w:ascii="Arial" w:eastAsia="Arial" w:hAnsi="Arial" w:cs="Arial"/>
-        </w:rPr>
-        <w:t>System Overview</w:t>
-      </w:r>
     </w:p>
     <w:p>
       <w:pPr>
@@ -904,6 +1302,7 @@
           <w:rFonts w:ascii="Arial" w:eastAsia="Arial" w:hAnsi="Arial" w:cs="Arial"/>
         </w:rPr>
       </w:pPr>
+      <w:bookmarkStart w:id="4" w:name="_Toc243412416"/>
       <w:r>
         <w:rPr>
           <w:rFonts w:ascii="Arial" w:eastAsia="Arial" w:hAnsi="Arial" w:cs="Arial"/>
@@ -911,6 +1310,7 @@
         <w:lastRenderedPageBreak/>
         <w:t>Entity-Relationship Diagram</w:t>
       </w:r>
+      <w:bookmarkEnd w:id="4"/>
     </w:p>
     <w:p>
       <w:pPr>
@@ -918,9 +1318,9 @@
         <w:keepNext/>
         <w:jc w:val="both"/>
       </w:pPr>
-      <w:bookmarkStart w:id="4" w:name="_heading=h.xlghlkoade19" w:colFirst="0" w:colLast="0"/>
-      <w:bookmarkStart w:id="5" w:name="_Toc243410610"/>
-      <w:bookmarkEnd w:id="4"/>
+      <w:bookmarkStart w:id="5" w:name="_heading=h.xlghlkoade19" w:colFirst="0" w:colLast="0"/>
+      <w:bookmarkStart w:id="6" w:name="_Toc243410610"/>
+      <w:bookmarkEnd w:id="5"/>
       <w:r>
         <w:t xml:space="preserve">Figure </w:t>
       </w:r>
@@ -935,7 +1335,7 @@
       <w:r>
         <w:t>:ER Diagram</w:t>
       </w:r>
-      <w:bookmarkEnd w:id="5"/>
+      <w:bookmarkEnd w:id="6"/>
     </w:p>
     <w:p>
       <w:pPr>
@@ -997,8 +1397,8 @@
         </w:drawing>
       </w:r>
     </w:p>
-    <w:bookmarkStart w:id="6" w:name="_heading=h.9xhsluewlao0" w:colFirst="0" w:colLast="0"/>
-    <w:bookmarkEnd w:id="6"/>
+    <w:bookmarkStart w:id="7" w:name="_heading=h.9xhsluewlao0" w:colFirst="0" w:colLast="0"/>
+    <w:bookmarkEnd w:id="7"/>
     <w:p>
       <w:pPr>
         <w:jc w:val="both"/>
@@ -1849,8 +2249,8 @@
           <w:szCs w:val="40"/>
         </w:rPr>
       </w:pPr>
-      <w:bookmarkStart w:id="7" w:name="_heading=h.2hnhfa6p7lhs" w:colFirst="0" w:colLast="0"/>
-      <w:bookmarkEnd w:id="7"/>
+      <w:bookmarkStart w:id="8" w:name="_heading=h.2hnhfa6p7lhs" w:colFirst="0" w:colLast="0"/>
+      <w:bookmarkEnd w:id="8"/>
       <w:r>
         <w:br w:type="page"/>
       </w:r>
@@ -1863,6 +2263,7 @@
           <w:rFonts w:ascii="Arial" w:eastAsia="Arial" w:hAnsi="Arial" w:cs="Arial"/>
         </w:rPr>
       </w:pPr>
+      <w:bookmarkStart w:id="9" w:name="_Toc243412417"/>
       <w:r>
         <w:rPr>
           <w:rFonts w:ascii="Arial" w:eastAsia="Arial" w:hAnsi="Arial" w:cs="Arial"/>
@@ -1870,6 +2271,7 @@
         <w:lastRenderedPageBreak/>
         <w:t>Data Population</w:t>
       </w:r>
+      <w:bookmarkEnd w:id="9"/>
     </w:p>
     <w:p>
       <w:pPr>
@@ -2165,9 +2567,9 @@
         <w:keepNext/>
         <w:jc w:val="both"/>
       </w:pPr>
-      <w:bookmarkStart w:id="8" w:name="_heading=h.qjcfbixz4rjq" w:colFirst="0" w:colLast="0"/>
-      <w:bookmarkStart w:id="9" w:name="_Toc243410611"/>
-      <w:bookmarkEnd w:id="8"/>
+      <w:bookmarkStart w:id="10" w:name="_heading=h.qjcfbixz4rjq" w:colFirst="0" w:colLast="0"/>
+      <w:bookmarkStart w:id="11" w:name="_Toc243410611"/>
+      <w:bookmarkEnd w:id="10"/>
       <w:r>
         <w:t xml:space="preserve">Figure </w:t>
       </w:r>
@@ -2182,7 +2584,7 @@
       <w:r>
         <w:t>: Live statics of our database</w:t>
       </w:r>
-      <w:bookmarkEnd w:id="9"/>
+      <w:bookmarkEnd w:id="11"/>
     </w:p>
     <w:p>
       <w:pPr>
@@ -2244,8 +2646,8 @@
           <w:rFonts w:ascii="Arial" w:eastAsia="Arial" w:hAnsi="Arial" w:cs="Arial"/>
         </w:rPr>
       </w:pPr>
-      <w:bookmarkStart w:id="10" w:name="_heading=h.mo3lpekqagvc" w:colFirst="0" w:colLast="0"/>
-      <w:bookmarkEnd w:id="10"/>
+      <w:bookmarkStart w:id="12" w:name="_heading=h.mo3lpekqagvc" w:colFirst="0" w:colLast="0"/>
+      <w:bookmarkEnd w:id="12"/>
       <w:r>
         <w:rPr>
           <w:rFonts w:ascii="Arial" w:eastAsia="Arial" w:hAnsi="Arial" w:cs="Arial"/>
@@ -2283,21 +2685,7 @@
           <w:rFonts w:ascii="Arial" w:eastAsia="Arial" w:hAnsi="Arial" w:cs="Arial"/>
           <w:color w:val="E97132" w:themeColor="accent2"/>
         </w:rPr>
-        <w:t>Appendi</w:t>
-      </w:r>
-      <w:r>
-        <w:rPr>
-          <w:rFonts w:ascii="Arial" w:eastAsia="Arial" w:hAnsi="Arial" w:cs="Arial"/>
-          <w:color w:val="E97132" w:themeColor="accent2"/>
-        </w:rPr>
-        <w:t>x</w:t>
-      </w:r>
-      <w:r>
-        <w:rPr>
-          <w:rFonts w:ascii="Arial" w:eastAsia="Arial" w:hAnsi="Arial" w:cs="Arial"/>
-          <w:color w:val="E97132" w:themeColor="accent2"/>
-        </w:rPr>
-        <w:t xml:space="preserve"> A</w:t>
+        <w:t>Appendix A</w:t>
       </w:r>
       <w:r>
         <w:rPr>
@@ -2340,8 +2728,7 @@
           <w:rFonts w:ascii="Arial" w:eastAsia="Arial" w:hAnsi="Arial" w:cs="Arial"/>
         </w:rPr>
       </w:pPr>
-      <w:bookmarkStart w:id="11" w:name="_heading=h.qh17jrceleu0" w:colFirst="0" w:colLast="0"/>
-      <w:bookmarkEnd w:id="11"/>
+      <w:bookmarkStart w:id="13" w:name="_Toc243412418"/>
       <w:r>
         <w:rPr>
           <w:rFonts w:ascii="Arial" w:eastAsia="Arial" w:hAnsi="Arial" w:cs="Arial"/>
@@ -2349,6 +2736,7 @@
         <w:lastRenderedPageBreak/>
         <w:t>Reproduction Steps</w:t>
       </w:r>
+      <w:bookmarkEnd w:id="13"/>
     </w:p>
     <w:p>
       <w:pPr>
@@ -2498,14 +2886,14 @@
           <w:rFonts w:ascii="Arial" w:eastAsia="Arial" w:hAnsi="Arial" w:cs="Arial"/>
         </w:rPr>
       </w:pPr>
-      <w:bookmarkStart w:id="12" w:name="_heading=h.fmujo3trct73" w:colFirst="0" w:colLast="0"/>
-      <w:bookmarkEnd w:id="12"/>
+      <w:bookmarkStart w:id="14" w:name="_Toc243412419"/>
       <w:r>
         <w:rPr>
           <w:rFonts w:ascii="Arial" w:eastAsia="Arial" w:hAnsi="Arial" w:cs="Arial"/>
         </w:rPr>
         <w:t>Conclusion</w:t>
       </w:r>
+      <w:bookmarkEnd w:id="14"/>
     </w:p>
     <w:p>
       <w:pPr>
@@ -2557,7 +2945,25 @@
           <w:sz w:val="22"/>
           <w:szCs w:val="22"/>
         </w:rPr>
-        <w:t>Generating the test data was one of the more challenging parts, but the Python script worked well in the end, giving us a consistent dataset of 45 patients and 51 admissions to work with. Finally, writing the 20 queries was a good way to see if our design actually held up. By using complex joins and subqueries to answer realistic questions—like tracking ICU transfers or finding patients with multiple diagnoses—we were able to confirm that the database is structured correctly and can handle real analytical tasks</w:t>
+        <w:t xml:space="preserve">Generating the test data was one of the more challenging parts, but the Python script worked well in the end, giving us a consistent dataset of 45 patients and 51 admissions to work with. Finally, writing the 20 queries was a good way to see if our design </w:t>
+      </w:r>
+      <w:proofErr w:type="gramStart"/>
+      <w:r>
+        <w:rPr>
+          <w:rFonts w:ascii="Arial" w:eastAsia="Arial" w:hAnsi="Arial" w:cs="Arial"/>
+          <w:sz w:val="22"/>
+          <w:szCs w:val="22"/>
+        </w:rPr>
+        <w:t>actually held</w:t>
+      </w:r>
+      <w:proofErr w:type="gramEnd"/>
+      <w:r>
+        <w:rPr>
+          <w:rFonts w:ascii="Arial" w:eastAsia="Arial" w:hAnsi="Arial" w:cs="Arial"/>
+          <w:sz w:val="22"/>
+          <w:szCs w:val="22"/>
+        </w:rPr>
+        <w:t xml:space="preserve"> up. By using complex joins and subqueries to answer realistic questions—like tracking ICU transfers or finding patients with multiple diagnoses—we were able to confirm that the database is structured correctly and can handle real analytical tasks</w:t>
       </w:r>
       <w:r>
         <w:rPr>
@@ -2609,10 +3015,10 @@
           <w:szCs w:val="40"/>
         </w:rPr>
       </w:pPr>
-      <w:bookmarkStart w:id="13" w:name="bookmark=id.h63iqm8ib24v" w:colFirst="0" w:colLast="0"/>
-      <w:bookmarkStart w:id="14" w:name="_heading=h.6pxa0sytg5s1" w:colFirst="0" w:colLast="0"/>
-      <w:bookmarkEnd w:id="13"/>
-      <w:bookmarkEnd w:id="14"/>
+      <w:bookmarkStart w:id="15" w:name="bookmark=id.h63iqm8ib24v" w:colFirst="0" w:colLast="0"/>
+      <w:bookmarkStart w:id="16" w:name="_heading=h.6pxa0sytg5s1" w:colFirst="0" w:colLast="0"/>
+      <w:bookmarkEnd w:id="15"/>
+      <w:bookmarkEnd w:id="16"/>
       <w:r>
         <w:br w:type="page"/>
       </w:r>
@@ -2625,7 +3031,8 @@
           <w:rFonts w:ascii="Arial" w:eastAsia="Arial" w:hAnsi="Arial" w:cs="Arial"/>
         </w:rPr>
       </w:pPr>
-      <w:bookmarkStart w:id="15" w:name="_Ref243405524"/>
+      <w:bookmarkStart w:id="17" w:name="_Ref243405524"/>
+      <w:bookmarkStart w:id="18" w:name="_Toc243412420"/>
       <w:r>
         <w:rPr>
           <w:rFonts w:ascii="Arial" w:eastAsia="Arial" w:hAnsi="Arial" w:cs="Arial"/>
@@ -2633,7 +3040,8 @@
         <w:lastRenderedPageBreak/>
         <w:t>Appendix A — Individual Query Screenshots</w:t>
       </w:r>
-      <w:bookmarkEnd w:id="15"/>
+      <w:bookmarkEnd w:id="17"/>
+      <w:bookmarkEnd w:id="18"/>
     </w:p>
     <w:p>
       <w:pPr>
@@ -2644,8 +3052,8 @@
           <w:iCs/>
         </w:rPr>
       </w:pPr>
-      <w:bookmarkStart w:id="16" w:name="bookmark=id.i2itvbtd1fgt" w:colFirst="0" w:colLast="0"/>
-      <w:bookmarkEnd w:id="16"/>
+      <w:bookmarkStart w:id="19" w:name="bookmark=id.i2itvbtd1fgt" w:colFirst="0" w:colLast="0"/>
+      <w:bookmarkEnd w:id="19"/>
       <w:r>
         <w:rPr>
           <w:rFonts w:ascii="Arial" w:eastAsia="Arial" w:hAnsi="Arial" w:cs="Arial"/>
@@ -2685,38 +3093,37 @@
           <w:sz w:val="22"/>
           <w:szCs w:val="22"/>
         </w:rPr>
-        <w:t>List the names and admission dates of all patients who were classified as high-priority</w:t>
-      </w:r>
-    </w:p>
-    <w:p>
-      <w:pPr>
-        <w:spacing w:after="0" w:line="276" w:lineRule="auto"/>
-        <w:jc w:val="both"/>
+        <w:t xml:space="preserve">List the names and admission dates of all patients who were classified as </w:t>
+      </w:r>
+      <w:proofErr w:type="gramStart"/>
+      <w:r>
         <w:rPr>
           <w:rFonts w:ascii="Arial" w:eastAsia="Arial" w:hAnsi="Arial" w:cs="Arial"/>
           <w:sz w:val="22"/>
           <w:szCs w:val="22"/>
         </w:rPr>
-      </w:pPr>
-      <w:r>
+        <w:t>high-priority</w:t>
+      </w:r>
+      <w:proofErr w:type="gramEnd"/>
+    </w:p>
+    <w:p>
+      <w:pPr>
+        <w:spacing w:after="0" w:line="276" w:lineRule="auto"/>
+        <w:jc w:val="both"/>
         <w:rPr>
           <w:rFonts w:ascii="Arial" w:eastAsia="Arial" w:hAnsi="Arial" w:cs="Arial"/>
           <w:sz w:val="22"/>
           <w:szCs w:val="22"/>
         </w:rPr>
-        <w:t>emergency patients during triage.</w:t>
-      </w:r>
-    </w:p>
-    <w:p>
-      <w:pPr>
-        <w:spacing w:after="0" w:line="276" w:lineRule="auto"/>
-        <w:jc w:val="both"/>
+      </w:pPr>
+      <w:r>
         <w:rPr>
           <w:rFonts w:ascii="Arial" w:eastAsia="Arial" w:hAnsi="Arial" w:cs="Arial"/>
           <w:sz w:val="22"/>
           <w:szCs w:val="22"/>
         </w:rPr>
-      </w:pPr>
+        <w:t>emergency patients during triage.</w:t>
+      </w:r>
     </w:p>
     <w:p>
       <w:pPr>
@@ -2724,13 +3131,15 @@
         <w:jc w:val="both"/>
         <w:rPr>
           <w:rFonts w:ascii="Arial" w:eastAsia="Arial" w:hAnsi="Arial" w:cs="Arial"/>
-          <w:b/>
-          <w:bCs/>
           <w:sz w:val="22"/>
           <w:szCs w:val="22"/>
         </w:rPr>
       </w:pPr>
-      <w:r>
+    </w:p>
+    <w:p>
+      <w:pPr>
+        <w:spacing w:after="0" w:line="276" w:lineRule="auto"/>
+        <w:jc w:val="both"/>
         <w:rPr>
           <w:rFonts w:ascii="Arial" w:eastAsia="Arial" w:hAnsi="Arial" w:cs="Arial"/>
           <w:b/>
@@ -2738,18 +3147,27 @@
           <w:sz w:val="22"/>
           <w:szCs w:val="22"/>
         </w:rPr>
-        <w:t>Query:</w:t>
-      </w:r>
-    </w:p>
-    <w:p>
-      <w:pPr>
-        <w:spacing w:after="0" w:line="276" w:lineRule="auto"/>
-        <w:jc w:val="both"/>
-        <w:rPr>
-          <w:rFonts w:ascii="Arial" w:eastAsia="Arial" w:hAnsi="Arial" w:cs="Arial"/>
+      </w:pPr>
+      <w:r>
+        <w:rPr>
+          <w:rFonts w:ascii="Arial" w:eastAsia="Arial" w:hAnsi="Arial" w:cs="Arial"/>
+          <w:b/>
+          <w:bCs/>
           <w:sz w:val="22"/>
           <w:szCs w:val="22"/>
         </w:rPr>
+        <w:t>Query:</w:t>
+      </w:r>
+    </w:p>
+    <w:p>
+      <w:pPr>
+        <w:spacing w:after="0" w:line="276" w:lineRule="auto"/>
+        <w:jc w:val="both"/>
+        <w:rPr>
+          <w:rFonts w:ascii="Arial" w:eastAsia="Arial" w:hAnsi="Arial" w:cs="Arial"/>
+          <w:sz w:val="22"/>
+          <w:szCs w:val="22"/>
+        </w:rPr>
       </w:pPr>
     </w:p>
     <w:p>
@@ -2758,9 +3176,9 @@
         <w:keepNext/>
         <w:jc w:val="both"/>
       </w:pPr>
-      <w:bookmarkStart w:id="17" w:name="_heading=h.h8wh1vyb550h" w:colFirst="0" w:colLast="0"/>
-      <w:bookmarkStart w:id="18" w:name="_Toc243410612"/>
-      <w:bookmarkEnd w:id="17"/>
+      <w:bookmarkStart w:id="20" w:name="_heading=h.h8wh1vyb550h" w:colFirst="0" w:colLast="0"/>
+      <w:bookmarkStart w:id="21" w:name="_Toc243410612"/>
+      <w:bookmarkEnd w:id="20"/>
       <w:r>
         <w:t xml:space="preserve">Figure </w:t>
       </w:r>
@@ -2775,7 +3193,7 @@
       <w:r>
         <w:t>: Query 1</w:t>
       </w:r>
-      <w:bookmarkEnd w:id="18"/>
+      <w:bookmarkEnd w:id="21"/>
     </w:p>
     <w:p>
       <w:pPr>
@@ -2854,9 +3272,9 @@
         <w:keepNext/>
         <w:jc w:val="both"/>
       </w:pPr>
-      <w:bookmarkStart w:id="19" w:name="_heading=h.p39znbhf4dy" w:colFirst="0" w:colLast="0"/>
-      <w:bookmarkStart w:id="20" w:name="_Toc243410613"/>
-      <w:bookmarkEnd w:id="19"/>
+      <w:bookmarkStart w:id="22" w:name="_heading=h.p39znbhf4dy" w:colFirst="0" w:colLast="0"/>
+      <w:bookmarkStart w:id="23" w:name="_Toc243410613"/>
+      <w:bookmarkEnd w:id="22"/>
       <w:r>
         <w:t xml:space="preserve">Figure </w:t>
       </w:r>
@@ -2871,7 +3289,7 @@
       <w:r>
         <w:t>: Output Query 1</w:t>
       </w:r>
-      <w:bookmarkEnd w:id="20"/>
+      <w:bookmarkEnd w:id="23"/>
     </w:p>
     <w:p>
       <w:pPr>
@@ -2957,14 +3375,32 @@
           <w:sz w:val="22"/>
           <w:szCs w:val="22"/>
         </w:rPr>
-        <w:t xml:space="preserve">The logic of this query is we first select the name and admission date time which we want to show. They are from 2 different tables, so we need to create patient p and admission a. We use from to indicate that we are selecting from that table and then join to find the patient that has </w:t>
-      </w:r>
+        <w:t xml:space="preserve">The logic of this query is we first select the name and admission date time which we want to show. They are from 2 different tables, so we need to create patient p and admission a. We use </w:t>
+      </w:r>
+      <w:proofErr w:type="gramStart"/>
       <w:r>
         <w:rPr>
           <w:rFonts w:ascii="Arial" w:eastAsia="Arial" w:hAnsi="Arial" w:cs="Arial"/>
           <w:sz w:val="22"/>
           <w:szCs w:val="22"/>
         </w:rPr>
+        <w:t>from</w:t>
+      </w:r>
+      <w:proofErr w:type="gramEnd"/>
+      <w:r>
+        <w:rPr>
+          <w:rFonts w:ascii="Arial" w:eastAsia="Arial" w:hAnsi="Arial" w:cs="Arial"/>
+          <w:sz w:val="22"/>
+          <w:szCs w:val="22"/>
+        </w:rPr>
+        <w:t xml:space="preserve"> to indicate that we are selecting from that table and then join to find the patient that has </w:t>
+      </w:r>
+      <w:r>
+        <w:rPr>
+          <w:rFonts w:ascii="Arial" w:eastAsia="Arial" w:hAnsi="Arial" w:cs="Arial"/>
+          <w:sz w:val="22"/>
+          <w:szCs w:val="22"/>
+        </w:rPr>
         <w:lastRenderedPageBreak/>
         <w:t xml:space="preserve">the same id as the admission that we are selecting. We then select these patients and use them to find the names. Then, same logic but for the triage assessment. We find the triage assessment that has the same id as the admission/patient and then, as a condition we are selecting only those that have their triage priority level to high-priority emergency. We are putting the triage in SELECT since we only want to show the name and admission date/time. </w:t>
       </w:r>
@@ -3100,7 +3536,7 @@
         <w:keepNext/>
         <w:jc w:val="both"/>
       </w:pPr>
-      <w:bookmarkStart w:id="21" w:name="_Toc243410614"/>
+      <w:bookmarkStart w:id="24" w:name="_Toc243410614"/>
       <w:r>
         <w:t xml:space="preserve">Figure </w:t>
       </w:r>
@@ -3115,7 +3551,7 @@
       <w:r>
         <w:t>: Query 2</w:t>
       </w:r>
-      <w:bookmarkEnd w:id="21"/>
+      <w:bookmarkEnd w:id="24"/>
     </w:p>
     <w:p>
       <w:pPr>
@@ -3228,9 +3664,9 @@
         <w:keepNext/>
         <w:jc w:val="both"/>
       </w:pPr>
-      <w:bookmarkStart w:id="22" w:name="_heading=h.tz8k55ealr4g" w:colFirst="0" w:colLast="0"/>
-      <w:bookmarkStart w:id="23" w:name="_Toc243410615"/>
-      <w:bookmarkEnd w:id="22"/>
+      <w:bookmarkStart w:id="25" w:name="_heading=h.tz8k55ealr4g" w:colFirst="0" w:colLast="0"/>
+      <w:bookmarkStart w:id="26" w:name="_Toc243410615"/>
+      <w:bookmarkEnd w:id="25"/>
       <w:r>
         <w:t xml:space="preserve">Figure </w:t>
       </w:r>
@@ -3245,7 +3681,7 @@
       <w:r>
         <w:t>: Output Query 2</w:t>
       </w:r>
-      <w:bookmarkEnd w:id="23"/>
+      <w:bookmarkEnd w:id="26"/>
     </w:p>
     <w:p>
       <w:pPr>
@@ -3342,7 +3778,61 @@
           <w:sz w:val="22"/>
           <w:szCs w:val="22"/>
         </w:rPr>
-        <w:t xml:space="preserve"> The logic of this query is that we first select the patient id and the name of a patient p. Then we want to calculate the total number of admissions. For that we use count on the admission id from the patient p and we display is as total_admissions. Then we use join to only show the admission where the patient id’s are the same. And finally, we use group to merge all the rows with the same patient id into one row that displays the total number of admissions. The having will then be the condition for the query. (more than 3 admissions)</w:t>
+        <w:t xml:space="preserve"> The logic of this query is that we first select the patient id and the name of a patient p. Then we want to calculate the total number of admissions. For that we use count on the admission id from the patient </w:t>
+      </w:r>
+      <w:proofErr w:type="gramStart"/>
+      <w:r>
+        <w:rPr>
+          <w:rFonts w:ascii="Arial" w:eastAsia="Arial" w:hAnsi="Arial" w:cs="Arial"/>
+          <w:sz w:val="22"/>
+          <w:szCs w:val="22"/>
+        </w:rPr>
+        <w:t>p</w:t>
+      </w:r>
+      <w:proofErr w:type="gramEnd"/>
+      <w:r>
+        <w:rPr>
+          <w:rFonts w:ascii="Arial" w:eastAsia="Arial" w:hAnsi="Arial" w:cs="Arial"/>
+          <w:sz w:val="22"/>
+          <w:szCs w:val="22"/>
+        </w:rPr>
+        <w:t xml:space="preserve"> and we display </w:t>
+      </w:r>
+      <w:proofErr w:type="gramStart"/>
+      <w:r>
+        <w:rPr>
+          <w:rFonts w:ascii="Arial" w:eastAsia="Arial" w:hAnsi="Arial" w:cs="Arial"/>
+          <w:sz w:val="22"/>
+          <w:szCs w:val="22"/>
+        </w:rPr>
+        <w:t>is</w:t>
+      </w:r>
+      <w:proofErr w:type="gramEnd"/>
+      <w:r>
+        <w:rPr>
+          <w:rFonts w:ascii="Arial" w:eastAsia="Arial" w:hAnsi="Arial" w:cs="Arial"/>
+          <w:sz w:val="22"/>
+          <w:szCs w:val="22"/>
+        </w:rPr>
+        <w:t xml:space="preserve"> as total_admissions. Then we use join to only show the admission where the patient </w:t>
+      </w:r>
+      <w:proofErr w:type="gramStart"/>
+      <w:r>
+        <w:rPr>
+          <w:rFonts w:ascii="Arial" w:eastAsia="Arial" w:hAnsi="Arial" w:cs="Arial"/>
+          <w:sz w:val="22"/>
+          <w:szCs w:val="22"/>
+        </w:rPr>
+        <w:t>id’s</w:t>
+      </w:r>
+      <w:proofErr w:type="gramEnd"/>
+      <w:r>
+        <w:rPr>
+          <w:rFonts w:ascii="Arial" w:eastAsia="Arial" w:hAnsi="Arial" w:cs="Arial"/>
+          <w:sz w:val="22"/>
+          <w:szCs w:val="22"/>
+        </w:rPr>
+        <w:t xml:space="preserve"> are the same. And finally, we use group to merge all the rows with the same patient id into one row that displays the total number of admissions. The having will then be the condition for the query. (more than 3 admissions)</w:t>
       </w:r>
     </w:p>
     <w:p>
@@ -3482,9 +3972,9 @@
         <w:keepNext/>
         <w:jc w:val="both"/>
       </w:pPr>
-      <w:bookmarkStart w:id="24" w:name="_heading=h.pxk0xnnlz73" w:colFirst="0" w:colLast="0"/>
-      <w:bookmarkStart w:id="25" w:name="_Toc243410616"/>
-      <w:bookmarkEnd w:id="24"/>
+      <w:bookmarkStart w:id="27" w:name="_heading=h.pxk0xnnlz73" w:colFirst="0" w:colLast="0"/>
+      <w:bookmarkStart w:id="28" w:name="_Toc243410616"/>
+      <w:bookmarkEnd w:id="27"/>
       <w:r>
         <w:t xml:space="preserve">Figure </w:t>
       </w:r>
@@ -3499,7 +3989,7 @@
       <w:r>
         <w:t>: Query 3</w:t>
       </w:r>
-      <w:bookmarkEnd w:id="25"/>
+      <w:bookmarkEnd w:id="28"/>
     </w:p>
     <w:p>
       <w:pPr>
@@ -3601,9 +4091,9 @@
         <w:keepNext/>
         <w:jc w:val="both"/>
       </w:pPr>
-      <w:bookmarkStart w:id="26" w:name="_heading=h.jg40369mhhqe" w:colFirst="0" w:colLast="0"/>
-      <w:bookmarkStart w:id="27" w:name="_Toc243410617"/>
-      <w:bookmarkEnd w:id="26"/>
+      <w:bookmarkStart w:id="29" w:name="_heading=h.jg40369mhhqe" w:colFirst="0" w:colLast="0"/>
+      <w:bookmarkStart w:id="30" w:name="_Toc243410617"/>
+      <w:bookmarkEnd w:id="29"/>
       <w:r>
         <w:t xml:space="preserve">Figure </w:t>
       </w:r>
@@ -3618,7 +4108,7 @@
       <w:r>
         <w:t>: Output Query 3</w:t>
       </w:r>
-      <w:bookmarkEnd w:id="27"/>
+      <w:bookmarkEnd w:id="30"/>
     </w:p>
     <w:p>
       <w:pPr>
@@ -3844,9 +4334,9 @@
         <w:keepNext/>
         <w:jc w:val="both"/>
       </w:pPr>
-      <w:bookmarkStart w:id="28" w:name="_heading=h.235migz7gqd7" w:colFirst="0" w:colLast="0"/>
-      <w:bookmarkStart w:id="29" w:name="_Toc243410618"/>
-      <w:bookmarkEnd w:id="28"/>
+      <w:bookmarkStart w:id="31" w:name="_heading=h.235migz7gqd7" w:colFirst="0" w:colLast="0"/>
+      <w:bookmarkStart w:id="32" w:name="_Toc243410618"/>
+      <w:bookmarkEnd w:id="31"/>
       <w:r>
         <w:t xml:space="preserve">Figure </w:t>
       </w:r>
@@ -3861,7 +4351,7 @@
       <w:r>
         <w:t>: Query 4</w:t>
       </w:r>
-      <w:bookmarkEnd w:id="29"/>
+      <w:bookmarkEnd w:id="32"/>
     </w:p>
     <w:p>
       <w:pPr>
@@ -3984,9 +4474,9 @@
         <w:keepNext/>
         <w:jc w:val="both"/>
       </w:pPr>
-      <w:bookmarkStart w:id="30" w:name="_heading=h.hs0bz4dgd7in" w:colFirst="0" w:colLast="0"/>
-      <w:bookmarkStart w:id="31" w:name="_Toc243410619"/>
-      <w:bookmarkEnd w:id="30"/>
+      <w:bookmarkStart w:id="33" w:name="_heading=h.hs0bz4dgd7in" w:colFirst="0" w:colLast="0"/>
+      <w:bookmarkStart w:id="34" w:name="_Toc243410619"/>
+      <w:bookmarkEnd w:id="33"/>
       <w:r>
         <w:t xml:space="preserve">Figure </w:t>
       </w:r>
@@ -4001,7 +4491,7 @@
       <w:r>
         <w:t>: Output Query 4</w:t>
       </w:r>
-      <w:bookmarkEnd w:id="31"/>
+      <w:bookmarkEnd w:id="34"/>
     </w:p>
     <w:p>
       <w:pPr>
@@ -4097,34 +4587,54 @@
           <w:i/>
           <w:iCs/>
         </w:rPr>
-        <w:t>: First, we need to select distinct since a single patient can have multiple admissions that satisfy the requirements, so to prevent that, we use the distinct keyword. After that, like in query 4, we need to find a link between every table. For patients and admissions, it’s the patient id. After that, for the diagnostic order, its the admissions id. Th</w:t>
-      </w:r>
-    </w:p>
-    <w:p>
-      <w:pPr>
-        <w:rPr>
-          <w:rFonts w:ascii="Arial" w:eastAsia="Arial" w:hAnsi="Arial" w:cs="Arial"/>
-          <w:b/>
-          <w:bCs/>
-        </w:rPr>
-      </w:pPr>
-      <w:r>
-        <w:rPr>
-          <w:rFonts w:ascii="Arial" w:eastAsia="Arial" w:hAnsi="Arial" w:cs="Arial"/>
-          <w:b/>
-          <w:bCs/>
-        </w:rPr>
-        <w:br w:type="page"/>
-      </w:r>
-    </w:p>
-    <w:p>
-      <w:pPr>
-        <w:jc w:val="both"/>
+        <w:t xml:space="preserve">: First, we need to select distinct since a single patient can have multiple admissions that satisfy the requirements, so to prevent that, we use the distinct keyword. After that, like in query 4, we need to find a link between every table. For patients and admissions, it’s the patient id. After that, for the diagnostic order, </w:t>
+      </w:r>
+      <w:proofErr w:type="spellStart"/>
+      <w:proofErr w:type="gramStart"/>
+      <w:r>
         <w:rPr>
           <w:rFonts w:ascii="Arial" w:eastAsia="Arial" w:hAnsi="Arial" w:cs="Arial"/>
           <w:i/>
           <w:iCs/>
         </w:rPr>
+        <w:t>its</w:t>
+      </w:r>
+      <w:proofErr w:type="spellEnd"/>
+      <w:proofErr w:type="gramEnd"/>
+      <w:r>
+        <w:rPr>
+          <w:rFonts w:ascii="Arial" w:eastAsia="Arial" w:hAnsi="Arial" w:cs="Arial"/>
+          <w:i/>
+          <w:iCs/>
+        </w:rPr>
+        <w:t xml:space="preserve"> the admissions id. Th</w:t>
+      </w:r>
+    </w:p>
+    <w:p>
+      <w:pPr>
+        <w:rPr>
+          <w:rFonts w:ascii="Arial" w:eastAsia="Arial" w:hAnsi="Arial" w:cs="Arial"/>
+          <w:b/>
+          <w:bCs/>
+        </w:rPr>
+      </w:pPr>
+      <w:r>
+        <w:rPr>
+          <w:rFonts w:ascii="Arial" w:eastAsia="Arial" w:hAnsi="Arial" w:cs="Arial"/>
+          <w:b/>
+          <w:bCs/>
+        </w:rPr>
+        <w:br w:type="page"/>
+      </w:r>
+    </w:p>
+    <w:p>
+      <w:pPr>
+        <w:jc w:val="both"/>
+        <w:rPr>
+          <w:rFonts w:ascii="Arial" w:eastAsia="Arial" w:hAnsi="Arial" w:cs="Arial"/>
+          <w:i/>
+          <w:iCs/>
+        </w:rPr>
       </w:pPr>
       <w:r>
         <w:rPr>
@@ -4161,7 +4671,21 @@
         <w:rPr>
           <w:rFonts w:ascii="Arial" w:eastAsia="Arial" w:hAnsi="Arial" w:cs="Arial"/>
         </w:rPr>
-        <w:t>Find all ICU or CCU unit stays that lasted more than seven days. Display the patient name, unit type, unit entry time, unit exit time, and calculated length of stay</w:t>
+        <w:t xml:space="preserve">Find all ICU or CCU unit stays that lasted more than seven days. Display the </w:t>
+      </w:r>
+      <w:proofErr w:type="gramStart"/>
+      <w:r>
+        <w:rPr>
+          <w:rFonts w:ascii="Arial" w:eastAsia="Arial" w:hAnsi="Arial" w:cs="Arial"/>
+        </w:rPr>
+        <w:t>patient</w:t>
+      </w:r>
+      <w:proofErr w:type="gramEnd"/>
+      <w:r>
+        <w:rPr>
+          <w:rFonts w:ascii="Arial" w:eastAsia="Arial" w:hAnsi="Arial" w:cs="Arial"/>
+        </w:rPr>
+        <w:t xml:space="preserve"> name, unit type, unit entry time, unit exit time, and calculated length of stay</w:t>
       </w:r>
     </w:p>
     <w:p>
@@ -4170,7 +4694,7 @@
         <w:keepNext/>
         <w:jc w:val="both"/>
       </w:pPr>
-      <w:bookmarkStart w:id="32" w:name="_Toc243410620"/>
+      <w:bookmarkStart w:id="35" w:name="_Toc243410620"/>
       <w:r>
         <w:t xml:space="preserve">Figure </w:t>
       </w:r>
@@ -4185,7 +4709,7 @@
       <w:r>
         <w:t>: Query 5</w:t>
       </w:r>
-      <w:bookmarkEnd w:id="32"/>
+      <w:bookmarkEnd w:id="35"/>
     </w:p>
     <w:p>
       <w:pPr>
@@ -4277,7 +4801,7 @@
         <w:pStyle w:val="Caption"/>
         <w:keepNext/>
       </w:pPr>
-      <w:bookmarkStart w:id="33" w:name="_Toc243410621"/>
+      <w:bookmarkStart w:id="36" w:name="_Toc243410621"/>
       <w:r>
         <w:t xml:space="preserve">Figure </w:t>
       </w:r>
@@ -4292,12 +4816,13 @@
       <w:r>
         <w:t>: Output Query 5</w:t>
       </w:r>
-      <w:bookmarkEnd w:id="33"/>
+      <w:bookmarkEnd w:id="36"/>
     </w:p>
     <w:p>
       <w:pPr>
         <w:pStyle w:val="Heading1"/>
       </w:pPr>
+      <w:bookmarkStart w:id="37" w:name="_Toc243412421"/>
       <w:r>
         <w:rPr>
           <w:noProof/>
@@ -4338,6 +4863,7 @@
           </wp:inline>
         </w:drawing>
       </w:r>
+      <w:bookmarkEnd w:id="37"/>
     </w:p>
     <w:p>
       <w:pPr>
@@ -4360,7 +4886,21 @@
         <w:rPr>
           <w:rFonts w:ascii="Arial" w:eastAsia="Arial" w:hAnsi="Arial" w:cs="Arial"/>
         </w:rPr>
-        <w:t>: Result: 0 rows. The query correctly joins icu_stay with admission and then patient, restricts to ICU/CCU units, excludes in-progress stays (exit_date_time IS NOT NULL), and only keeps stays longer than 7 days. In the current database no ICU or CCU stay exceeds 7 days.</w:t>
+        <w:t xml:space="preserve">: Result: 0 rows. The query correctly joins icu_stay with admission and then patient, restricts to ICU/CCU units, excludes in-progress stays (exit_date_time IS NOT NULL), and </w:t>
+      </w:r>
+      <w:proofErr w:type="gramStart"/>
+      <w:r>
+        <w:rPr>
+          <w:rFonts w:ascii="Arial" w:eastAsia="Arial" w:hAnsi="Arial" w:cs="Arial"/>
+        </w:rPr>
+        <w:t>only keeps</w:t>
+      </w:r>
+      <w:proofErr w:type="gramEnd"/>
+      <w:r>
+        <w:rPr>
+          <w:rFonts w:ascii="Arial" w:eastAsia="Arial" w:hAnsi="Arial" w:cs="Arial"/>
+        </w:rPr>
+        <w:t xml:space="preserve"> stays longer than 7 days. In the current database no ICU or CCU stay exceeds 7 days.</w:t>
       </w:r>
       <w:r>
         <w:br w:type="page"/>
@@ -4419,7 +4959,7 @@
         <w:keepNext/>
         <w:jc w:val="both"/>
       </w:pPr>
-      <w:bookmarkStart w:id="34" w:name="_Toc243410622"/>
+      <w:bookmarkStart w:id="38" w:name="_Toc243410622"/>
       <w:r>
         <w:t xml:space="preserve">Figure </w:t>
       </w:r>
@@ -4434,7 +4974,7 @@
       <w:r>
         <w:t>: Query 6</w:t>
       </w:r>
-      <w:bookmarkEnd w:id="34"/>
+      <w:bookmarkEnd w:id="38"/>
     </w:p>
     <w:p>
       <w:pPr>
@@ -4499,7 +5039,7 @@
         <w:keepNext/>
         <w:jc w:val="both"/>
       </w:pPr>
-      <w:bookmarkStart w:id="35" w:name="_Toc243410623"/>
+      <w:bookmarkStart w:id="39" w:name="_Toc243410623"/>
       <w:r>
         <w:t xml:space="preserve">Figure </w:t>
       </w:r>
@@ -4514,7 +5054,7 @@
       <w:r>
         <w:t>: Output Query 6</w:t>
       </w:r>
-      <w:bookmarkEnd w:id="35"/>
+      <w:bookmarkEnd w:id="39"/>
     </w:p>
     <w:p>
       <w:pPr>
@@ -4733,7 +5273,21 @@
         <w:rPr>
           <w:rFonts w:ascii="Arial" w:eastAsia="Arial" w:hAnsi="Arial" w:cs="Arial"/>
         </w:rPr>
-        <w:t>uses a LEFT JOIN from patient to admission so every patient is kept even with no admissions, then groups by patient and uses COUNT(admission_id) to total each one's admissions. Since COUNT ignores nulls, patients with no admissions correctly return zero.</w:t>
+        <w:t xml:space="preserve">uses a LEFT JOIN from patient to admission so every patient is kept even with no admissions, then groups by patient and uses </w:t>
+      </w:r>
+      <w:proofErr w:type="gramStart"/>
+      <w:r>
+        <w:rPr>
+          <w:rFonts w:ascii="Arial" w:eastAsia="Arial" w:hAnsi="Arial" w:cs="Arial"/>
+        </w:rPr>
+        <w:t>COUNT(</w:t>
+      </w:r>
+      <w:proofErr w:type="gramEnd"/>
+      <w:r>
+        <w:rPr>
+          <w:rFonts w:ascii="Arial" w:eastAsia="Arial" w:hAnsi="Arial" w:cs="Arial"/>
+        </w:rPr>
+        <w:t>admission_id) to total each one's admissions. Since COUNT ignores nulls, patients with no admissions correctly return zero.</w:t>
       </w:r>
     </w:p>
     <w:p>
@@ -4815,7 +5369,7 @@
         <w:keepNext/>
         <w:jc w:val="both"/>
       </w:pPr>
-      <w:bookmarkStart w:id="36" w:name="_Toc243410624"/>
+      <w:bookmarkStart w:id="40" w:name="_Toc243410624"/>
       <w:r>
         <w:t xml:space="preserve">Figure </w:t>
       </w:r>
@@ -4830,7 +5384,7 @@
       <w:r>
         <w:t>: Query 7</w:t>
       </w:r>
-      <w:bookmarkEnd w:id="36"/>
+      <w:bookmarkEnd w:id="40"/>
     </w:p>
     <w:p>
       <w:pPr>
@@ -4917,7 +5471,7 @@
         <w:keepNext/>
         <w:jc w:val="both"/>
       </w:pPr>
-      <w:bookmarkStart w:id="37" w:name="_Toc243410625"/>
+      <w:bookmarkStart w:id="41" w:name="_Toc243410625"/>
       <w:r>
         <w:t xml:space="preserve">Figure </w:t>
       </w:r>
@@ -4932,7 +5486,7 @@
       <w:r>
         <w:t>:Output Query 7</w:t>
       </w:r>
-      <w:bookmarkEnd w:id="37"/>
+      <w:bookmarkEnd w:id="41"/>
     </w:p>
     <w:p>
       <w:pPr>
@@ -5083,7 +5637,7 @@
         <w:keepNext/>
         <w:jc w:val="both"/>
       </w:pPr>
-      <w:bookmarkStart w:id="38" w:name="_Toc243410626"/>
+      <w:bookmarkStart w:id="42" w:name="_Toc243410626"/>
       <w:r>
         <w:t xml:space="preserve">Figure </w:t>
       </w:r>
@@ -5098,7 +5652,7 @@
       <w:r>
         <w:t>: Query 8</w:t>
       </w:r>
-      <w:bookmarkEnd w:id="38"/>
+      <w:bookmarkEnd w:id="42"/>
     </w:p>
     <w:p>
       <w:pPr>
@@ -5177,7 +5731,7 @@
         <w:keepNext/>
         <w:jc w:val="both"/>
       </w:pPr>
-      <w:bookmarkStart w:id="39" w:name="_Toc243410627"/>
+      <w:bookmarkStart w:id="43" w:name="_Toc243410627"/>
       <w:r>
         <w:t xml:space="preserve">Figure </w:t>
       </w:r>
@@ -5192,7 +5746,7 @@
       <w:r>
         <w:t>: Output Query 8</w:t>
       </w:r>
-      <w:bookmarkEnd w:id="39"/>
+      <w:bookmarkEnd w:id="43"/>
     </w:p>
     <w:p>
       <w:pPr>
@@ -5268,7 +5822,21 @@
         <w:rPr>
           <w:rFonts w:ascii="Arial" w:eastAsia="Arial" w:hAnsi="Arial" w:cs="Arial"/>
         </w:rPr>
-        <w:t>joins the diagnosis table to icd9_dict on the ICD-9 code to attach each diagnosis's official title, then keeps only primary diagnoses whose admission included at least one ICU or CCU stay (checked with an EXISTS subquery), and groups by code to count how often each was assigned. Ordering by that count descending and taking the first row returns the single most frequent primary diagnosis.</w:t>
+        <w:t xml:space="preserve">joins the diagnosis table to icd9_dict on the ICD-9 code to attach each diagnosis's official title, then keeps only primary diagnoses whose admission included at least one ICU or CCU stay (checked with an EXISTS subquery), and groups by code to count how often each was assigned. Ordering by that </w:t>
+      </w:r>
+      <w:proofErr w:type="gramStart"/>
+      <w:r>
+        <w:rPr>
+          <w:rFonts w:ascii="Arial" w:eastAsia="Arial" w:hAnsi="Arial" w:cs="Arial"/>
+        </w:rPr>
+        <w:t>count</w:t>
+      </w:r>
+      <w:proofErr w:type="gramEnd"/>
+      <w:r>
+        <w:rPr>
+          <w:rFonts w:ascii="Arial" w:eastAsia="Arial" w:hAnsi="Arial" w:cs="Arial"/>
+        </w:rPr>
+        <w:t xml:space="preserve"> descending and taking the first row returns the single most frequent primary diagnosis.</w:t>
       </w:r>
       <w:r>
         <w:br w:type="page"/>
@@ -5374,7 +5942,7 @@
         <w:keepNext/>
         <w:jc w:val="both"/>
       </w:pPr>
-      <w:bookmarkStart w:id="40" w:name="_Toc243410628"/>
+      <w:bookmarkStart w:id="44" w:name="_Toc243410628"/>
       <w:r>
         <w:t xml:space="preserve">Figure </w:t>
       </w:r>
@@ -5389,7 +5957,7 @@
       <w:r>
         <w:t>: Query 9</w:t>
       </w:r>
-      <w:bookmarkEnd w:id="40"/>
+      <w:bookmarkEnd w:id="44"/>
     </w:p>
     <w:p>
       <w:pPr>
@@ -5472,7 +6040,7 @@
         <w:keepNext/>
         <w:jc w:val="both"/>
       </w:pPr>
-      <w:bookmarkStart w:id="41" w:name="_Toc243410629"/>
+      <w:bookmarkStart w:id="45" w:name="_Toc243410629"/>
       <w:r>
         <w:t xml:space="preserve">Figure </w:t>
       </w:r>
@@ -5487,7 +6055,7 @@
       <w:r>
         <w:t>: Output Query 9</w:t>
       </w:r>
-      <w:bookmarkEnd w:id="41"/>
+      <w:bookmarkEnd w:id="45"/>
     </w:p>
     <w:p>
       <w:pPr>
@@ -5580,7 +6148,23 @@
           <w:rFonts w:ascii="Arial" w:eastAsia="Arial" w:hAnsi="Arial" w:cs="Arial"/>
           <w:color w:val="000000"/>
         </w:rPr>
-        <w:t> to calculate the average length of stay for each unit. Stays without an exit time are excluded because they are not completed.</w:t>
+        <w:t xml:space="preserve"> to calculate the average length of stay for each unit. Stays without </w:t>
+      </w:r>
+      <w:proofErr w:type="gramStart"/>
+      <w:r>
+        <w:rPr>
+          <w:rFonts w:ascii="Arial" w:eastAsia="Arial" w:hAnsi="Arial" w:cs="Arial"/>
+          <w:color w:val="000000"/>
+        </w:rPr>
+        <w:t>an exit</w:t>
+      </w:r>
+      <w:proofErr w:type="gramEnd"/>
+      <w:r>
+        <w:rPr>
+          <w:rFonts w:ascii="Arial" w:eastAsia="Arial" w:hAnsi="Arial" w:cs="Arial"/>
+          <w:color w:val="000000"/>
+        </w:rPr>
+        <w:t xml:space="preserve"> time are excluded because they are not completed.</w:t>
       </w:r>
     </w:p>
     <w:p>
@@ -5749,7 +6333,7 @@
         <w:keepNext/>
         <w:jc w:val="both"/>
       </w:pPr>
-      <w:bookmarkStart w:id="42" w:name="_Toc243410630"/>
+      <w:bookmarkStart w:id="46" w:name="_Toc243410630"/>
       <w:r>
         <w:t xml:space="preserve">Figure </w:t>
       </w:r>
@@ -5764,7 +6348,7 @@
       <w:r>
         <w:t>: Query 10</w:t>
       </w:r>
-      <w:bookmarkEnd w:id="42"/>
+      <w:bookmarkEnd w:id="46"/>
     </w:p>
     <w:p>
       <w:pPr>
@@ -5871,7 +6455,7 @@
         <w:keepNext/>
         <w:jc w:val="both"/>
       </w:pPr>
-      <w:bookmarkStart w:id="43" w:name="_Toc243410631"/>
+      <w:bookmarkStart w:id="47" w:name="_Toc243410631"/>
       <w:r>
         <w:t xml:space="preserve">Figure </w:t>
       </w:r>
@@ -5886,7 +6470,7 @@
       <w:r>
         <w:t>: Output Query 10</w:t>
       </w:r>
-      <w:bookmarkEnd w:id="43"/>
+      <w:bookmarkEnd w:id="47"/>
     </w:p>
     <w:p>
       <w:pPr>
@@ -6128,7 +6712,7 @@
         <w:keepNext/>
         <w:jc w:val="both"/>
       </w:pPr>
-      <w:bookmarkStart w:id="44" w:name="_Toc243410632"/>
+      <w:bookmarkStart w:id="48" w:name="_Toc243410632"/>
       <w:r>
         <w:t xml:space="preserve">Figure </w:t>
       </w:r>
@@ -6143,7 +6727,7 @@
       <w:r>
         <w:t>: Query 11</w:t>
       </w:r>
-      <w:bookmarkEnd w:id="44"/>
+      <w:bookmarkEnd w:id="48"/>
     </w:p>
     <w:p>
       <w:pPr>
@@ -6235,7 +6819,7 @@
           <w:iCs w:val="0"/>
         </w:rPr>
       </w:pPr>
-      <w:bookmarkStart w:id="45" w:name="_Toc243410633"/>
+      <w:bookmarkStart w:id="49" w:name="_Toc243410633"/>
       <w:r>
         <w:t xml:space="preserve">Figure </w:t>
       </w:r>
@@ -6250,7 +6834,7 @@
       <w:r>
         <w:t>: Output Query 11</w:t>
       </w:r>
-      <w:bookmarkEnd w:id="45"/>
+      <w:bookmarkEnd w:id="49"/>
     </w:p>
     <w:p>
       <w:pPr>
@@ -6474,7 +7058,7 @@
         <w:keepNext/>
         <w:jc w:val="both"/>
       </w:pPr>
-      <w:bookmarkStart w:id="46" w:name="_Toc243410634"/>
+      <w:bookmarkStart w:id="50" w:name="_Toc243410634"/>
       <w:r>
         <w:t xml:space="preserve">Figure </w:t>
       </w:r>
@@ -6489,7 +7073,7 @@
       <w:r>
         <w:t>: Query 12</w:t>
       </w:r>
-      <w:bookmarkEnd w:id="46"/>
+      <w:bookmarkEnd w:id="50"/>
     </w:p>
     <w:p>
       <w:pPr>
@@ -6572,7 +7156,7 @@
         <w:keepNext/>
         <w:jc w:val="both"/>
       </w:pPr>
-      <w:bookmarkStart w:id="47" w:name="_Toc243410635"/>
+      <w:bookmarkStart w:id="51" w:name="_Toc243410635"/>
       <w:r>
         <w:t xml:space="preserve">Figure </w:t>
       </w:r>
@@ -6587,7 +7171,7 @@
       <w:r>
         <w:t>: Output Query 12</w:t>
       </w:r>
-      <w:bookmarkEnd w:id="47"/>
+      <w:bookmarkEnd w:id="51"/>
     </w:p>
     <w:p>
       <w:pPr>
@@ -6770,7 +7354,7 @@
         <w:keepNext/>
         <w:jc w:val="both"/>
       </w:pPr>
-      <w:bookmarkStart w:id="48" w:name="_Toc243410636"/>
+      <w:bookmarkStart w:id="52" w:name="_Toc243410636"/>
       <w:r>
         <w:t xml:space="preserve">Figure </w:t>
       </w:r>
@@ -6785,7 +7369,7 @@
       <w:r>
         <w:t>: Query 13</w:t>
       </w:r>
-      <w:bookmarkEnd w:id="48"/>
+      <w:bookmarkEnd w:id="52"/>
     </w:p>
     <w:p>
       <w:pPr>
@@ -6876,7 +7460,7 @@
         <w:keepNext/>
         <w:jc w:val="both"/>
       </w:pPr>
-      <w:bookmarkStart w:id="49" w:name="_Toc243410637"/>
+      <w:bookmarkStart w:id="53" w:name="_Toc243410637"/>
       <w:r>
         <w:t xml:space="preserve">Figure </w:t>
       </w:r>
@@ -6891,7 +7475,7 @@
       <w:r>
         <w:t>: Output Query 13</w:t>
       </w:r>
-      <w:bookmarkEnd w:id="49"/>
+      <w:bookmarkEnd w:id="53"/>
     </w:p>
     <w:p>
       <w:pPr>
@@ -7070,7 +7654,7 @@
         <w:keepNext/>
         <w:jc w:val="both"/>
       </w:pPr>
-      <w:bookmarkStart w:id="50" w:name="_Toc243410638"/>
+      <w:bookmarkStart w:id="54" w:name="_Toc243410638"/>
       <w:r>
         <w:t xml:space="preserve">Figure </w:t>
       </w:r>
@@ -7085,7 +7669,7 @@
       <w:r>
         <w:t>: Query 14</w:t>
       </w:r>
-      <w:bookmarkEnd w:id="50"/>
+      <w:bookmarkEnd w:id="54"/>
     </w:p>
     <w:p>
       <w:pPr>
@@ -7188,7 +7772,7 @@
         <w:keepNext/>
         <w:jc w:val="both"/>
       </w:pPr>
-      <w:bookmarkStart w:id="51" w:name="_Toc243410639"/>
+      <w:bookmarkStart w:id="55" w:name="_Toc243410639"/>
       <w:r>
         <w:t xml:space="preserve">Figure </w:t>
       </w:r>
@@ -7203,7 +7787,7 @@
       <w:r>
         <w:t>: Output Query 14</w:t>
       </w:r>
-      <w:bookmarkEnd w:id="51"/>
+      <w:bookmarkEnd w:id="55"/>
     </w:p>
     <w:p>
       <w:pPr>
@@ -7352,8 +7936,16 @@
         <w:rPr>
           <w:rFonts w:ascii="Arial" w:eastAsia="Arial" w:hAnsi="Arial" w:cs="Arial"/>
         </w:rPr>
-        <w:t>patient’s first placement is not considered a transfer; each subsequent unit stay</w:t>
-      </w:r>
+        <w:t xml:space="preserve">patient’s first placement is not considered a transfer; each subsequent unit </w:t>
+      </w:r>
+      <w:proofErr w:type="gramStart"/>
+      <w:r>
+        <w:rPr>
+          <w:rFonts w:ascii="Arial" w:eastAsia="Arial" w:hAnsi="Arial" w:cs="Arial"/>
+        </w:rPr>
+        <w:t>stay</w:t>
+      </w:r>
+      <w:proofErr w:type="gramEnd"/>
     </w:p>
     <w:p>
       <w:pPr>
@@ -7404,7 +7996,7 @@
         <w:keepNext/>
         <w:jc w:val="both"/>
       </w:pPr>
-      <w:bookmarkStart w:id="52" w:name="_Toc243410640"/>
+      <w:bookmarkStart w:id="56" w:name="_Toc243410640"/>
       <w:r>
         <w:t xml:space="preserve">Figure </w:t>
       </w:r>
@@ -7419,7 +8011,7 @@
       <w:r>
         <w:t>: Query 15</w:t>
       </w:r>
-      <w:bookmarkEnd w:id="52"/>
+      <w:bookmarkEnd w:id="56"/>
     </w:p>
     <w:p>
       <w:pPr>
@@ -7511,7 +8103,7 @@
         <w:keepNext/>
         <w:jc w:val="both"/>
       </w:pPr>
-      <w:bookmarkStart w:id="53" w:name="_Toc243410641"/>
+      <w:bookmarkStart w:id="57" w:name="_Toc243410641"/>
       <w:r>
         <w:t xml:space="preserve">Figure </w:t>
       </w:r>
@@ -7526,7 +8118,7 @@
       <w:r>
         <w:t>: Output Query 15</w:t>
       </w:r>
-      <w:bookmarkEnd w:id="53"/>
+      <w:bookmarkEnd w:id="57"/>
     </w:p>
     <w:p>
       <w:pPr>
@@ -7706,7 +8298,7 @@
         <w:keepNext/>
         <w:jc w:val="both"/>
       </w:pPr>
-      <w:bookmarkStart w:id="54" w:name="_Toc243410642"/>
+      <w:bookmarkStart w:id="58" w:name="_Toc243410642"/>
       <w:r>
         <w:t xml:space="preserve">Figure </w:t>
       </w:r>
@@ -7721,7 +8313,7 @@
       <w:r>
         <w:t>: Query 16</w:t>
       </w:r>
-      <w:bookmarkEnd w:id="54"/>
+      <w:bookmarkEnd w:id="58"/>
     </w:p>
     <w:p>
       <w:pPr>
@@ -7824,7 +8416,7 @@
         <w:keepNext/>
         <w:jc w:val="both"/>
       </w:pPr>
-      <w:bookmarkStart w:id="55" w:name="_Toc243410643"/>
+      <w:bookmarkStart w:id="59" w:name="_Toc243410643"/>
       <w:r>
         <w:t xml:space="preserve">Figure </w:t>
       </w:r>
@@ -7839,7 +8431,7 @@
       <w:r>
         <w:t>: Output Query 16</w:t>
       </w:r>
-      <w:bookmarkEnd w:id="55"/>
+      <w:bookmarkEnd w:id="59"/>
     </w:p>
     <w:p>
       <w:pPr>
@@ -8000,8 +8592,18 @@
           <w:b/>
           <w:bCs/>
         </w:rPr>
-        <w:t>9 diagnosis</w:t>
-      </w:r>
+        <w:t xml:space="preserve">9 </w:t>
+      </w:r>
+      <w:proofErr w:type="gramStart"/>
+      <w:r>
+        <w:rPr>
+          <w:rFonts w:ascii="Arial" w:eastAsia="Arial" w:hAnsi="Arial" w:cs="Arial"/>
+          <w:b/>
+          <w:bCs/>
+        </w:rPr>
+        <w:t>diagnosis</w:t>
+      </w:r>
+      <w:proofErr w:type="gramEnd"/>
       <w:r>
         <w:rPr>
           <w:rFonts w:ascii="Arial" w:eastAsia="Arial" w:hAnsi="Arial" w:cs="Arial"/>
@@ -8054,7 +8656,7 @@
           <w:lang w:val="fr-FR"/>
         </w:rPr>
       </w:pPr>
-      <w:bookmarkStart w:id="56" w:name="_Toc243410644"/>
+      <w:bookmarkStart w:id="60" w:name="_Toc243410644"/>
       <w:r>
         <w:rPr>
           <w:lang w:val="fr-FR"/>
@@ -8089,18 +8691,19 @@
         </w:rPr>
         <w:t>: Query 17</w:t>
       </w:r>
-      <w:bookmarkEnd w:id="56"/>
-    </w:p>
-    <w:p>
-      <w:pPr>
-        <w:jc w:val="both"/>
-        <w:rPr>
-          <w:rFonts w:ascii="Arial" w:eastAsia="Arial" w:hAnsi="Arial" w:cs="Arial"/>
-        </w:rPr>
-      </w:pPr>
-      <w:r>
-        <w:rPr>
-          <w:rFonts w:ascii="Arial" w:eastAsia="Arial" w:hAnsi="Arial" w:cs="Arial"/>
+      <w:bookmarkEnd w:id="60"/>
+    </w:p>
+    <w:p>
+      <w:pPr>
+        <w:jc w:val="both"/>
+        <w:rPr>
+          <w:rFonts w:ascii="Arial" w:eastAsia="Arial" w:hAnsi="Arial" w:cs="Arial"/>
+        </w:rPr>
+      </w:pPr>
+      <w:r>
+        <w:rPr>
+          <w:rFonts w:ascii="Arial" w:eastAsia="Arial" w:hAnsi="Arial" w:cs="Arial"/>
+          <w:noProof/>
         </w:rPr>
         <w:drawing>
           <wp:inline distT="0" distB="0" distL="0" distR="0" wp14:anchorId="4CE7D9E7" wp14:editId="407F707A">
@@ -8168,7 +8771,7 @@
         <w:keepNext/>
         <w:jc w:val="both"/>
       </w:pPr>
-      <w:bookmarkStart w:id="57" w:name="_Toc243410645"/>
+      <w:bookmarkStart w:id="61" w:name="_Toc243410645"/>
       <w:r>
         <w:t xml:space="preserve">Figure </w:t>
       </w:r>
@@ -8183,7 +8786,7 @@
       <w:r>
         <w:t>: Output Query 17</w:t>
       </w:r>
-      <w:bookmarkEnd w:id="57"/>
+      <w:bookmarkEnd w:id="61"/>
     </w:p>
     <w:p>
       <w:pPr>
@@ -8345,7 +8948,7 @@
         <w:keepNext/>
         <w:jc w:val="both"/>
       </w:pPr>
-      <w:bookmarkStart w:id="58" w:name="_Toc243410646"/>
+      <w:bookmarkStart w:id="62" w:name="_Toc243410646"/>
       <w:r>
         <w:t xml:space="preserve">Figure </w:t>
       </w:r>
@@ -8360,7 +8963,7 @@
       <w:r>
         <w:t>: Query 18</w:t>
       </w:r>
-      <w:bookmarkEnd w:id="58"/>
+      <w:bookmarkEnd w:id="62"/>
     </w:p>
     <w:p>
       <w:pPr>
@@ -8439,7 +9042,7 @@
         <w:keepNext/>
         <w:jc w:val="both"/>
       </w:pPr>
-      <w:bookmarkStart w:id="59" w:name="_Toc243410647"/>
+      <w:bookmarkStart w:id="63" w:name="_Toc243410647"/>
       <w:r>
         <w:t xml:space="preserve">Figure </w:t>
       </w:r>
@@ -8454,7 +9057,7 @@
       <w:r>
         <w:t>: Output Query 18</w:t>
       </w:r>
-      <w:bookmarkEnd w:id="59"/>
+      <w:bookmarkEnd w:id="63"/>
     </w:p>
     <w:p>
       <w:pPr>
@@ -8637,7 +9240,7 @@
         <w:keepNext/>
         <w:jc w:val="both"/>
       </w:pPr>
-      <w:bookmarkStart w:id="60" w:name="_Toc243410648"/>
+      <w:bookmarkStart w:id="64" w:name="_Toc243410648"/>
       <w:r>
         <w:t xml:space="preserve">Figure </w:t>
       </w:r>
@@ -8652,7 +9255,7 @@
       <w:r>
         <w:t>: Query 19</w:t>
       </w:r>
-      <w:bookmarkEnd w:id="60"/>
+      <w:bookmarkEnd w:id="64"/>
     </w:p>
     <w:p>
       <w:pPr>
@@ -8759,7 +9362,7 @@
         <w:keepNext/>
         <w:jc w:val="both"/>
       </w:pPr>
-      <w:bookmarkStart w:id="61" w:name="_Toc243410649"/>
+      <w:bookmarkStart w:id="65" w:name="_Toc243410649"/>
       <w:r>
         <w:t xml:space="preserve">Figure </w:t>
       </w:r>
@@ -8774,7 +9377,7 @@
       <w:r>
         <w:t>: Output Query 19</w:t>
       </w:r>
-      <w:bookmarkEnd w:id="61"/>
+      <w:bookmarkEnd w:id="65"/>
     </w:p>
     <w:p>
       <w:pPr>
@@ -8846,7 +9449,21 @@
             <w:rPr>
               <w:rFonts w:ascii="Arial Unicode MS" w:eastAsia="Arial Unicode MS" w:hAnsi="Arial Unicode MS" w:cs="Arial Unicode MS"/>
             </w:rPr>
-            <w:t>Main logic:  Find admissions where the patient died during the stay, by filtering discharge_record.condition_at_discharge = 'Deceased'. Join admission → patient → discharge_record, then LEFT JOIN diagnosis (on primary_diagnosis = TRUE) to attach the primary ICD-9 code.</w:t>
+            <w:t>Main logic:  Find admissions where the patient died during the stay, by filtering discharge_</w:t>
+          </w:r>
+          <w:proofErr w:type="gramStart"/>
+          <w:r>
+            <w:rPr>
+              <w:rFonts w:ascii="Arial Unicode MS" w:eastAsia="Arial Unicode MS" w:hAnsi="Arial Unicode MS" w:cs="Arial Unicode MS"/>
+            </w:rPr>
+            <w:t>record.condition</w:t>
+          </w:r>
+          <w:proofErr w:type="gramEnd"/>
+          <w:r>
+            <w:rPr>
+              <w:rFonts w:ascii="Arial Unicode MS" w:eastAsia="Arial Unicode MS" w:hAnsi="Arial Unicode MS" w:cs="Arial Unicode MS"/>
+            </w:rPr>
+            <w:t>_at_discharge = 'Deceased'. Join admission → patient → discharge_record, then LEFT JOIN diagnosis (on primary_diagnosis = TRUE) to attach the primary ICD-9 code.</w:t>
           </w:r>
         </w:sdtContent>
       </w:sdt>
@@ -8971,7 +9588,7 @@
         <w:keepNext/>
         <w:jc w:val="both"/>
       </w:pPr>
-      <w:bookmarkStart w:id="62" w:name="_Toc243410650"/>
+      <w:bookmarkStart w:id="66" w:name="_Toc243410650"/>
       <w:r>
         <w:t xml:space="preserve">Figure </w:t>
       </w:r>
@@ -8986,7 +9603,7 @@
       <w:r>
         <w:t>: Query 20</w:t>
       </w:r>
-      <w:bookmarkEnd w:id="62"/>
+      <w:bookmarkEnd w:id="66"/>
     </w:p>
     <w:p>
       <w:pPr>
@@ -9093,7 +9710,7 @@
         <w:keepNext/>
         <w:jc w:val="both"/>
       </w:pPr>
-      <w:bookmarkStart w:id="63" w:name="_Toc243410651"/>
+      <w:bookmarkStart w:id="67" w:name="_Toc243410651"/>
       <w:r>
         <w:t xml:space="preserve">Figure </w:t>
       </w:r>
@@ -9108,7 +9725,7 @@
       <w:r>
         <w:t>: Output Query 20</w:t>
       </w:r>
-      <w:bookmarkEnd w:id="63"/>
+      <w:bookmarkEnd w:id="67"/>
     </w:p>
     <w:p>
       <w:pPr>
@@ -9271,10 +9888,12 @@
       <w:pPr>
         <w:pStyle w:val="Heading1"/>
       </w:pPr>
+      <w:bookmarkStart w:id="68" w:name="_Toc243412422"/>
       <w:r>
         <w:lastRenderedPageBreak/>
         <w:t>Table of Figures</w:t>
       </w:r>
+      <w:bookmarkEnd w:id="68"/>
     </w:p>
     <w:p>
       <w:pPr>
@@ -12524,26 +13143,6 @@
         </w:rPr>
         <w:fldChar w:fldCharType="end"/>
       </w:r>
-    </w:p>
-    <w:p>
-      <w:pPr>
-        <w:pBdr>
-          <w:top w:val="nil"/>
-          <w:left w:val="nil"/>
-          <w:bottom w:val="nil"/>
-          <w:right w:val="nil"/>
-          <w:between w:val="nil"/>
-        </w:pBdr>
-        <w:shd w:val="clear" w:color="auto" w:fill="FFFFFF"/>
-        <w:spacing w:after="0" w:line="240" w:lineRule="auto"/>
-        <w:jc w:val="both"/>
-        <w:rPr>
-          <w:rFonts w:ascii="Arial" w:eastAsia="Arial" w:hAnsi="Arial" w:cs="Arial"/>
-          <w:b/>
-          <w:bCs/>
-          <w:color w:val="000000"/>
-        </w:rPr>
-      </w:pPr>
     </w:p>
     <w:sectPr>
       <w:footerReference w:type="default" r:id="rId56"/>
@@ -13394,7 +13993,6 @@
   <w:style w:type="character" w:default="1" w:styleId="DefaultParagraphFont">
     <w:name w:val="Default Paragraph Font"/>
     <w:uiPriority w:val="1"/>
-    <w:semiHidden/>
     <w:unhideWhenUsed/>
   </w:style>
   <w:style w:type="table" w:default="1" w:styleId="TableNormal">

</xml_diff>